<commit_message>
docs: redesign cover and sub-cover pages without tables for clean academic layout
</commit_message>
<xml_diff>
--- a/report/BaoCao_Project13_LeThanhDuoc_SIC2026.docx
+++ b/report/BaoCao_Project13_LeThanhDuoc_SIC2026.docx
@@ -4,8 +4,145 @@
   <w:body>
     <w:p>
       <w:pPr>
-        <w:spacing w:before="300" w:after="40"/>
+        <w:spacing w:before="300" w:after="60"/>
         <w:jc w:val="center"/>
+      </w:pPr>
+      <w:r>
+        <w:rPr>
+          <w:rFonts w:ascii="Times New Roman" w:hAnsi="Times New Roman"/>
+          <w:b/>
+          <w:i w:val="0"/>
+          <w:color w:val="000000"/>
+          <w:sz w:val="25"/>
+        </w:rPr>
+        <w:t>CHƯƠNG TRÌNH ĐÀO TẠO CÔNG NGHỆ SAMSUNG INNOVATION CAMPUS (SIC 2026)</w:t>
+      </w:r>
+    </w:p>
+    <w:p>
+      <w:pPr>
+        <w:spacing w:before="0" w:after="200"/>
+        <w:jc w:val="center"/>
+      </w:pPr>
+      <w:r>
+        <w:rPr>
+          <w:rFonts w:ascii="Times New Roman" w:hAnsi="Times New Roman"/>
+          <w:b/>
+          <w:i w:val="0"/>
+          <w:color w:val="000000"/>
+          <w:sz w:val="23"/>
+        </w:rPr>
+        <w:t>HỌC PHẦN: TRÍ TUỆ NHÂN TẠO &amp; HỌC SÂU (AI &amp; DEEP LEARNING)</w:t>
+      </w:r>
+    </w:p>
+    <w:p>
+      <w:pPr>
+        <w:spacing w:before="0" w:after="0"/>
+        <w:jc w:val="center"/>
+      </w:pPr>
+      <w:r>
+        <w:rPr>
+          <w:rFonts w:ascii="Times New Roman" w:hAnsi="Times New Roman"/>
+          <w:b w:val="0"/>
+          <w:i w:val="0"/>
+          <w:color w:val="777777"/>
+          <w:sz w:val="22"/>
+        </w:rPr>
+        <w:t>————————— ⁂ —————————</w:t>
+      </w:r>
+    </w:p>
+    <w:p>
+      <w:pPr>
+        <w:spacing w:before="1240" w:after="200"/>
+        <w:jc w:val="center"/>
+      </w:pPr>
+      <w:r>
+        <w:rPr>
+          <w:rFonts w:ascii="Times New Roman" w:hAnsi="Times New Roman"/>
+          <w:b/>
+          <w:i w:val="0"/>
+          <w:color w:val="000000"/>
+          <w:sz w:val="31"/>
+        </w:rPr>
+        <w:t>BÁO CÁO TIỂU LUẬN CUỐI KHÓA</w:t>
+      </w:r>
+    </w:p>
+    <w:p>
+      <w:pPr>
+        <w:spacing w:before="0" w:after="160"/>
+        <w:jc w:val="center"/>
+      </w:pPr>
+      <w:r>
+        <w:rPr>
+          <w:rFonts w:ascii="Times New Roman" w:hAnsi="Times New Roman"/>
+          <w:b/>
+          <w:i w:val="0"/>
+          <w:color w:val="000000"/>
+          <w:sz w:val="26"/>
+        </w:rPr>
+        <w:t>ĐỀ TÀI:</w:t>
+      </w:r>
+    </w:p>
+    <w:p>
+      <w:pPr>
+        <w:spacing w:before="0" w:after="120"/>
+        <w:jc w:val="center"/>
+      </w:pPr>
+      <w:r>
+        <w:rPr>
+          <w:rFonts w:ascii="Times New Roman" w:hAnsi="Times New Roman"/>
+          <w:b/>
+          <w:i w:val="0"/>
+          <w:color w:val="000000"/>
+          <w:sz w:val="30"/>
+        </w:rPr>
+        <w:t>NGHIÊN CỨU VÀ XÂY DỰNG HỆ THỐNG PHÂN LOẠI CHẤT LƯỢNG NÔNG SẢN BẰNG THỊ GIÁC MÁY TÍNH VÀ HỌC SÂU</w:t>
+      </w:r>
+    </w:p>
+    <w:p>
+      <w:pPr>
+        <w:spacing w:before="0" w:after="320"/>
+        <w:jc w:val="center"/>
+      </w:pPr>
+      <w:r>
+        <w:rPr>
+          <w:rFonts w:ascii="Times New Roman" w:hAnsi="Times New Roman"/>
+          <w:b/>
+          <w:i w:val="0"/>
+          <w:color w:val="000000"/>
+          <w:sz w:val="27"/>
+        </w:rPr>
+        <w:t>(PROJECT 13: FRUIT VISUAL QUALITY CONTROL)</w:t>
+      </w:r>
+    </w:p>
+    <w:p>
+      <w:pPr>
+        <w:spacing w:before="0" w:after="0" w:line="300" w:lineRule="auto"/>
+        <w:jc w:val="center"/>
+      </w:pPr>
+      <w:r>
+        <w:rPr>
+          <w:rFonts w:ascii="Times New Roman" w:hAnsi="Times New Roman"/>
+          <w:b w:val="0"/>
+          <w:i/>
+          <w:color w:val="000000"/>
+          <w:sz w:val="23"/>
+        </w:rPr>
+        <w:t>Ứng dụng mạng nơ-ron tích chập (CNN), phương pháp học chuyển giao (Transfer Learning), trực quan hóa vùng đặc trưng khuyết tật với Grad-CAM và xây dựng ứng dụng thử nghiệm thời gian thực.</w:t>
+      </w:r>
+    </w:p>
+    <w:p>
+      <w:pPr>
+        <w:spacing w:before="1300" w:after="0"/>
+      </w:pPr>
+    </w:p>
+    <w:p>
+      <w:pPr>
+        <w:tabs>
+          <w:tab w:pos="4608" w:val="left"/>
+        </w:tabs>
+        <w:spacing w:before="0" w:after="90" w:line="300" w:lineRule="auto"/>
+        <w:ind w:left="1584"/>
+        <w:jc w:val="left"/>
       </w:pPr>
       <w:r>
         <w:rPr>
@@ -14,43 +151,26 @@
           <w:color w:val="000000"/>
           <w:sz w:val="24"/>
         </w:rPr>
-        <w:t>CHƯƠNG TRÌNH ĐÀO TẠO CÔNG NGHỆ SAMSUNG INNOVATION CAMPUS (SIC 2026)</w:t>
+        <w:t>Giảng viên hướng dẫn:</w:t>
+        <w:tab/>
+      </w:r>
+      <w:r>
+        <w:rPr>
+          <w:rFonts w:ascii="Times New Roman" w:hAnsi="Times New Roman"/>
+          <w:color w:val="000000"/>
+          <w:sz w:val="24"/>
+        </w:rPr>
+        <w:t>Thầy Trần Mạnh Tường</w:t>
       </w:r>
     </w:p>
     <w:p>
       <w:pPr>
-        <w:spacing w:before="40" w:after="400"/>
-        <w:jc w:val="center"/>
-      </w:pPr>
-      <w:r>
-        <w:rPr>
-          <w:rFonts w:ascii="Times New Roman" w:hAnsi="Times New Roman"/>
-          <w:b/>
-          <w:color w:val="000000"/>
-          <w:sz w:val="22"/>
-        </w:rPr>
-        <w:t>HỌC PHẦN: TRÍ TUỆ NHÂN TẠO &amp; HỌC SÂU (AI &amp; DEEP LEARNING)</w:t>
-      </w:r>
-    </w:p>
-    <w:p>
-      <w:pPr>
-        <w:spacing w:before="360" w:after="160"/>
-        <w:jc w:val="center"/>
-      </w:pPr>
-      <w:r>
-        <w:rPr>
-          <w:rFonts w:ascii="Times New Roman" w:hAnsi="Times New Roman"/>
-          <w:b/>
-          <w:color w:val="000000"/>
-          <w:sz w:val="30"/>
-        </w:rPr>
-        <w:t>BÁO CÁO TIỂU LUẬN CUỐI KHÓA</w:t>
-      </w:r>
-    </w:p>
-    <w:p>
-      <w:pPr>
-        <w:spacing w:before="40" w:after="120"/>
-        <w:jc w:val="center"/>
+        <w:tabs>
+          <w:tab w:pos="4608" w:val="left"/>
+        </w:tabs>
+        <w:spacing w:before="0" w:after="90" w:line="300" w:lineRule="auto"/>
+        <w:ind w:left="1584"/>
+        <w:jc w:val="left"/>
       </w:pPr>
       <w:r>
         <w:rPr>
@@ -59,442 +179,117 @@
           <w:color w:val="000000"/>
           <w:sz w:val="24"/>
         </w:rPr>
-        <w:t>ĐỀ TÀI:</w:t>
+        <w:t>Học viên thực hiện:</w:t>
+        <w:tab/>
+      </w:r>
+      <w:r>
+        <w:rPr>
+          <w:rFonts w:ascii="Times New Roman" w:hAnsi="Times New Roman"/>
+          <w:color w:val="000000"/>
+          <w:sz w:val="24"/>
+        </w:rPr>
+        <w:t>Lê Thành Được</w:t>
       </w:r>
     </w:p>
     <w:p>
       <w:pPr>
-        <w:spacing w:before="80" w:after="280"/>
+        <w:tabs>
+          <w:tab w:pos="4608" w:val="left"/>
+        </w:tabs>
+        <w:spacing w:before="0" w:after="90" w:line="300" w:lineRule="auto"/>
+        <w:ind w:left="1584"/>
+        <w:jc w:val="left"/>
+      </w:pPr>
+      <w:r>
+        <w:rPr>
+          <w:rFonts w:ascii="Times New Roman" w:hAnsi="Times New Roman"/>
+          <w:b/>
+          <w:color w:val="000000"/>
+          <w:sz w:val="24"/>
+        </w:rPr>
+        <w:t>Lớp học phần:</w:t>
+        <w:tab/>
+      </w:r>
+      <w:r>
+        <w:rPr>
+          <w:rFonts w:ascii="Times New Roman" w:hAnsi="Times New Roman"/>
+          <w:color w:val="000000"/>
+          <w:sz w:val="24"/>
+        </w:rPr>
+        <w:t>AI1</w:t>
+      </w:r>
+    </w:p>
+    <w:p>
+      <w:pPr>
+        <w:tabs>
+          <w:tab w:pos="4608" w:val="left"/>
+        </w:tabs>
+        <w:spacing w:before="0" w:after="90" w:line="300" w:lineRule="auto"/>
+        <w:ind w:left="1584"/>
+        <w:jc w:val="left"/>
+      </w:pPr>
+      <w:r>
+        <w:rPr>
+          <w:rFonts w:ascii="Times New Roman" w:hAnsi="Times New Roman"/>
+          <w:b/>
+          <w:color w:val="000000"/>
+          <w:sz w:val="24"/>
+        </w:rPr>
+        <w:t>Email liên hệ:</w:t>
+        <w:tab/>
+      </w:r>
+      <w:r>
+        <w:rPr>
+          <w:rFonts w:ascii="Times New Roman" w:hAnsi="Times New Roman"/>
+          <w:color w:val="000000"/>
+          <w:sz w:val="24"/>
+        </w:rPr>
+        <w:t>2000.leduoc@gmail.com</w:t>
+      </w:r>
+    </w:p>
+    <w:p>
+      <w:pPr>
+        <w:tabs>
+          <w:tab w:pos="4608" w:val="left"/>
+        </w:tabs>
+        <w:spacing w:before="0" w:after="90" w:line="300" w:lineRule="auto"/>
+        <w:ind w:left="1584"/>
+        <w:jc w:val="left"/>
+      </w:pPr>
+      <w:r>
+        <w:rPr>
+          <w:rFonts w:ascii="Times New Roman" w:hAnsi="Times New Roman"/>
+          <w:b/>
+          <w:color w:val="000000"/>
+          <w:sz w:val="24"/>
+        </w:rPr>
+        <w:t>Số điện thoại:</w:t>
+        <w:tab/>
+      </w:r>
+      <w:r>
+        <w:rPr>
+          <w:rFonts w:ascii="Times New Roman" w:hAnsi="Times New Roman"/>
+          <w:color w:val="000000"/>
+          <w:sz w:val="24"/>
+        </w:rPr>
+        <w:t>0379.885.508</w:t>
+      </w:r>
+    </w:p>
+    <w:p>
+      <w:pPr>
+        <w:spacing w:before="1400" w:after="0"/>
         <w:jc w:val="center"/>
       </w:pPr>
       <w:r>
         <w:rPr>
           <w:rFonts w:ascii="Times New Roman" w:hAnsi="Times New Roman"/>
           <w:b/>
+          <w:i w:val="0"/>
           <w:color w:val="000000"/>
-          <w:sz w:val="32"/>
+          <w:sz w:val="24"/>
         </w:rPr>
-        <w:t>NGHIÊN CỨU VÀ XÂY DỰNG HỆ THỐNG PHÂN LOẠI CHẤT LƯỢNG NÔNG SẢN BẰNG THỊ GIÁC MÁY TÍNH VÀ HỌC SÂU</w:t>
-        <w:br/>
-        <w:t>(PROJECT 13: FRUIT VISUAL QUALITY CONTROL)</w:t>
+        <w:t>TP. HỒ CHÍ MINH — THÁNG 10 NĂM 2026</w:t>
       </w:r>
-    </w:p>
-    <w:p>
-      <w:pPr>
-        <w:spacing w:line="312" w:lineRule="auto" w:after="500"/>
-        <w:jc w:val="both"/>
-      </w:pPr>
-      <w:r>
-        <w:rPr>
-          <w:rFonts w:ascii="Times New Roman" w:hAnsi="Times New Roman"/>
-          <w:i/>
-          <w:color w:val="000000"/>
-          <w:sz w:val="26"/>
-        </w:rPr>
-        <w:t>Ứng dụng mạng nơ-ron tích chập (CNN), phương pháp học chuyển giao (Transfer Learning), trực quan hóa vùng đặc trưng khuyết tật với Grad-CAM và xây dựng ứng dụng thử nghiệm thời gian thực.</w:t>
-      </w:r>
-    </w:p>
-    <w:tbl>
-      <w:tblPr>
-        <w:tblW w:type="auto" w:w="0"/>
-        <w:jc w:val="center"/>
-        <w:tblLook w:firstColumn="1" w:firstRow="1" w:lastColumn="0" w:lastRow="0" w:noHBand="0" w:noVBand="1" w:val="04A0"/>
-        <w:tblCellMar>
-          <w:top w:w="80" w:type="dxa"/>
-          <w:bottom w:w="80" w:type="dxa"/>
-          <w:left w:w="120" w:type="dxa"/>
-          <w:right w:w="120" w:type="dxa"/>
-        </w:tblCellMar>
-      </w:tblPr>
-      <w:tblGrid>
-        <w:gridCol w:w="4586"/>
-        <w:gridCol w:w="4586"/>
-      </w:tblGrid>
-      <w:tr>
-        <w:tc>
-          <w:tcPr>
-            <w:tcW w:type="dxa" w:w="3168"/>
-            <w:shd w:fill="F2F2F2"/>
-            <w:tcBorders>
-              <w:top w:val="single" w:sz="4" w:space="0" w:color="CCCCCC"/>
-              <w:bottom w:val="single" w:sz="4" w:space="0" w:color="CCCCCC"/>
-              <w:left w:val="single" w:sz="4" w:space="0" w:color="CCCCCC"/>
-              <w:right w:val="single" w:sz="4" w:space="0" w:color="CCCCCC"/>
-            </w:tcBorders>
-          </w:tcPr>
-          <w:p>
-            <w:pPr>
-              <w:spacing w:before="60" w:after="60"/>
-              <w:jc w:val="center"/>
-            </w:pPr>
-            <w:r>
-              <w:rPr>
-                <w:rFonts w:ascii="Times New Roman" w:hAnsi="Times New Roman"/>
-                <w:b/>
-                <w:color w:val="000000"/>
-                <w:sz w:val="22"/>
-              </w:rPr>
-              <w:t>Thông tin quản lý</w:t>
-            </w:r>
-          </w:p>
-        </w:tc>
-        <w:tc>
-          <w:tcPr>
-            <w:tcW w:type="dxa" w:w="6192"/>
-            <w:shd w:fill="F2F2F2"/>
-            <w:tcBorders>
-              <w:top w:val="single" w:sz="4" w:space="0" w:color="CCCCCC"/>
-              <w:bottom w:val="single" w:sz="4" w:space="0" w:color="CCCCCC"/>
-              <w:left w:val="single" w:sz="4" w:space="0" w:color="CCCCCC"/>
-              <w:right w:val="single" w:sz="4" w:space="0" w:color="CCCCCC"/>
-            </w:tcBorders>
-          </w:tcPr>
-          <w:p>
-            <w:pPr>
-              <w:spacing w:before="60" w:after="60"/>
-              <w:jc w:val="center"/>
-            </w:pPr>
-            <w:r>
-              <w:rPr>
-                <w:rFonts w:ascii="Times New Roman" w:hAnsi="Times New Roman"/>
-                <w:b/>
-                <w:color w:val="000000"/>
-                <w:sz w:val="22"/>
-              </w:rPr>
-              <w:t>Nội dung chi tiết</w:t>
-            </w:r>
-          </w:p>
-        </w:tc>
-      </w:tr>
-      <w:tr>
-        <w:tc>
-          <w:tcPr>
-            <w:tcW w:type="dxa" w:w="3168"/>
-            <w:shd w:fill="FFFFFF"/>
-            <w:tcBorders>
-              <w:top w:val="single" w:sz="4" w:space="0" w:color="CCCCCC"/>
-              <w:bottom w:val="single" w:sz="4" w:space="0" w:color="CCCCCC"/>
-              <w:left w:val="single" w:sz="4" w:space="0" w:color="CCCCCC"/>
-              <w:right w:val="single" w:sz="4" w:space="0" w:color="CCCCCC"/>
-            </w:tcBorders>
-          </w:tcPr>
-          <w:p>
-            <w:pPr>
-              <w:spacing w:before="40" w:after="40"/>
-              <w:jc w:val="left"/>
-            </w:pPr>
-            <w:r>
-              <w:rPr>
-                <w:rFonts w:ascii="Times New Roman" w:hAnsi="Times New Roman"/>
-                <w:color w:val="000000"/>
-                <w:sz w:val="22"/>
-              </w:rPr>
-              <w:t>Chương trình đào tạo:</w:t>
-            </w:r>
-          </w:p>
-        </w:tc>
-        <w:tc>
-          <w:tcPr>
-            <w:tcW w:type="dxa" w:w="6192"/>
-            <w:shd w:fill="FFFFFF"/>
-            <w:tcBorders>
-              <w:top w:val="single" w:sz="4" w:space="0" w:color="CCCCCC"/>
-              <w:bottom w:val="single" w:sz="4" w:space="0" w:color="CCCCCC"/>
-              <w:left w:val="single" w:sz="4" w:space="0" w:color="CCCCCC"/>
-              <w:right w:val="single" w:sz="4" w:space="0" w:color="CCCCCC"/>
-            </w:tcBorders>
-          </w:tcPr>
-          <w:p>
-            <w:pPr>
-              <w:spacing w:before="40" w:after="40"/>
-              <w:jc w:val="left"/>
-            </w:pPr>
-            <w:r>
-              <w:rPr>
-                <w:rFonts w:ascii="Times New Roman" w:hAnsi="Times New Roman"/>
-                <w:color w:val="000000"/>
-                <w:sz w:val="22"/>
-              </w:rPr>
-              <w:t>Samsung Innovation Campus 2026 (SIC 2026)</w:t>
-            </w:r>
-          </w:p>
-        </w:tc>
-      </w:tr>
-      <w:tr>
-        <w:tc>
-          <w:tcPr>
-            <w:tcW w:type="dxa" w:w="3168"/>
-            <w:shd w:fill="FFFFFF"/>
-            <w:tcBorders>
-              <w:top w:val="single" w:sz="4" w:space="0" w:color="CCCCCC"/>
-              <w:bottom w:val="single" w:sz="4" w:space="0" w:color="CCCCCC"/>
-              <w:left w:val="single" w:sz="4" w:space="0" w:color="CCCCCC"/>
-              <w:right w:val="single" w:sz="4" w:space="0" w:color="CCCCCC"/>
-            </w:tcBorders>
-          </w:tcPr>
-          <w:p>
-            <w:pPr>
-              <w:spacing w:before="40" w:after="40"/>
-              <w:jc w:val="left"/>
-            </w:pPr>
-            <w:r>
-              <w:rPr>
-                <w:rFonts w:ascii="Times New Roman" w:hAnsi="Times New Roman"/>
-                <w:color w:val="000000"/>
-                <w:sz w:val="22"/>
-              </w:rPr>
-              <w:t>Giảng viên hướng dẫn:</w:t>
-            </w:r>
-          </w:p>
-        </w:tc>
-        <w:tc>
-          <w:tcPr>
-            <w:tcW w:type="dxa" w:w="6192"/>
-            <w:shd w:fill="FFFFFF"/>
-            <w:tcBorders>
-              <w:top w:val="single" w:sz="4" w:space="0" w:color="CCCCCC"/>
-              <w:bottom w:val="single" w:sz="4" w:space="0" w:color="CCCCCC"/>
-              <w:left w:val="single" w:sz="4" w:space="0" w:color="CCCCCC"/>
-              <w:right w:val="single" w:sz="4" w:space="0" w:color="CCCCCC"/>
-            </w:tcBorders>
-          </w:tcPr>
-          <w:p>
-            <w:pPr>
-              <w:spacing w:before="40" w:after="40"/>
-              <w:jc w:val="center"/>
-            </w:pPr>
-            <w:r>
-              <w:rPr>
-                <w:rFonts w:ascii="Times New Roman" w:hAnsi="Times New Roman"/>
-                <w:color w:val="000000"/>
-                <w:sz w:val="22"/>
-              </w:rPr>
-              <w:t>Thầy Trần Mạnh Tường</w:t>
-            </w:r>
-          </w:p>
-        </w:tc>
-      </w:tr>
-      <w:tr>
-        <w:tc>
-          <w:tcPr>
-            <w:tcW w:type="dxa" w:w="3168"/>
-            <w:shd w:fill="FFFFFF"/>
-            <w:tcBorders>
-              <w:top w:val="single" w:sz="4" w:space="0" w:color="CCCCCC"/>
-              <w:bottom w:val="single" w:sz="4" w:space="0" w:color="CCCCCC"/>
-              <w:left w:val="single" w:sz="4" w:space="0" w:color="CCCCCC"/>
-              <w:right w:val="single" w:sz="4" w:space="0" w:color="CCCCCC"/>
-            </w:tcBorders>
-          </w:tcPr>
-          <w:p>
-            <w:pPr>
-              <w:spacing w:before="40" w:after="40"/>
-              <w:jc w:val="left"/>
-            </w:pPr>
-            <w:r>
-              <w:rPr>
-                <w:rFonts w:ascii="Times New Roman" w:hAnsi="Times New Roman"/>
-                <w:color w:val="000000"/>
-                <w:sz w:val="22"/>
-              </w:rPr>
-              <w:t>Học viên thực hiện:</w:t>
-            </w:r>
-          </w:p>
-        </w:tc>
-        <w:tc>
-          <w:tcPr>
-            <w:tcW w:type="dxa" w:w="6192"/>
-            <w:shd w:fill="FFFFFF"/>
-            <w:tcBorders>
-              <w:top w:val="single" w:sz="4" w:space="0" w:color="CCCCCC"/>
-              <w:bottom w:val="single" w:sz="4" w:space="0" w:color="CCCCCC"/>
-              <w:left w:val="single" w:sz="4" w:space="0" w:color="CCCCCC"/>
-              <w:right w:val="single" w:sz="4" w:space="0" w:color="CCCCCC"/>
-            </w:tcBorders>
-          </w:tcPr>
-          <w:p>
-            <w:pPr>
-              <w:spacing w:before="40" w:after="40"/>
-              <w:jc w:val="center"/>
-            </w:pPr>
-            <w:r>
-              <w:rPr>
-                <w:rFonts w:ascii="Times New Roman" w:hAnsi="Times New Roman"/>
-                <w:color w:val="000000"/>
-                <w:sz w:val="22"/>
-              </w:rPr>
-              <w:t>Lê Thành Được</w:t>
-            </w:r>
-          </w:p>
-        </w:tc>
-      </w:tr>
-      <w:tr>
-        <w:tc>
-          <w:tcPr>
-            <w:tcW w:type="dxa" w:w="3168"/>
-            <w:shd w:fill="FFFFFF"/>
-            <w:tcBorders>
-              <w:top w:val="single" w:sz="4" w:space="0" w:color="CCCCCC"/>
-              <w:bottom w:val="single" w:sz="4" w:space="0" w:color="CCCCCC"/>
-              <w:left w:val="single" w:sz="4" w:space="0" w:color="CCCCCC"/>
-              <w:right w:val="single" w:sz="4" w:space="0" w:color="CCCCCC"/>
-            </w:tcBorders>
-          </w:tcPr>
-          <w:p>
-            <w:pPr>
-              <w:spacing w:before="40" w:after="40"/>
-              <w:jc w:val="left"/>
-            </w:pPr>
-            <w:r>
-              <w:rPr>
-                <w:rFonts w:ascii="Times New Roman" w:hAnsi="Times New Roman"/>
-                <w:color w:val="000000"/>
-                <w:sz w:val="22"/>
-              </w:rPr>
-              <w:t>Lớp học phần:</w:t>
-            </w:r>
-          </w:p>
-        </w:tc>
-        <w:tc>
-          <w:tcPr>
-            <w:tcW w:type="dxa" w:w="6192"/>
-            <w:shd w:fill="FFFFFF"/>
-            <w:tcBorders>
-              <w:top w:val="single" w:sz="4" w:space="0" w:color="CCCCCC"/>
-              <w:bottom w:val="single" w:sz="4" w:space="0" w:color="CCCCCC"/>
-              <w:left w:val="single" w:sz="4" w:space="0" w:color="CCCCCC"/>
-              <w:right w:val="single" w:sz="4" w:space="0" w:color="CCCCCC"/>
-            </w:tcBorders>
-          </w:tcPr>
-          <w:p>
-            <w:pPr>
-              <w:spacing w:before="40" w:after="40"/>
-              <w:jc w:val="center"/>
-            </w:pPr>
-            <w:r>
-              <w:rPr>
-                <w:rFonts w:ascii="Times New Roman" w:hAnsi="Times New Roman"/>
-                <w:color w:val="000000"/>
-                <w:sz w:val="22"/>
-              </w:rPr>
-              <w:t>AI1</w:t>
-            </w:r>
-          </w:p>
-        </w:tc>
-      </w:tr>
-      <w:tr>
-        <w:tc>
-          <w:tcPr>
-            <w:tcW w:type="dxa" w:w="3168"/>
-            <w:shd w:fill="FFFFFF"/>
-            <w:tcBorders>
-              <w:top w:val="single" w:sz="4" w:space="0" w:color="CCCCCC"/>
-              <w:bottom w:val="single" w:sz="4" w:space="0" w:color="CCCCCC"/>
-              <w:left w:val="single" w:sz="4" w:space="0" w:color="CCCCCC"/>
-              <w:right w:val="single" w:sz="4" w:space="0" w:color="CCCCCC"/>
-            </w:tcBorders>
-          </w:tcPr>
-          <w:p>
-            <w:pPr>
-              <w:spacing w:before="40" w:after="40"/>
-              <w:jc w:val="left"/>
-            </w:pPr>
-            <w:r>
-              <w:rPr>
-                <w:rFonts w:ascii="Times New Roman" w:hAnsi="Times New Roman"/>
-                <w:color w:val="000000"/>
-                <w:sz w:val="22"/>
-              </w:rPr>
-              <w:t>Thông tin liên hệ:</w:t>
-            </w:r>
-          </w:p>
-        </w:tc>
-        <w:tc>
-          <w:tcPr>
-            <w:tcW w:type="dxa" w:w="6192"/>
-            <w:shd w:fill="FFFFFF"/>
-            <w:tcBorders>
-              <w:top w:val="single" w:sz="4" w:space="0" w:color="CCCCCC"/>
-              <w:bottom w:val="single" w:sz="4" w:space="0" w:color="CCCCCC"/>
-              <w:left w:val="single" w:sz="4" w:space="0" w:color="CCCCCC"/>
-              <w:right w:val="single" w:sz="4" w:space="0" w:color="CCCCCC"/>
-            </w:tcBorders>
-          </w:tcPr>
-          <w:p>
-            <w:pPr>
-              <w:spacing w:before="40" w:after="40"/>
-              <w:jc w:val="left"/>
-            </w:pPr>
-            <w:r>
-              <w:rPr>
-                <w:rFonts w:ascii="Times New Roman" w:hAnsi="Times New Roman"/>
-                <w:color w:val="000000"/>
-                <w:sz w:val="22"/>
-              </w:rPr>
-              <w:t>Email: 2000.leduoc@gmail.com | SĐT: 0379885508</w:t>
-            </w:r>
-          </w:p>
-        </w:tc>
-      </w:tr>
-      <w:tr>
-        <w:tc>
-          <w:tcPr>
-            <w:tcW w:type="dxa" w:w="3168"/>
-            <w:shd w:fill="FFFFFF"/>
-            <w:tcBorders>
-              <w:top w:val="single" w:sz="4" w:space="0" w:color="CCCCCC"/>
-              <w:bottom w:val="single" w:sz="4" w:space="0" w:color="CCCCCC"/>
-              <w:left w:val="single" w:sz="4" w:space="0" w:color="CCCCCC"/>
-              <w:right w:val="single" w:sz="4" w:space="0" w:color="CCCCCC"/>
-            </w:tcBorders>
-          </w:tcPr>
-          <w:p>
-            <w:pPr>
-              <w:spacing w:before="40" w:after="40"/>
-              <w:jc w:val="left"/>
-            </w:pPr>
-            <w:r>
-              <w:rPr>
-                <w:rFonts w:ascii="Times New Roman" w:hAnsi="Times New Roman"/>
-                <w:color w:val="000000"/>
-                <w:sz w:val="22"/>
-              </w:rPr>
-              <w:t>Thời gian hoàn thành:</w:t>
-            </w:r>
-          </w:p>
-        </w:tc>
-        <w:tc>
-          <w:tcPr>
-            <w:tcW w:type="dxa" w:w="6192"/>
-            <w:shd w:fill="FFFFFF"/>
-            <w:tcBorders>
-              <w:top w:val="single" w:sz="4" w:space="0" w:color="CCCCCC"/>
-              <w:bottom w:val="single" w:sz="4" w:space="0" w:color="CCCCCC"/>
-              <w:left w:val="single" w:sz="4" w:space="0" w:color="CCCCCC"/>
-              <w:right w:val="single" w:sz="4" w:space="0" w:color="CCCCCC"/>
-            </w:tcBorders>
-          </w:tcPr>
-          <w:p>
-            <w:pPr>
-              <w:spacing w:before="40" w:after="40"/>
-              <w:jc w:val="center"/>
-            </w:pPr>
-            <w:r>
-              <w:rPr>
-                <w:rFonts w:ascii="Times New Roman" w:hAnsi="Times New Roman"/>
-                <w:color w:val="000000"/>
-                <w:sz w:val="22"/>
-              </w:rPr>
-              <w:t>Tháng 10 năm 2026</w:t>
-            </w:r>
-          </w:p>
-        </w:tc>
-      </w:tr>
-    </w:tbl>
-    <w:p>
-      <w:pPr>
-        <w:spacing w:after="80"/>
-      </w:pPr>
     </w:p>
     <w:p>
       <w:pPr>
@@ -514,8 +309,74 @@
     </w:p>
     <w:p>
       <w:pPr>
-        <w:spacing w:before="200" w:after="40"/>
+        <w:spacing w:before="100" w:after="40"/>
         <w:jc w:val="center"/>
+      </w:pPr>
+      <w:r>
+        <w:rPr>
+          <w:rFonts w:ascii="Times New Roman" w:hAnsi="Times New Roman"/>
+          <w:b/>
+          <w:i w:val="0"/>
+          <w:color w:val="000000"/>
+          <w:sz w:val="24"/>
+        </w:rPr>
+        <w:t>CHƯƠNG TRÌNH ĐÀO TẠO CÔNG NGHỆ SAMSUNG INNOVATION CAMPUS (SIC 2026)</w:t>
+      </w:r>
+    </w:p>
+    <w:p>
+      <w:pPr>
+        <w:spacing w:before="0" w:after="280"/>
+        <w:jc w:val="center"/>
+      </w:pPr>
+      <w:r>
+        <w:rPr>
+          <w:rFonts w:ascii="Times New Roman" w:hAnsi="Times New Roman"/>
+          <w:b/>
+          <w:i w:val="0"/>
+          <w:color w:val="000000"/>
+          <w:sz w:val="22"/>
+        </w:rPr>
+        <w:t>HỌC PHẦN: TRÍ TUỆ NHÂN TẠO &amp; HỌC SÂU (AI &amp; DEEP LEARNING)</w:t>
+      </w:r>
+    </w:p>
+    <w:p>
+      <w:pPr>
+        <w:spacing w:before="0" w:after="120"/>
+        <w:jc w:val="center"/>
+      </w:pPr>
+      <w:r>
+        <w:rPr>
+          <w:rFonts w:ascii="Times New Roman" w:hAnsi="Times New Roman"/>
+          <w:b/>
+          <w:i w:val="0"/>
+          <w:color w:val="000000"/>
+          <w:sz w:val="27"/>
+        </w:rPr>
+        <w:t>TRANG PHỤ BÌA — HỒ SƠ ĐỒ ÁN TIỂU LUẬN</w:t>
+      </w:r>
+    </w:p>
+    <w:p>
+      <w:pPr>
+        <w:spacing w:before="0" w:after="400"/>
+        <w:jc w:val="center"/>
+      </w:pPr>
+      <w:r>
+        <w:rPr>
+          <w:rFonts w:ascii="Times New Roman" w:hAnsi="Times New Roman"/>
+          <w:b/>
+          <w:i w:val="0"/>
+          <w:color w:val="000000"/>
+          <w:sz w:val="28"/>
+        </w:rPr>
+        <w:t>HỆ THỐNG PHÂN LOẠI CHẤT LƯỢNG NÔNG SẢN BẰNG THỊ GIÁC MÁY TÍNH</w:t>
+        <w:br/>
+        <w:t>(PROJECT 13: FRUIT VISUAL QUALITY CONTROL)</w:t>
+      </w:r>
+    </w:p>
+    <w:p>
+      <w:pPr>
+        <w:spacing w:before="280" w:after="100"/>
+        <w:jc w:val="left"/>
       </w:pPr>
       <w:r>
         <w:rPr>
@@ -524,44 +385,172 @@
           <w:color w:val="000000"/>
           <w:sz w:val="24"/>
         </w:rPr>
-        <w:t>CHƯƠNG TRÌNH ĐÀO TẠO CÔNG NGHỆ SAMSUNG INNOVATION CAMPUS (SIC 2026)</w:t>
+        <w:t>I. THÔNG TIN HỌC THUẬT VÀ NHÂN SỰ</w:t>
       </w:r>
     </w:p>
     <w:p>
       <w:pPr>
-        <w:spacing w:before="80" w:after="240"/>
-        <w:jc w:val="center"/>
+        <w:spacing w:before="0" w:after="90" w:line="300" w:lineRule="auto"/>
+        <w:ind w:left="288"/>
+        <w:jc w:val="both"/>
       </w:pPr>
+      <w:r>
+        <w:rPr>
+          <w:rFonts w:ascii="Times New Roman" w:hAnsi="Times New Roman"/>
+          <w:color w:val="444444"/>
+          <w:sz w:val="18"/>
+        </w:rPr>
+        <w:t xml:space="preserve">▪  </w:t>
+      </w:r>
       <w:r>
         <w:rPr>
           <w:rFonts w:ascii="Times New Roman" w:hAnsi="Times New Roman"/>
           <w:b/>
           <w:color w:val="000000"/>
-          <w:sz w:val="26"/>
+          <w:sz w:val="22"/>
         </w:rPr>
-        <w:t>TRANG PHỤ BÌA — HỒ SƠ ĐỒ ÁN TIỂU LUẬN</w:t>
+        <w:t xml:space="preserve">Đơn vị đào tạo: </w:t>
+      </w:r>
+      <w:r>
+        <w:rPr>
+          <w:rFonts w:ascii="Times New Roman" w:hAnsi="Times New Roman"/>
+          <w:color w:val="111111"/>
+          <w:sz w:val="22"/>
+        </w:rPr>
+        <w:t>Chương trình Samsung Innovation Campus 2026 (SIC 2026)</w:t>
       </w:r>
     </w:p>
     <w:p>
       <w:pPr>
-        <w:spacing w:before="120" w:after="280"/>
-        <w:jc w:val="center"/>
+        <w:spacing w:before="0" w:after="90" w:line="300" w:lineRule="auto"/>
+        <w:ind w:left="288"/>
+        <w:jc w:val="both"/>
       </w:pPr>
+      <w:r>
+        <w:rPr>
+          <w:rFonts w:ascii="Times New Roman" w:hAnsi="Times New Roman"/>
+          <w:color w:val="444444"/>
+          <w:sz w:val="18"/>
+        </w:rPr>
+        <w:t xml:space="preserve">▪  </w:t>
+      </w:r>
       <w:r>
         <w:rPr>
           <w:rFonts w:ascii="Times New Roman" w:hAnsi="Times New Roman"/>
           <w:b/>
           <w:color w:val="000000"/>
-          <w:sz w:val="30"/>
+          <w:sz w:val="22"/>
         </w:rPr>
-        <w:t>HỆ THỐNG PHÂN LOẠI CHẤT LƯỢNG NÔNG SẢN BẰNG THỊ GIÁC MÁY TÍNH</w:t>
-        <w:br/>
-        <w:t>(PROJECT 13: FRUIT VISUAL QUALITY CONTROL)</w:t>
+        <w:t xml:space="preserve">Tên học phần: </w:t>
+      </w:r>
+      <w:r>
+        <w:rPr>
+          <w:rFonts w:ascii="Times New Roman" w:hAnsi="Times New Roman"/>
+          <w:color w:val="111111"/>
+          <w:sz w:val="22"/>
+        </w:rPr>
+        <w:t>Trí Tuệ Nhân Tạo &amp; Học Sâu (AI &amp; Deep Learning)</w:t>
       </w:r>
     </w:p>
     <w:p>
       <w:pPr>
-        <w:spacing w:before="120" w:after="60"/>
+        <w:spacing w:before="0" w:after="90" w:line="300" w:lineRule="auto"/>
+        <w:ind w:left="288"/>
+        <w:jc w:val="both"/>
+      </w:pPr>
+      <w:r>
+        <w:rPr>
+          <w:rFonts w:ascii="Times New Roman" w:hAnsi="Times New Roman"/>
+          <w:color w:val="444444"/>
+          <w:sz w:val="18"/>
+        </w:rPr>
+        <w:t xml:space="preserve">▪  </w:t>
+      </w:r>
+      <w:r>
+        <w:rPr>
+          <w:rFonts w:ascii="Times New Roman" w:hAnsi="Times New Roman"/>
+          <w:b/>
+          <w:color w:val="000000"/>
+          <w:sz w:val="22"/>
+        </w:rPr>
+        <w:t xml:space="preserve">Giảng viên hướng dẫn: </w:t>
+      </w:r>
+      <w:r>
+        <w:rPr>
+          <w:rFonts w:ascii="Times New Roman" w:hAnsi="Times New Roman"/>
+          <w:color w:val="111111"/>
+          <w:sz w:val="22"/>
+        </w:rPr>
+        <w:t>Thầy Trần Mạnh Tường</w:t>
+      </w:r>
+    </w:p>
+    <w:p>
+      <w:pPr>
+        <w:spacing w:before="0" w:after="90" w:line="300" w:lineRule="auto"/>
+        <w:ind w:left="288"/>
+        <w:jc w:val="both"/>
+      </w:pPr>
+      <w:r>
+        <w:rPr>
+          <w:rFonts w:ascii="Times New Roman" w:hAnsi="Times New Roman"/>
+          <w:color w:val="444444"/>
+          <w:sz w:val="18"/>
+        </w:rPr>
+        <w:t xml:space="preserve">▪  </w:t>
+      </w:r>
+      <w:r>
+        <w:rPr>
+          <w:rFonts w:ascii="Times New Roman" w:hAnsi="Times New Roman"/>
+          <w:b/>
+          <w:color w:val="000000"/>
+          <w:sz w:val="22"/>
+        </w:rPr>
+        <w:t xml:space="preserve">Học viên thực hiện: </w:t>
+      </w:r>
+      <w:r>
+        <w:rPr>
+          <w:rFonts w:ascii="Times New Roman" w:hAnsi="Times New Roman"/>
+          <w:color w:val="111111"/>
+          <w:sz w:val="22"/>
+        </w:rPr>
+        <w:t>Lê Thành Được (Lớp học phần: AI1)</w:t>
+      </w:r>
+    </w:p>
+    <w:p>
+      <w:pPr>
+        <w:spacing w:before="0" w:after="90" w:line="300" w:lineRule="auto"/>
+        <w:ind w:left="288"/>
+        <w:jc w:val="both"/>
+      </w:pPr>
+      <w:r>
+        <w:rPr>
+          <w:rFonts w:ascii="Times New Roman" w:hAnsi="Times New Roman"/>
+          <w:color w:val="444444"/>
+          <w:sz w:val="18"/>
+        </w:rPr>
+        <w:t xml:space="preserve">▪  </w:t>
+      </w:r>
+      <w:r>
+        <w:rPr>
+          <w:rFonts w:ascii="Times New Roman" w:hAnsi="Times New Roman"/>
+          <w:b/>
+          <w:color w:val="000000"/>
+          <w:sz w:val="22"/>
+        </w:rPr>
+        <w:t xml:space="preserve">Thông tin liên hệ: </w:t>
+      </w:r>
+      <w:r>
+        <w:rPr>
+          <w:rFonts w:ascii="Times New Roman" w:hAnsi="Times New Roman"/>
+          <w:color w:val="111111"/>
+          <w:sz w:val="22"/>
+        </w:rPr>
+        <w:t>Email: 2000.leduoc@gmail.com | SĐT: 0379.885.508</w:t>
+      </w:r>
+    </w:p>
+    <w:p>
+      <w:pPr>
+        <w:spacing w:before="360" w:after="100"/>
         <w:jc w:val="left"/>
       </w:pPr>
       <w:r>
@@ -569,628 +558,249 @@
           <w:rFonts w:ascii="Times New Roman" w:hAnsi="Times New Roman"/>
           <w:b/>
           <w:color w:val="000000"/>
-          <w:sz w:val="26"/>
+          <w:sz w:val="24"/>
         </w:rPr>
-        <w:t>Bảng P.1: Thông tin chung về đề tài đồ án Project 13</w:t>
+        <w:t>II. THÔNG SỐ VÀ CẤU HÌNH KỸ THUẬT CỐT LÕI</w:t>
       </w:r>
     </w:p>
-    <w:tbl>
-      <w:tblPr>
-        <w:tblW w:type="auto" w:w="0"/>
-        <w:jc w:val="center"/>
-        <w:tblLook w:firstColumn="1" w:firstRow="1" w:lastColumn="0" w:lastRow="0" w:noHBand="0" w:noVBand="1" w:val="04A0"/>
-        <w:tblCellMar>
-          <w:top w:w="80" w:type="dxa"/>
-          <w:bottom w:w="80" w:type="dxa"/>
-          <w:left w:w="120" w:type="dxa"/>
-          <w:right w:w="120" w:type="dxa"/>
-        </w:tblCellMar>
-      </w:tblPr>
-      <w:tblGrid>
-        <w:gridCol w:w="4586"/>
-        <w:gridCol w:w="4586"/>
-      </w:tblGrid>
-      <w:tr>
-        <w:tc>
-          <w:tcPr>
-            <w:tcW w:type="dxa" w:w="3312"/>
-            <w:shd w:fill="F2F2F2"/>
-            <w:tcBorders>
-              <w:top w:val="single" w:sz="4" w:space="0" w:color="CCCCCC"/>
-              <w:bottom w:val="single" w:sz="4" w:space="0" w:color="CCCCCC"/>
-              <w:left w:val="single" w:sz="4" w:space="0" w:color="CCCCCC"/>
-              <w:right w:val="single" w:sz="4" w:space="0" w:color="CCCCCC"/>
-            </w:tcBorders>
-          </w:tcPr>
-          <w:p>
-            <w:pPr>
-              <w:spacing w:before="60" w:after="60"/>
-              <w:jc w:val="center"/>
-            </w:pPr>
-            <w:r>
-              <w:rPr>
-                <w:rFonts w:ascii="Times New Roman" w:hAnsi="Times New Roman"/>
-                <w:b/>
-                <w:color w:val="000000"/>
-                <w:sz w:val="22"/>
-              </w:rPr>
-              <w:t>Hạng mục</w:t>
-            </w:r>
-          </w:p>
-        </w:tc>
-        <w:tc>
-          <w:tcPr>
-            <w:tcW w:type="dxa" w:w="6048"/>
-            <w:shd w:fill="F2F2F2"/>
-            <w:tcBorders>
-              <w:top w:val="single" w:sz="4" w:space="0" w:color="CCCCCC"/>
-              <w:bottom w:val="single" w:sz="4" w:space="0" w:color="CCCCCC"/>
-              <w:left w:val="single" w:sz="4" w:space="0" w:color="CCCCCC"/>
-              <w:right w:val="single" w:sz="4" w:space="0" w:color="CCCCCC"/>
-            </w:tcBorders>
-          </w:tcPr>
-          <w:p>
-            <w:pPr>
-              <w:spacing w:before="60" w:after="60"/>
-              <w:jc w:val="center"/>
-            </w:pPr>
-            <w:r>
-              <w:rPr>
-                <w:rFonts w:ascii="Times New Roman" w:hAnsi="Times New Roman"/>
-                <w:b/>
-                <w:color w:val="000000"/>
-                <w:sz w:val="22"/>
-              </w:rPr>
-              <w:t>Thông tin chi tiết</w:t>
-            </w:r>
-          </w:p>
-        </w:tc>
-      </w:tr>
-      <w:tr>
-        <w:tc>
-          <w:tcPr>
-            <w:tcW w:type="dxa" w:w="3312"/>
-            <w:shd w:fill="FFFFFF"/>
-            <w:tcBorders>
-              <w:top w:val="single" w:sz="4" w:space="0" w:color="CCCCCC"/>
-              <w:bottom w:val="single" w:sz="4" w:space="0" w:color="CCCCCC"/>
-              <w:left w:val="single" w:sz="4" w:space="0" w:color="CCCCCC"/>
-              <w:right w:val="single" w:sz="4" w:space="0" w:color="CCCCCC"/>
-            </w:tcBorders>
-          </w:tcPr>
-          <w:p>
-            <w:pPr>
-              <w:spacing w:before="40" w:after="40"/>
-              <w:jc w:val="left"/>
-            </w:pPr>
-            <w:r>
-              <w:rPr>
-                <w:rFonts w:ascii="Times New Roman" w:hAnsi="Times New Roman"/>
-                <w:color w:val="000000"/>
-                <w:sz w:val="22"/>
-              </w:rPr>
-              <w:t>Đơn vị đào tạo</w:t>
-            </w:r>
-          </w:p>
-        </w:tc>
-        <w:tc>
-          <w:tcPr>
-            <w:tcW w:type="dxa" w:w="6048"/>
-            <w:shd w:fill="FFFFFF"/>
-            <w:tcBorders>
-              <w:top w:val="single" w:sz="4" w:space="0" w:color="CCCCCC"/>
-              <w:bottom w:val="single" w:sz="4" w:space="0" w:color="CCCCCC"/>
-              <w:left w:val="single" w:sz="4" w:space="0" w:color="CCCCCC"/>
-              <w:right w:val="single" w:sz="4" w:space="0" w:color="CCCCCC"/>
-            </w:tcBorders>
-          </w:tcPr>
-          <w:p>
-            <w:pPr>
-              <w:spacing w:before="40" w:after="40"/>
-              <w:jc w:val="left"/>
-            </w:pPr>
-            <w:r>
-              <w:rPr>
-                <w:rFonts w:ascii="Times New Roman" w:hAnsi="Times New Roman"/>
-                <w:color w:val="000000"/>
-                <w:sz w:val="22"/>
-              </w:rPr>
-              <w:t>Chương trình Samsung Innovation Campus 2026 (SIC 2026)</w:t>
-            </w:r>
-          </w:p>
-        </w:tc>
-      </w:tr>
-      <w:tr>
-        <w:tc>
-          <w:tcPr>
-            <w:tcW w:type="dxa" w:w="3312"/>
-            <w:shd w:fill="FFFFFF"/>
-            <w:tcBorders>
-              <w:top w:val="single" w:sz="4" w:space="0" w:color="CCCCCC"/>
-              <w:bottom w:val="single" w:sz="4" w:space="0" w:color="CCCCCC"/>
-              <w:left w:val="single" w:sz="4" w:space="0" w:color="CCCCCC"/>
-              <w:right w:val="single" w:sz="4" w:space="0" w:color="CCCCCC"/>
-            </w:tcBorders>
-          </w:tcPr>
-          <w:p>
-            <w:pPr>
-              <w:spacing w:before="40" w:after="40"/>
-              <w:jc w:val="left"/>
-            </w:pPr>
-            <w:r>
-              <w:rPr>
-                <w:rFonts w:ascii="Times New Roman" w:hAnsi="Times New Roman"/>
-                <w:color w:val="000000"/>
-                <w:sz w:val="22"/>
-              </w:rPr>
-              <w:t>Tên học phần</w:t>
-            </w:r>
-          </w:p>
-        </w:tc>
-        <w:tc>
-          <w:tcPr>
-            <w:tcW w:type="dxa" w:w="6048"/>
-            <w:shd w:fill="FFFFFF"/>
-            <w:tcBorders>
-              <w:top w:val="single" w:sz="4" w:space="0" w:color="CCCCCC"/>
-              <w:bottom w:val="single" w:sz="4" w:space="0" w:color="CCCCCC"/>
-              <w:left w:val="single" w:sz="4" w:space="0" w:color="CCCCCC"/>
-              <w:right w:val="single" w:sz="4" w:space="0" w:color="CCCCCC"/>
-            </w:tcBorders>
-          </w:tcPr>
-          <w:p>
-            <w:pPr>
-              <w:spacing w:before="40" w:after="40"/>
-              <w:jc w:val="left"/>
-            </w:pPr>
-            <w:r>
-              <w:rPr>
-                <w:rFonts w:ascii="Times New Roman" w:hAnsi="Times New Roman"/>
-                <w:color w:val="000000"/>
-                <w:sz w:val="22"/>
-              </w:rPr>
-              <w:t>Trí Tuệ Nhân Tạo &amp; Học Sâu (AI &amp; Deep Learning)</w:t>
-            </w:r>
-          </w:p>
-        </w:tc>
-      </w:tr>
-      <w:tr>
-        <w:tc>
-          <w:tcPr>
-            <w:tcW w:type="dxa" w:w="3312"/>
-            <w:shd w:fill="FFFFFF"/>
-            <w:tcBorders>
-              <w:top w:val="single" w:sz="4" w:space="0" w:color="CCCCCC"/>
-              <w:bottom w:val="single" w:sz="4" w:space="0" w:color="CCCCCC"/>
-              <w:left w:val="single" w:sz="4" w:space="0" w:color="CCCCCC"/>
-              <w:right w:val="single" w:sz="4" w:space="0" w:color="CCCCCC"/>
-            </w:tcBorders>
-          </w:tcPr>
-          <w:p>
-            <w:pPr>
-              <w:spacing w:before="40" w:after="40"/>
-              <w:jc w:val="left"/>
-            </w:pPr>
-            <w:r>
-              <w:rPr>
-                <w:rFonts w:ascii="Times New Roman" w:hAnsi="Times New Roman"/>
-                <w:color w:val="000000"/>
-                <w:sz w:val="22"/>
-              </w:rPr>
-              <w:t>Mã đề tài</w:t>
-            </w:r>
-          </w:p>
-        </w:tc>
-        <w:tc>
-          <w:tcPr>
-            <w:tcW w:type="dxa" w:w="6048"/>
-            <w:shd w:fill="FFFFFF"/>
-            <w:tcBorders>
-              <w:top w:val="single" w:sz="4" w:space="0" w:color="CCCCCC"/>
-              <w:bottom w:val="single" w:sz="4" w:space="0" w:color="CCCCCC"/>
-              <w:left w:val="single" w:sz="4" w:space="0" w:color="CCCCCC"/>
-              <w:right w:val="single" w:sz="4" w:space="0" w:color="CCCCCC"/>
-            </w:tcBorders>
-          </w:tcPr>
-          <w:p>
-            <w:pPr>
-              <w:spacing w:before="40" w:after="40"/>
-              <w:jc w:val="left"/>
-            </w:pPr>
-            <w:r>
-              <w:rPr>
-                <w:rFonts w:ascii="Times New Roman" w:hAnsi="Times New Roman"/>
-                <w:color w:val="000000"/>
-                <w:sz w:val="22"/>
-              </w:rPr>
-              <w:t>Project 13: Fruit Visual Quality Control</w:t>
-            </w:r>
-          </w:p>
-        </w:tc>
-      </w:tr>
-      <w:tr>
-        <w:tc>
-          <w:tcPr>
-            <w:tcW w:type="dxa" w:w="3312"/>
-            <w:shd w:fill="FFFFFF"/>
-            <w:tcBorders>
-              <w:top w:val="single" w:sz="4" w:space="0" w:color="CCCCCC"/>
-              <w:bottom w:val="single" w:sz="4" w:space="0" w:color="CCCCCC"/>
-              <w:left w:val="single" w:sz="4" w:space="0" w:color="CCCCCC"/>
-              <w:right w:val="single" w:sz="4" w:space="0" w:color="CCCCCC"/>
-            </w:tcBorders>
-          </w:tcPr>
-          <w:p>
-            <w:pPr>
-              <w:spacing w:before="40" w:after="40"/>
-              <w:jc w:val="left"/>
-            </w:pPr>
-            <w:r>
-              <w:rPr>
-                <w:rFonts w:ascii="Times New Roman" w:hAnsi="Times New Roman"/>
-                <w:color w:val="000000"/>
-                <w:sz w:val="22"/>
-              </w:rPr>
-              <w:t>Giảng viên hướng dẫn</w:t>
-            </w:r>
-          </w:p>
-        </w:tc>
-        <w:tc>
-          <w:tcPr>
-            <w:tcW w:type="dxa" w:w="6048"/>
-            <w:shd w:fill="FFFFFF"/>
-            <w:tcBorders>
-              <w:top w:val="single" w:sz="4" w:space="0" w:color="CCCCCC"/>
-              <w:bottom w:val="single" w:sz="4" w:space="0" w:color="CCCCCC"/>
-              <w:left w:val="single" w:sz="4" w:space="0" w:color="CCCCCC"/>
-              <w:right w:val="single" w:sz="4" w:space="0" w:color="CCCCCC"/>
-            </w:tcBorders>
-          </w:tcPr>
-          <w:p>
-            <w:pPr>
-              <w:spacing w:before="40" w:after="40"/>
-              <w:jc w:val="center"/>
-            </w:pPr>
-            <w:r>
-              <w:rPr>
-                <w:rFonts w:ascii="Times New Roman" w:hAnsi="Times New Roman"/>
-                <w:color w:val="000000"/>
-                <w:sz w:val="22"/>
-              </w:rPr>
-              <w:t>Thầy Trần Mạnh Tường</w:t>
-            </w:r>
-          </w:p>
-        </w:tc>
-      </w:tr>
-      <w:tr>
-        <w:tc>
-          <w:tcPr>
-            <w:tcW w:type="dxa" w:w="3312"/>
-            <w:shd w:fill="FFFFFF"/>
-            <w:tcBorders>
-              <w:top w:val="single" w:sz="4" w:space="0" w:color="CCCCCC"/>
-              <w:bottom w:val="single" w:sz="4" w:space="0" w:color="CCCCCC"/>
-              <w:left w:val="single" w:sz="4" w:space="0" w:color="CCCCCC"/>
-              <w:right w:val="single" w:sz="4" w:space="0" w:color="CCCCCC"/>
-            </w:tcBorders>
-          </w:tcPr>
-          <w:p>
-            <w:pPr>
-              <w:spacing w:before="40" w:after="40"/>
-              <w:jc w:val="left"/>
-            </w:pPr>
-            <w:r>
-              <w:rPr>
-                <w:rFonts w:ascii="Times New Roman" w:hAnsi="Times New Roman"/>
-                <w:color w:val="000000"/>
-                <w:sz w:val="22"/>
-              </w:rPr>
-              <w:t>Học viên thực hiện</w:t>
-            </w:r>
-          </w:p>
-        </w:tc>
-        <w:tc>
-          <w:tcPr>
-            <w:tcW w:type="dxa" w:w="6048"/>
-            <w:shd w:fill="FFFFFF"/>
-            <w:tcBorders>
-              <w:top w:val="single" w:sz="4" w:space="0" w:color="CCCCCC"/>
-              <w:bottom w:val="single" w:sz="4" w:space="0" w:color="CCCCCC"/>
-              <w:left w:val="single" w:sz="4" w:space="0" w:color="CCCCCC"/>
-              <w:right w:val="single" w:sz="4" w:space="0" w:color="CCCCCC"/>
-            </w:tcBorders>
-          </w:tcPr>
-          <w:p>
-            <w:pPr>
-              <w:spacing w:before="40" w:after="40"/>
-              <w:jc w:val="center"/>
-            </w:pPr>
-            <w:r>
-              <w:rPr>
-                <w:rFonts w:ascii="Times New Roman" w:hAnsi="Times New Roman"/>
-                <w:color w:val="000000"/>
-                <w:sz w:val="22"/>
-              </w:rPr>
-              <w:t>Lê Thành Được</w:t>
-            </w:r>
-          </w:p>
-        </w:tc>
-      </w:tr>
-      <w:tr>
-        <w:tc>
-          <w:tcPr>
-            <w:tcW w:type="dxa" w:w="3312"/>
-            <w:shd w:fill="FFFFFF"/>
-            <w:tcBorders>
-              <w:top w:val="single" w:sz="4" w:space="0" w:color="CCCCCC"/>
-              <w:bottom w:val="single" w:sz="4" w:space="0" w:color="CCCCCC"/>
-              <w:left w:val="single" w:sz="4" w:space="0" w:color="CCCCCC"/>
-              <w:right w:val="single" w:sz="4" w:space="0" w:color="CCCCCC"/>
-            </w:tcBorders>
-          </w:tcPr>
-          <w:p>
-            <w:pPr>
-              <w:spacing w:before="40" w:after="40"/>
-              <w:jc w:val="left"/>
-            </w:pPr>
-            <w:r>
-              <w:rPr>
-                <w:rFonts w:ascii="Times New Roman" w:hAnsi="Times New Roman"/>
-                <w:color w:val="000000"/>
-                <w:sz w:val="22"/>
-              </w:rPr>
-              <w:t>Lớp học phần</w:t>
-            </w:r>
-          </w:p>
-        </w:tc>
-        <w:tc>
-          <w:tcPr>
-            <w:tcW w:type="dxa" w:w="6048"/>
-            <w:shd w:fill="FFFFFF"/>
-            <w:tcBorders>
-              <w:top w:val="single" w:sz="4" w:space="0" w:color="CCCCCC"/>
-              <w:bottom w:val="single" w:sz="4" w:space="0" w:color="CCCCCC"/>
-              <w:left w:val="single" w:sz="4" w:space="0" w:color="CCCCCC"/>
-              <w:right w:val="single" w:sz="4" w:space="0" w:color="CCCCCC"/>
-            </w:tcBorders>
-          </w:tcPr>
-          <w:p>
-            <w:pPr>
-              <w:spacing w:before="40" w:after="40"/>
-              <w:jc w:val="center"/>
-            </w:pPr>
-            <w:r>
-              <w:rPr>
-                <w:rFonts w:ascii="Times New Roman" w:hAnsi="Times New Roman"/>
-                <w:color w:val="000000"/>
-                <w:sz w:val="22"/>
-              </w:rPr>
-              <w:t>AI1</w:t>
-            </w:r>
-          </w:p>
-        </w:tc>
-      </w:tr>
-      <w:tr>
-        <w:tc>
-          <w:tcPr>
-            <w:tcW w:type="dxa" w:w="3312"/>
-            <w:shd w:fill="FFFFFF"/>
-            <w:tcBorders>
-              <w:top w:val="single" w:sz="4" w:space="0" w:color="CCCCCC"/>
-              <w:bottom w:val="single" w:sz="4" w:space="0" w:color="CCCCCC"/>
-              <w:left w:val="single" w:sz="4" w:space="0" w:color="CCCCCC"/>
-              <w:right w:val="single" w:sz="4" w:space="0" w:color="CCCCCC"/>
-            </w:tcBorders>
-          </w:tcPr>
-          <w:p>
-            <w:pPr>
-              <w:spacing w:before="40" w:after="40"/>
-              <w:jc w:val="left"/>
-            </w:pPr>
-            <w:r>
-              <w:rPr>
-                <w:rFonts w:ascii="Times New Roman" w:hAnsi="Times New Roman"/>
-                <w:color w:val="000000"/>
-                <w:sz w:val="22"/>
-              </w:rPr>
-              <w:t>Tập dữ liệu sử dụng</w:t>
-            </w:r>
-          </w:p>
-        </w:tc>
-        <w:tc>
-          <w:tcPr>
-            <w:tcW w:type="dxa" w:w="6048"/>
-            <w:shd w:fill="FFFFFF"/>
-            <w:tcBorders>
-              <w:top w:val="single" w:sz="4" w:space="0" w:color="CCCCCC"/>
-              <w:bottom w:val="single" w:sz="4" w:space="0" w:color="CCCCCC"/>
-              <w:left w:val="single" w:sz="4" w:space="0" w:color="CCCCCC"/>
-              <w:right w:val="single" w:sz="4" w:space="0" w:color="CCCCCC"/>
-            </w:tcBorders>
-          </w:tcPr>
-          <w:p>
-            <w:pPr>
-              <w:spacing w:before="40" w:after="40"/>
-              <w:jc w:val="left"/>
-            </w:pPr>
-            <w:r>
-              <w:rPr>
-                <w:rFonts w:ascii="Times New Roman" w:hAnsi="Times New Roman"/>
-                <w:color w:val="000000"/>
-                <w:sz w:val="22"/>
-              </w:rPr>
-              <w:t>27,198 ảnh RGB chia phân tầng 70/15/15 (SEED = 42)</w:t>
-            </w:r>
-          </w:p>
-        </w:tc>
-      </w:tr>
-      <w:tr>
-        <w:tc>
-          <w:tcPr>
-            <w:tcW w:type="dxa" w:w="3312"/>
-            <w:shd w:fill="FFFFFF"/>
-            <w:tcBorders>
-              <w:top w:val="single" w:sz="4" w:space="0" w:color="CCCCCC"/>
-              <w:bottom w:val="single" w:sz="4" w:space="0" w:color="CCCCCC"/>
-              <w:left w:val="single" w:sz="4" w:space="0" w:color="CCCCCC"/>
-              <w:right w:val="single" w:sz="4" w:space="0" w:color="CCCCCC"/>
-            </w:tcBorders>
-          </w:tcPr>
-          <w:p>
-            <w:pPr>
-              <w:spacing w:before="40" w:after="40"/>
-              <w:jc w:val="left"/>
-            </w:pPr>
-            <w:r>
-              <w:rPr>
-                <w:rFonts w:ascii="Times New Roman" w:hAnsi="Times New Roman"/>
-                <w:color w:val="000000"/>
-                <w:sz w:val="22"/>
-              </w:rPr>
-              <w:t>Các mô hình nghiên cứu</w:t>
-            </w:r>
-          </w:p>
-        </w:tc>
-        <w:tc>
-          <w:tcPr>
-            <w:tcW w:type="dxa" w:w="6048"/>
-            <w:shd w:fill="FFFFFF"/>
-            <w:tcBorders>
-              <w:top w:val="single" w:sz="4" w:space="0" w:color="CCCCCC"/>
-              <w:bottom w:val="single" w:sz="4" w:space="0" w:color="CCCCCC"/>
-              <w:left w:val="single" w:sz="4" w:space="0" w:color="CCCCCC"/>
-              <w:right w:val="single" w:sz="4" w:space="0" w:color="CCCCCC"/>
-            </w:tcBorders>
-          </w:tcPr>
-          <w:p>
-            <w:pPr>
-              <w:spacing w:before="40" w:after="40"/>
-              <w:jc w:val="left"/>
-            </w:pPr>
-            <w:r>
-              <w:rPr>
-                <w:rFonts w:ascii="Times New Roman" w:hAnsi="Times New Roman"/>
-                <w:color w:val="000000"/>
-                <w:sz w:val="22"/>
-              </w:rPr>
-              <w:t>Baseline CNN, VGG16, ResNet50, EfficientNetB0</w:t>
-            </w:r>
-          </w:p>
-        </w:tc>
-      </w:tr>
-      <w:tr>
-        <w:tc>
-          <w:tcPr>
-            <w:tcW w:type="dxa" w:w="3312"/>
-            <w:shd w:fill="FFFFFF"/>
-            <w:tcBorders>
-              <w:top w:val="single" w:sz="4" w:space="0" w:color="CCCCCC"/>
-              <w:bottom w:val="single" w:sz="4" w:space="0" w:color="CCCCCC"/>
-              <w:left w:val="single" w:sz="4" w:space="0" w:color="CCCCCC"/>
-              <w:right w:val="single" w:sz="4" w:space="0" w:color="CCCCCC"/>
-            </w:tcBorders>
-          </w:tcPr>
-          <w:p>
-            <w:pPr>
-              <w:spacing w:before="40" w:after="40"/>
-              <w:jc w:val="left"/>
-            </w:pPr>
-            <w:r>
-              <w:rPr>
-                <w:rFonts w:ascii="Times New Roman" w:hAnsi="Times New Roman"/>
-                <w:color w:val="000000"/>
-                <w:sz w:val="22"/>
-              </w:rPr>
-              <w:t>Phương pháp giải thích mô hình</w:t>
-            </w:r>
-          </w:p>
-        </w:tc>
-        <w:tc>
-          <w:tcPr>
-            <w:tcW w:type="dxa" w:w="6048"/>
-            <w:shd w:fill="FFFFFF"/>
-            <w:tcBorders>
-              <w:top w:val="single" w:sz="4" w:space="0" w:color="CCCCCC"/>
-              <w:bottom w:val="single" w:sz="4" w:space="0" w:color="CCCCCC"/>
-              <w:left w:val="single" w:sz="4" w:space="0" w:color="CCCCCC"/>
-              <w:right w:val="single" w:sz="4" w:space="0" w:color="CCCCCC"/>
-            </w:tcBorders>
-          </w:tcPr>
-          <w:p>
-            <w:pPr>
-              <w:spacing w:before="40" w:after="40"/>
-              <w:jc w:val="left"/>
-            </w:pPr>
-            <w:r>
-              <w:rPr>
-                <w:rFonts w:ascii="Times New Roman" w:hAnsi="Times New Roman"/>
-                <w:color w:val="000000"/>
-                <w:sz w:val="22"/>
-              </w:rPr>
-              <w:t>Linear Logit Grad-CAM kết hợp trộn mặt nạ Alpha</w:t>
-            </w:r>
-          </w:p>
-        </w:tc>
-      </w:tr>
-      <w:tr>
-        <w:tc>
-          <w:tcPr>
-            <w:tcW w:type="dxa" w:w="3312"/>
-            <w:shd w:fill="FFFFFF"/>
-            <w:tcBorders>
-              <w:top w:val="single" w:sz="4" w:space="0" w:color="CCCCCC"/>
-              <w:bottom w:val="single" w:sz="4" w:space="0" w:color="CCCCCC"/>
-              <w:left w:val="single" w:sz="4" w:space="0" w:color="CCCCCC"/>
-              <w:right w:val="single" w:sz="4" w:space="0" w:color="CCCCCC"/>
-            </w:tcBorders>
-          </w:tcPr>
-          <w:p>
-            <w:pPr>
-              <w:spacing w:before="40" w:after="40"/>
-              <w:jc w:val="left"/>
-            </w:pPr>
-            <w:r>
-              <w:rPr>
-                <w:rFonts w:ascii="Times New Roman" w:hAnsi="Times New Roman"/>
-                <w:color w:val="000000"/>
-                <w:sz w:val="22"/>
-              </w:rPr>
-              <w:t>Ứng dụng thử nghiệm</w:t>
-            </w:r>
-          </w:p>
-        </w:tc>
-        <w:tc>
-          <w:tcPr>
-            <w:tcW w:type="dxa" w:w="6048"/>
-            <w:shd w:fill="FFFFFF"/>
-            <w:tcBorders>
-              <w:top w:val="single" w:sz="4" w:space="0" w:color="CCCCCC"/>
-              <w:bottom w:val="single" w:sz="4" w:space="0" w:color="CCCCCC"/>
-              <w:left w:val="single" w:sz="4" w:space="0" w:color="CCCCCC"/>
-              <w:right w:val="single" w:sz="4" w:space="0" w:color="CCCCCC"/>
-            </w:tcBorders>
-          </w:tcPr>
-          <w:p>
-            <w:pPr>
-              <w:spacing w:before="40" w:after="40"/>
-              <w:jc w:val="left"/>
-            </w:pPr>
-            <w:r>
-              <w:rPr>
-                <w:rFonts w:ascii="Times New Roman" w:hAnsi="Times New Roman"/>
-                <w:color w:val="000000"/>
-                <w:sz w:val="22"/>
-              </w:rPr>
-              <w:t>Giao diện Web Streamlit kết nối camera điện thoại qua DroidCam</w:t>
-            </w:r>
-          </w:p>
-        </w:tc>
-      </w:tr>
-    </w:tbl>
     <w:p>
       <w:pPr>
-        <w:spacing w:after="80"/>
+        <w:spacing w:before="0" w:after="90" w:line="300" w:lineRule="auto"/>
+        <w:ind w:left="288"/>
+        <w:jc w:val="both"/>
       </w:pPr>
+      <w:r>
+        <w:rPr>
+          <w:rFonts w:ascii="Times New Roman" w:hAnsi="Times New Roman"/>
+          <w:color w:val="444444"/>
+          <w:sz w:val="18"/>
+        </w:rPr>
+        <w:t xml:space="preserve">▪  </w:t>
+      </w:r>
+      <w:r>
+        <w:rPr>
+          <w:rFonts w:ascii="Times New Roman" w:hAnsi="Times New Roman"/>
+          <w:b/>
+          <w:color w:val="000000"/>
+          <w:sz w:val="22"/>
+        </w:rPr>
+        <w:t xml:space="preserve">Mã đề tài &amp; Dự án: </w:t>
+      </w:r>
+      <w:r>
+        <w:rPr>
+          <w:rFonts w:ascii="Times New Roman" w:hAnsi="Times New Roman"/>
+          <w:color w:val="111111"/>
+          <w:sz w:val="22"/>
+        </w:rPr>
+        <w:t>Project 13: Fruit Visual Quality Control</w:t>
+      </w:r>
+    </w:p>
+    <w:p>
+      <w:pPr>
+        <w:spacing w:before="0" w:after="90" w:line="300" w:lineRule="auto"/>
+        <w:ind w:left="288"/>
+        <w:jc w:val="both"/>
+      </w:pPr>
+      <w:r>
+        <w:rPr>
+          <w:rFonts w:ascii="Times New Roman" w:hAnsi="Times New Roman"/>
+          <w:color w:val="444444"/>
+          <w:sz w:val="18"/>
+        </w:rPr>
+        <w:t xml:space="preserve">▪  </w:t>
+      </w:r>
+      <w:r>
+        <w:rPr>
+          <w:rFonts w:ascii="Times New Roman" w:hAnsi="Times New Roman"/>
+          <w:b/>
+          <w:color w:val="000000"/>
+          <w:sz w:val="22"/>
+        </w:rPr>
+        <w:t xml:space="preserve">Tập dữ liệu nghiên cứu: </w:t>
+      </w:r>
+      <w:r>
+        <w:rPr>
+          <w:rFonts w:ascii="Times New Roman" w:hAnsi="Times New Roman"/>
+          <w:color w:val="111111"/>
+          <w:sz w:val="22"/>
+        </w:rPr>
+        <w:t>27,198 ảnh RGB chia phân tầng 70/15/15 (SEED = 42)</w:t>
+      </w:r>
+    </w:p>
+    <w:p>
+      <w:pPr>
+        <w:spacing w:before="0" w:after="90" w:line="300" w:lineRule="auto"/>
+        <w:ind w:left="288"/>
+        <w:jc w:val="both"/>
+      </w:pPr>
+      <w:r>
+        <w:rPr>
+          <w:rFonts w:ascii="Times New Roman" w:hAnsi="Times New Roman"/>
+          <w:color w:val="444444"/>
+          <w:sz w:val="18"/>
+        </w:rPr>
+        <w:t xml:space="preserve">▪  </w:t>
+      </w:r>
+      <w:r>
+        <w:rPr>
+          <w:rFonts w:ascii="Times New Roman" w:hAnsi="Times New Roman"/>
+          <w:b/>
+          <w:color w:val="000000"/>
+          <w:sz w:val="22"/>
+        </w:rPr>
+        <w:t xml:space="preserve">Các mô hình nghiên cứu: </w:t>
+      </w:r>
+      <w:r>
+        <w:rPr>
+          <w:rFonts w:ascii="Times New Roman" w:hAnsi="Times New Roman"/>
+          <w:color w:val="111111"/>
+          <w:sz w:val="22"/>
+        </w:rPr>
+        <w:t>Baseline CNN, VGG16, ResNet50, EfficientNetB0</w:t>
+      </w:r>
+    </w:p>
+    <w:p>
+      <w:pPr>
+        <w:spacing w:before="0" w:after="90" w:line="300" w:lineRule="auto"/>
+        <w:ind w:left="288"/>
+        <w:jc w:val="both"/>
+      </w:pPr>
+      <w:r>
+        <w:rPr>
+          <w:rFonts w:ascii="Times New Roman" w:hAnsi="Times New Roman"/>
+          <w:color w:val="444444"/>
+          <w:sz w:val="18"/>
+        </w:rPr>
+        <w:t xml:space="preserve">▪  </w:t>
+      </w:r>
+      <w:r>
+        <w:rPr>
+          <w:rFonts w:ascii="Times New Roman" w:hAnsi="Times New Roman"/>
+          <w:b/>
+          <w:color w:val="000000"/>
+          <w:sz w:val="22"/>
+        </w:rPr>
+        <w:t xml:space="preserve">Phương pháp giải thích AI: </w:t>
+      </w:r>
+      <w:r>
+        <w:rPr>
+          <w:rFonts w:ascii="Times New Roman" w:hAnsi="Times New Roman"/>
+          <w:color w:val="111111"/>
+          <w:sz w:val="22"/>
+        </w:rPr>
+        <w:t>Linear Logit Grad-CAM kết hợp trộn mặt nạ thích nghi Alpha</w:t>
+      </w:r>
+    </w:p>
+    <w:p>
+      <w:pPr>
+        <w:spacing w:before="0" w:after="90" w:line="300" w:lineRule="auto"/>
+        <w:ind w:left="288"/>
+        <w:jc w:val="both"/>
+      </w:pPr>
+      <w:r>
+        <w:rPr>
+          <w:rFonts w:ascii="Times New Roman" w:hAnsi="Times New Roman"/>
+          <w:color w:val="444444"/>
+          <w:sz w:val="18"/>
+        </w:rPr>
+        <w:t xml:space="preserve">▪  </w:t>
+      </w:r>
+      <w:r>
+        <w:rPr>
+          <w:rFonts w:ascii="Times New Roman" w:hAnsi="Times New Roman"/>
+          <w:b/>
+          <w:color w:val="000000"/>
+          <w:sz w:val="22"/>
+        </w:rPr>
+        <w:t xml:space="preserve">Ứng dụng thử nghiệm: </w:t>
+      </w:r>
+      <w:r>
+        <w:rPr>
+          <w:rFonts w:ascii="Times New Roman" w:hAnsi="Times New Roman"/>
+          <w:color w:val="111111"/>
+          <w:sz w:val="22"/>
+        </w:rPr>
+        <w:t>Giao diện Web Streamlit kết nối camera thời gian thực (DroidCam)</w:t>
+      </w:r>
+    </w:p>
+    <w:p>
+      <w:pPr>
+        <w:spacing w:before="360" w:after="100"/>
+        <w:jc w:val="left"/>
+      </w:pPr>
+      <w:r>
+        <w:rPr>
+          <w:rFonts w:ascii="Times New Roman" w:hAnsi="Times New Roman"/>
+          <w:b/>
+          <w:color w:val="000000"/>
+          <w:sz w:val="24"/>
+        </w:rPr>
+        <w:t>III. THỜI GIAN VÀ ĐỊA ĐIỂM NGHIỆM THU</w:t>
+      </w:r>
+    </w:p>
+    <w:p>
+      <w:pPr>
+        <w:spacing w:before="0" w:after="90" w:line="300" w:lineRule="auto"/>
+        <w:ind w:left="288"/>
+        <w:jc w:val="both"/>
+      </w:pPr>
+      <w:r>
+        <w:rPr>
+          <w:rFonts w:ascii="Times New Roman" w:hAnsi="Times New Roman"/>
+          <w:color w:val="444444"/>
+          <w:sz w:val="18"/>
+        </w:rPr>
+        <w:t xml:space="preserve">▪  </w:t>
+      </w:r>
+      <w:r>
+        <w:rPr>
+          <w:rFonts w:ascii="Times New Roman" w:hAnsi="Times New Roman"/>
+          <w:b/>
+          <w:color w:val="000000"/>
+          <w:sz w:val="22"/>
+        </w:rPr>
+        <w:t xml:space="preserve">Thời gian thực hiện: </w:t>
+      </w:r>
+      <w:r>
+        <w:rPr>
+          <w:rFonts w:ascii="Times New Roman" w:hAnsi="Times New Roman"/>
+          <w:color w:val="111111"/>
+          <w:sz w:val="22"/>
+        </w:rPr>
+        <w:t>Khóa đào tạo SIC 2026 (Nghiệm thu tháng 10 năm 2026)</w:t>
+      </w:r>
+    </w:p>
+    <w:p>
+      <w:pPr>
+        <w:spacing w:before="0" w:after="90" w:line="300" w:lineRule="auto"/>
+        <w:ind w:left="288"/>
+        <w:jc w:val="both"/>
+      </w:pPr>
+      <w:r>
+        <w:rPr>
+          <w:rFonts w:ascii="Times New Roman" w:hAnsi="Times New Roman"/>
+          <w:color w:val="444444"/>
+          <w:sz w:val="18"/>
+        </w:rPr>
+        <w:t xml:space="preserve">▪  </w:t>
+      </w:r>
+      <w:r>
+        <w:rPr>
+          <w:rFonts w:ascii="Times New Roman" w:hAnsi="Times New Roman"/>
+          <w:b/>
+          <w:color w:val="000000"/>
+          <w:sz w:val="22"/>
+        </w:rPr>
+        <w:t xml:space="preserve">Địa điểm hoàn thành: </w:t>
+      </w:r>
+      <w:r>
+        <w:rPr>
+          <w:rFonts w:ascii="Times New Roman" w:hAnsi="Times New Roman"/>
+          <w:color w:val="111111"/>
+          <w:sz w:val="22"/>
+        </w:rPr>
+        <w:t>Thành phố Hồ Chí Minh</w:t>
+      </w:r>
     </w:p>
     <w:p>
       <w:r>
@@ -1206,6 +816,7 @@
         <w:rPr>
           <w:rFonts w:ascii="Times New Roman" w:hAnsi="Times New Roman"/>
           <w:b/>
+          <w:i w:val="0"/>
           <w:color w:val="000000"/>
           <w:sz w:val="30"/>
         </w:rPr>
@@ -1342,6 +953,7 @@
         <w:rPr>
           <w:rFonts w:ascii="Times New Roman" w:hAnsi="Times New Roman"/>
           <w:b/>
+          <w:i w:val="0"/>
           <w:color w:val="000000"/>
           <w:sz w:val="30"/>
         </w:rPr>
@@ -1486,6 +1098,7 @@
         <w:rPr>
           <w:rFonts w:ascii="Times New Roman" w:hAnsi="Times New Roman"/>
           <w:b/>
+          <w:i w:val="0"/>
           <w:color w:val="000000"/>
           <w:sz w:val="30"/>
         </w:rPr>
@@ -1775,7 +1388,7 @@
                 <w:color w:val="000000"/>
                 <w:sz w:val="22"/>
               </w:rPr>
-              <w:t>5</w:t>
+              <w:t>7</w:t>
             </w:r>
           </w:p>
         </w:tc>
@@ -1829,7 +1442,7 @@
                 <w:color w:val="000000"/>
                 <w:sz w:val="22"/>
               </w:rPr>
-              <w:t>6</w:t>
+              <w:t>9</w:t>
             </w:r>
           </w:p>
         </w:tc>
@@ -1883,7 +1496,7 @@
                 <w:color w:val="000000"/>
                 <w:sz w:val="22"/>
               </w:rPr>
-              <w:t>7</w:t>
+              <w:t>10</w:t>
             </w:r>
           </w:p>
         </w:tc>
@@ -1937,7 +1550,7 @@
                 <w:color w:val="000000"/>
                 <w:sz w:val="22"/>
               </w:rPr>
-              <w:t>8</w:t>
+              <w:t>11</w:t>
             </w:r>
           </w:p>
         </w:tc>
@@ -1991,7 +1604,7 @@
                 <w:color w:val="000000"/>
                 <w:sz w:val="22"/>
               </w:rPr>
-              <w:t>9</w:t>
+              <w:t>12</w:t>
             </w:r>
           </w:p>
         </w:tc>
@@ -2045,7 +1658,7 @@
                 <w:color w:val="000000"/>
                 <w:sz w:val="22"/>
               </w:rPr>
-              <w:t>9</w:t>
+              <w:t>12</w:t>
             </w:r>
           </w:p>
         </w:tc>
@@ -2099,7 +1712,7 @@
                 <w:color w:val="000000"/>
                 <w:sz w:val="22"/>
               </w:rPr>
-              <w:t>9</w:t>
+              <w:t>12</w:t>
             </w:r>
           </w:p>
         </w:tc>
@@ -2153,7 +1766,7 @@
                 <w:color w:val="000000"/>
                 <w:sz w:val="22"/>
               </w:rPr>
-              <w:t>10</w:t>
+              <w:t>13</w:t>
             </w:r>
           </w:p>
         </w:tc>
@@ -2207,7 +1820,7 @@
                 <w:color w:val="000000"/>
                 <w:sz w:val="22"/>
               </w:rPr>
-              <w:t>10</w:t>
+              <w:t>13</w:t>
             </w:r>
           </w:p>
         </w:tc>
@@ -2261,7 +1874,7 @@
                 <w:color w:val="000000"/>
                 <w:sz w:val="22"/>
               </w:rPr>
-              <w:t>11</w:t>
+              <w:t>13</w:t>
             </w:r>
           </w:p>
         </w:tc>
@@ -2315,7 +1928,7 @@
                 <w:color w:val="000000"/>
                 <w:sz w:val="22"/>
               </w:rPr>
-              <w:t>12</w:t>
+              <w:t>14</w:t>
             </w:r>
           </w:p>
         </w:tc>
@@ -2369,7 +1982,7 @@
                 <w:color w:val="000000"/>
                 <w:sz w:val="22"/>
               </w:rPr>
-              <w:t>12</w:t>
+              <w:t>14</w:t>
             </w:r>
           </w:p>
         </w:tc>
@@ -2423,7 +2036,7 @@
                 <w:color w:val="000000"/>
                 <w:sz w:val="22"/>
               </w:rPr>
-              <w:t>12</w:t>
+              <w:t>14</w:t>
             </w:r>
           </w:p>
         </w:tc>
@@ -2477,7 +2090,7 @@
                 <w:color w:val="000000"/>
                 <w:sz w:val="22"/>
               </w:rPr>
-              <w:t>13</w:t>
+              <w:t>15</w:t>
             </w:r>
           </w:p>
         </w:tc>
@@ -2531,7 +2144,7 @@
                 <w:color w:val="000000"/>
                 <w:sz w:val="22"/>
               </w:rPr>
-              <w:t>14</w:t>
+              <w:t>15</w:t>
             </w:r>
           </w:p>
         </w:tc>
@@ -2585,7 +2198,7 @@
                 <w:color w:val="000000"/>
                 <w:sz w:val="22"/>
               </w:rPr>
-              <w:t>16</w:t>
+              <w:t>17</w:t>
             </w:r>
           </w:p>
         </w:tc>
@@ -2639,7 +2252,7 @@
                 <w:color w:val="000000"/>
                 <w:sz w:val="22"/>
               </w:rPr>
-              <w:t>16</w:t>
+              <w:t>17</w:t>
             </w:r>
           </w:p>
         </w:tc>
@@ -2693,7 +2306,7 @@
                 <w:color w:val="000000"/>
                 <w:sz w:val="22"/>
               </w:rPr>
-              <w:t>17</w:t>
+              <w:t>18</w:t>
             </w:r>
           </w:p>
         </w:tc>
@@ -2801,7 +2414,7 @@
                 <w:color w:val="000000"/>
                 <w:sz w:val="22"/>
               </w:rPr>
-              <w:t>20</w:t>
+              <w:t>21</w:t>
             </w:r>
           </w:p>
         </w:tc>
@@ -2855,7 +2468,7 @@
                 <w:color w:val="000000"/>
                 <w:sz w:val="22"/>
               </w:rPr>
-              <w:t>20</w:t>
+              <w:t>21</w:t>
             </w:r>
           </w:p>
         </w:tc>
@@ -2963,7 +2576,7 @@
                 <w:color w:val="000000"/>
                 <w:sz w:val="22"/>
               </w:rPr>
-              <w:t>23</w:t>
+              <w:t>22</w:t>
             </w:r>
           </w:p>
         </w:tc>
@@ -3017,7 +2630,7 @@
                 <w:color w:val="000000"/>
                 <w:sz w:val="22"/>
               </w:rPr>
-              <w:t>26</w:t>
+              <w:t>25</w:t>
             </w:r>
           </w:p>
         </w:tc>
@@ -3071,7 +2684,7 @@
                 <w:color w:val="000000"/>
                 <w:sz w:val="22"/>
               </w:rPr>
-              <w:t>26</w:t>
+              <w:t>25</w:t>
             </w:r>
           </w:p>
         </w:tc>
@@ -3125,7 +2738,7 @@
                 <w:color w:val="000000"/>
                 <w:sz w:val="22"/>
               </w:rPr>
-              <w:t>27</w:t>
+              <w:t>25</w:t>
             </w:r>
           </w:p>
         </w:tc>
@@ -3179,7 +2792,7 @@
                 <w:color w:val="000000"/>
                 <w:sz w:val="22"/>
               </w:rPr>
-              <w:t>28</w:t>
+              <w:t>26</w:t>
             </w:r>
           </w:p>
         </w:tc>
@@ -3233,7 +2846,7 @@
                 <w:color w:val="000000"/>
                 <w:sz w:val="22"/>
               </w:rPr>
-              <w:t>30</w:t>
+              <w:t>28</w:t>
             </w:r>
           </w:p>
         </w:tc>
@@ -3287,7 +2900,7 @@
                 <w:color w:val="000000"/>
                 <w:sz w:val="22"/>
               </w:rPr>
-              <w:t>30</w:t>
+              <w:t>28</w:t>
             </w:r>
           </w:p>
         </w:tc>
@@ -3341,7 +2954,7 @@
                 <w:color w:val="000000"/>
                 <w:sz w:val="22"/>
               </w:rPr>
-              <w:t>31</w:t>
+              <w:t>28</w:t>
             </w:r>
           </w:p>
         </w:tc>
@@ -3395,7 +3008,7 @@
                 <w:color w:val="000000"/>
                 <w:sz w:val="22"/>
               </w:rPr>
-              <w:t>33</w:t>
+              <w:t>29</w:t>
             </w:r>
           </w:p>
         </w:tc>
@@ -3449,7 +3062,7 @@
                 <w:color w:val="000000"/>
                 <w:sz w:val="22"/>
               </w:rPr>
-              <w:t>34</w:t>
+              <w:t>30</w:t>
             </w:r>
           </w:p>
         </w:tc>
@@ -3503,7 +3116,7 @@
                 <w:color w:val="000000"/>
                 <w:sz w:val="22"/>
               </w:rPr>
-              <w:t>36</w:t>
+              <w:t>32</w:t>
             </w:r>
           </w:p>
         </w:tc>
@@ -3557,7 +3170,7 @@
                 <w:color w:val="000000"/>
                 <w:sz w:val="22"/>
               </w:rPr>
-              <w:t>36</w:t>
+              <w:t>32</w:t>
             </w:r>
           </w:p>
         </w:tc>
@@ -3611,7 +3224,7 @@
                 <w:color w:val="000000"/>
                 <w:sz w:val="22"/>
               </w:rPr>
-              <w:t>36</w:t>
+              <w:t>32</w:t>
             </w:r>
           </w:p>
         </w:tc>
@@ -3665,7 +3278,7 @@
                 <w:color w:val="000000"/>
                 <w:sz w:val="22"/>
               </w:rPr>
-              <w:t>37</w:t>
+              <w:t>33</w:t>
             </w:r>
           </w:p>
         </w:tc>
@@ -3719,7 +3332,7 @@
                 <w:color w:val="000000"/>
                 <w:sz w:val="22"/>
               </w:rPr>
-              <w:t>38</w:t>
+              <w:t>34</w:t>
             </w:r>
           </w:p>
         </w:tc>
@@ -3773,7 +3386,7 @@
                 <w:color w:val="000000"/>
                 <w:sz w:val="22"/>
               </w:rPr>
-              <w:t>40</w:t>
+              <w:t>35</w:t>
             </w:r>
           </w:p>
         </w:tc>
@@ -3827,7 +3440,7 @@
                 <w:color w:val="000000"/>
                 <w:sz w:val="22"/>
               </w:rPr>
-              <w:t>40</w:t>
+              <w:t>35</w:t>
             </w:r>
           </w:p>
         </w:tc>
@@ -3881,7 +3494,7 @@
                 <w:color w:val="000000"/>
                 <w:sz w:val="22"/>
               </w:rPr>
-              <w:t>41</w:t>
+              <w:t>35</w:t>
             </w:r>
           </w:p>
         </w:tc>
@@ -3935,7 +3548,7 @@
                 <w:color w:val="000000"/>
                 <w:sz w:val="22"/>
               </w:rPr>
-              <w:t>41</w:t>
+              <w:t>36</w:t>
             </w:r>
           </w:p>
         </w:tc>
@@ -3989,7 +3602,7 @@
                 <w:color w:val="000000"/>
                 <w:sz w:val="22"/>
               </w:rPr>
-              <w:t>42</w:t>
+              <w:t>36</w:t>
             </w:r>
           </w:p>
         </w:tc>
@@ -4043,7 +3656,7 @@
                 <w:color w:val="000000"/>
                 <w:sz w:val="22"/>
               </w:rPr>
-              <w:t>43</w:t>
+              <w:t>37</w:t>
             </w:r>
           </w:p>
         </w:tc>
@@ -4097,7 +3710,7 @@
                 <w:color w:val="000000"/>
                 <w:sz w:val="22"/>
               </w:rPr>
-              <w:t>44</w:t>
+              <w:t>38</w:t>
             </w:r>
           </w:p>
         </w:tc>
@@ -4151,7 +3764,7 @@
                 <w:color w:val="000000"/>
                 <w:sz w:val="22"/>
               </w:rPr>
-              <w:t>44</w:t>
+              <w:t>38</w:t>
             </w:r>
           </w:p>
         </w:tc>
@@ -4205,7 +3818,7 @@
                 <w:color w:val="000000"/>
                 <w:sz w:val="22"/>
               </w:rPr>
-              <w:t>45</w:t>
+              <w:t>38</w:t>
             </w:r>
           </w:p>
         </w:tc>
@@ -4230,6 +3843,7 @@
         <w:rPr>
           <w:rFonts w:ascii="Times New Roman" w:hAnsi="Times New Roman"/>
           <w:b/>
+          <w:i w:val="0"/>
           <w:color w:val="000000"/>
           <w:sz w:val="30"/>
         </w:rPr>
@@ -6196,6 +5810,7 @@
         <w:rPr>
           <w:rFonts w:ascii="Times New Roman" w:hAnsi="Times New Roman"/>
           <w:b/>
+          <w:i w:val="0"/>
           <w:color w:val="000000"/>
           <w:sz w:val="30"/>
         </w:rPr>
@@ -6325,7 +5940,7 @@
                 <w:color w:val="000000"/>
                 <w:sz w:val="22"/>
               </w:rPr>
-              <w:t>Bảng P.1</w:t>
+              <w:t>Bảng 1.1</w:t>
             </w:r>
           </w:p>
         </w:tc>
@@ -6351,7 +5966,7 @@
                 <w:color w:val="000000"/>
                 <w:sz w:val="22"/>
               </w:rPr>
-              <w:t>Thông tin chung về đề tài đồ án Project 13</w:t>
+              <w:t>Thống kê phân bố số lượng ảnh trong tập dữ liệu (27,198 ảnh)</w:t>
             </w:r>
           </w:p>
         </w:tc>
@@ -6377,7 +5992,7 @@
                 <w:color w:val="000000"/>
                 <w:sz w:val="22"/>
               </w:rPr>
-              <w:t>1</w:t>
+              <w:t>14</w:t>
             </w:r>
           </w:p>
         </w:tc>
@@ -6405,7 +6020,7 @@
                 <w:color w:val="000000"/>
                 <w:sz w:val="22"/>
               </w:rPr>
-              <w:t>Bảng 1.1</w:t>
+              <w:t>Bảng 1.2</w:t>
             </w:r>
           </w:p>
         </w:tc>
@@ -6431,7 +6046,7 @@
                 <w:color w:val="000000"/>
                 <w:sz w:val="22"/>
               </w:rPr>
-              <w:t>Thống kê phân bố số lượng ảnh trong tập dữ liệu (27,198 ảnh)</w:t>
+              <w:t>Phân chia tập dữ liệu train/val/test theo phân tầng (70/15/15)</w:t>
             </w:r>
           </w:p>
         </w:tc>
@@ -6457,7 +6072,7 @@
                 <w:color w:val="000000"/>
                 <w:sz w:val="22"/>
               </w:rPr>
-              <w:t>12</w:t>
+              <w:t>15</w:t>
             </w:r>
           </w:p>
         </w:tc>
@@ -6485,7 +6100,7 @@
                 <w:color w:val="000000"/>
                 <w:sz w:val="22"/>
               </w:rPr>
-              <w:t>Bảng 1.2</w:t>
+              <w:t>Bảng 1.3</w:t>
             </w:r>
           </w:p>
         </w:tc>
@@ -6511,7 +6126,7 @@
                 <w:color w:val="000000"/>
                 <w:sz w:val="22"/>
               </w:rPr>
-              <w:t>Phân chia tập dữ liệu train/val/test theo phân tầng (70/15/15)</w:t>
+              <w:t>Các phép biến đổi hình học trong chuỗi tăng cường dữ liệu</w:t>
             </w:r>
           </w:p>
         </w:tc>
@@ -6537,7 +6152,7 @@
                 <w:color w:val="000000"/>
                 <w:sz w:val="22"/>
               </w:rPr>
-              <w:t>13</w:t>
+              <w:t>16</w:t>
             </w:r>
           </w:p>
         </w:tc>
@@ -6565,7 +6180,7 @@
                 <w:color w:val="000000"/>
                 <w:sz w:val="22"/>
               </w:rPr>
-              <w:t>Bảng 1.3</w:t>
+              <w:t>Bảng 2.1</w:t>
             </w:r>
           </w:p>
         </w:tc>
@@ -6591,7 +6206,7 @@
                 <w:color w:val="000000"/>
                 <w:sz w:val="22"/>
               </w:rPr>
-              <w:t>Các phép biến đổi hình học trong chuỗi tăng cường dữ liệu</w:t>
+              <w:t>Chi tiết các tầng mạng của mô hình Baseline CNN tự xây dựng</w:t>
             </w:r>
           </w:p>
         </w:tc>
@@ -6617,7 +6232,7 @@
                 <w:color w:val="000000"/>
                 <w:sz w:val="22"/>
               </w:rPr>
-              <w:t>14</w:t>
+              <w:t>17</w:t>
             </w:r>
           </w:p>
         </w:tc>
@@ -6645,7 +6260,7 @@
                 <w:color w:val="000000"/>
                 <w:sz w:val="22"/>
               </w:rPr>
-              <w:t>Bảng 2.1</w:t>
+              <w:t>Bảng 2.2</w:t>
             </w:r>
           </w:p>
         </w:tc>
@@ -6671,7 +6286,7 @@
                 <w:color w:val="000000"/>
                 <w:sz w:val="22"/>
               </w:rPr>
-              <w:t>Chi tiết các tầng mạng của mô hình Baseline CNN tự xây dựng</w:t>
+              <w:t>Tiến trình huấn luyện chi tiết qua 20 Epochs của mô hình Baseline CNN</w:t>
             </w:r>
           </w:p>
         </w:tc>
@@ -6697,7 +6312,7 @@
                 <w:color w:val="000000"/>
                 <w:sz w:val="22"/>
               </w:rPr>
-              <w:t>16</w:t>
+              <w:t>18</w:t>
             </w:r>
           </w:p>
         </w:tc>
@@ -6725,7 +6340,7 @@
                 <w:color w:val="000000"/>
                 <w:sz w:val="22"/>
               </w:rPr>
-              <w:t>Bảng 2.2</w:t>
+              <w:t>Bảng 3.1</w:t>
             </w:r>
           </w:p>
         </w:tc>
@@ -6751,7 +6366,7 @@
                 <w:color w:val="000000"/>
                 <w:sz w:val="22"/>
               </w:rPr>
-              <w:t>Tiến trình huấn luyện chi tiết qua 20 Epochs của mô hình Baseline CNN</w:t>
+              <w:t>Thông số so sánh cấu trúc mạng VGG16, ResNet50 và EfficientNetB0</w:t>
             </w:r>
           </w:p>
         </w:tc>
@@ -6777,7 +6392,7 @@
                 <w:color w:val="000000"/>
                 <w:sz w:val="22"/>
               </w:rPr>
-              <w:t>18</w:t>
+              <w:t>21</w:t>
             </w:r>
           </w:p>
         </w:tc>
@@ -6805,7 +6420,7 @@
                 <w:color w:val="000000"/>
                 <w:sz w:val="22"/>
               </w:rPr>
-              <w:t>Bảng 3.1</w:t>
+              <w:t>Bảng 3.2</w:t>
             </w:r>
           </w:p>
         </w:tc>
@@ -6831,7 +6446,7 @@
                 <w:color w:val="000000"/>
                 <w:sz w:val="22"/>
               </w:rPr>
-              <w:t>Thông số so sánh cấu trúc mạng VGG16, ResNet50 và EfficientNetB0</w:t>
+              <w:t>Kế hoạch đóng và mở băng các tầng (Freezing Schedule) khi huấn luyện</w:t>
             </w:r>
           </w:p>
         </w:tc>
@@ -6857,7 +6472,7 @@
                 <w:color w:val="000000"/>
                 <w:sz w:val="22"/>
               </w:rPr>
-              <w:t>21</w:t>
+              <w:t>22</w:t>
             </w:r>
           </w:p>
         </w:tc>
@@ -6885,7 +6500,7 @@
                 <w:color w:val="000000"/>
                 <w:sz w:val="22"/>
               </w:rPr>
-              <w:t>Bảng 3.2</w:t>
+              <w:t>Bảng 3.3</w:t>
             </w:r>
           </w:p>
         </w:tc>
@@ -6911,7 +6526,7 @@
                 <w:color w:val="000000"/>
                 <w:sz w:val="22"/>
               </w:rPr>
-              <w:t>Kế hoạch đóng và mở băng các tầng (Freezing Schedule) khi huấn luyện</w:t>
+              <w:t>Tiến trình huấn luyện tinh chỉnh của mô hình VGG16</w:t>
             </w:r>
           </w:p>
         </w:tc>
@@ -6965,7 +6580,7 @@
                 <w:color w:val="000000"/>
                 <w:sz w:val="22"/>
               </w:rPr>
-              <w:t>Bảng 3.3</w:t>
+              <w:t>Bảng 3.4</w:t>
             </w:r>
           </w:p>
         </w:tc>
@@ -6991,7 +6606,7 @@
                 <w:color w:val="000000"/>
                 <w:sz w:val="22"/>
               </w:rPr>
-              <w:t>Tiến trình huấn luyện tinh chỉnh của mô hình VGG16</w:t>
+              <w:t>Tiến trình huấn luyện tinh chỉnh của mô hình ResNet50</w:t>
             </w:r>
           </w:p>
         </w:tc>
@@ -7045,7 +6660,7 @@
                 <w:color w:val="000000"/>
                 <w:sz w:val="22"/>
               </w:rPr>
-              <w:t>Bảng 3.4</w:t>
+              <w:t>Bảng 3.5</w:t>
             </w:r>
           </w:p>
         </w:tc>
@@ -7071,7 +6686,7 @@
                 <w:color w:val="000000"/>
                 <w:sz w:val="22"/>
               </w:rPr>
-              <w:t>Tiến trình huấn luyện tinh chỉnh của mô hình ResNet50</w:t>
+              <w:t>Tiến trình huấn luyện tinh chỉnh của mô hình EfficientNetB0</w:t>
             </w:r>
           </w:p>
         </w:tc>
@@ -7097,7 +6712,7 @@
                 <w:color w:val="000000"/>
                 <w:sz w:val="22"/>
               </w:rPr>
-              <w:t>24</w:t>
+              <w:t>23</w:t>
             </w:r>
           </w:p>
         </w:tc>
@@ -7125,7 +6740,7 @@
                 <w:color w:val="000000"/>
                 <w:sz w:val="22"/>
               </w:rPr>
-              <w:t>Bảng 3.5</w:t>
+              <w:t>Bảng 4.1</w:t>
             </w:r>
           </w:p>
         </w:tc>
@@ -7151,7 +6766,7 @@
                 <w:color w:val="000000"/>
                 <w:sz w:val="22"/>
               </w:rPr>
-              <w:t>Tiến trình huấn luyện tinh chỉnh của mô hình EfficientNetB0</w:t>
+              <w:t>So sánh hiệu năng các mô hình trên tập kiểm thử độc lập (4,080 mẫu)</w:t>
             </w:r>
           </w:p>
         </w:tc>
@@ -7205,7 +6820,7 @@
                 <w:color w:val="000000"/>
                 <w:sz w:val="22"/>
               </w:rPr>
-              <w:t>Bảng 4.1</w:t>
+              <w:t>Bảng 4.2</w:t>
             </w:r>
           </w:p>
         </w:tc>
@@ -7231,7 +6846,7 @@
                 <w:color w:val="000000"/>
                 <w:sz w:val="22"/>
               </w:rPr>
-              <w:t>So sánh hiệu năng các mô hình trên tập kiểm thử độc lập (4,080 mẫu)</w:t>
+              <w:t>Ma trận nhầm lẫn chi tiết của 4 mô hình trên tập kiểm thử độc lập</w:t>
             </w:r>
           </w:p>
         </w:tc>
@@ -7257,7 +6872,7 @@
                 <w:color w:val="000000"/>
                 <w:sz w:val="22"/>
               </w:rPr>
-              <w:t>27</w:t>
+              <w:t>26</w:t>
             </w:r>
           </w:p>
         </w:tc>
@@ -7285,7 +6900,7 @@
                 <w:color w:val="000000"/>
                 <w:sz w:val="22"/>
               </w:rPr>
-              <w:t>Bảng 4.2</w:t>
+              <w:t>Bảng 5.1</w:t>
             </w:r>
           </w:p>
         </w:tc>
@@ -7311,7 +6926,7 @@
                 <w:color w:val="000000"/>
                 <w:sz w:val="22"/>
               </w:rPr>
-              <w:t>Ma trận nhầm lẫn chi tiết của 4 mô hình trên tập kiểm thử độc lập</w:t>
+              <w:t>Khảo sát số mẫu FN và FP theo các ngưỡng phân loại khác nhau</w:t>
             </w:r>
           </w:p>
         </w:tc>
@@ -7337,7 +6952,7 @@
                 <w:color w:val="000000"/>
                 <w:sz w:val="22"/>
               </w:rPr>
-              <w:t>28</w:t>
+              <w:t>29</w:t>
             </w:r>
           </w:p>
         </w:tc>
@@ -7365,7 +6980,7 @@
                 <w:color w:val="000000"/>
                 <w:sz w:val="22"/>
               </w:rPr>
-              <w:t>Bảng 5.1</w:t>
+              <w:t>Bảng 5.2</w:t>
             </w:r>
           </w:p>
         </w:tc>
@@ -7391,7 +7006,7 @@
                 <w:color w:val="000000"/>
                 <w:sz w:val="22"/>
               </w:rPr>
-              <w:t>Khảo sát số mẫu FN và FP theo các ngưỡng phân loại khác nhau</w:t>
+              <w:t>Thời gian suy luận và tốc độ khung hình (FPS) đo được trên GPU và CPU</w:t>
             </w:r>
           </w:p>
         </w:tc>
@@ -7417,7 +7032,7 @@
                 <w:color w:val="000000"/>
                 <w:sz w:val="22"/>
               </w:rPr>
-              <w:t>33</w:t>
+              <w:t>30</w:t>
             </w:r>
           </w:p>
         </w:tc>
@@ -7445,7 +7060,7 @@
                 <w:color w:val="000000"/>
                 <w:sz w:val="22"/>
               </w:rPr>
-              <w:t>Bảng 5.2</w:t>
+              <w:t>Bảng 6.1</w:t>
             </w:r>
           </w:p>
         </w:tc>
@@ -7471,7 +7086,7 @@
                 <w:color w:val="000000"/>
                 <w:sz w:val="22"/>
               </w:rPr>
-              <w:t>Thời gian suy luận và tốc độ khung hình (FPS) đo được trên GPU và CPU</w:t>
+              <w:t>Các phân hệ chính trong ứng dụng demo Streamlit và module camera</w:t>
             </w:r>
           </w:p>
         </w:tc>
@@ -7497,87 +7112,7 @@
                 <w:color w:val="000000"/>
                 <w:sz w:val="22"/>
               </w:rPr>
-              <w:t>34</w:t>
-            </w:r>
-          </w:p>
-        </w:tc>
-      </w:tr>
-      <w:tr>
-        <w:tc>
-          <w:tcPr>
-            <w:tcW w:type="dxa" w:w="2160"/>
-            <w:shd w:fill="FFFFFF"/>
-            <w:tcBorders>
-              <w:top w:val="single" w:sz="4" w:space="0" w:color="CCCCCC"/>
-              <w:bottom w:val="single" w:sz="4" w:space="0" w:color="CCCCCC"/>
-              <w:left w:val="single" w:sz="4" w:space="0" w:color="CCCCCC"/>
-              <w:right w:val="single" w:sz="4" w:space="0" w:color="CCCCCC"/>
-            </w:tcBorders>
-          </w:tcPr>
-          <w:p>
-            <w:pPr>
-              <w:spacing w:before="40" w:after="40"/>
-              <w:jc w:val="left"/>
-            </w:pPr>
-            <w:r>
-              <w:rPr>
-                <w:rFonts w:ascii="Times New Roman" w:hAnsi="Times New Roman"/>
-                <w:color w:val="000000"/>
-                <w:sz w:val="22"/>
-              </w:rPr>
-              <w:t>Bảng 6.1</w:t>
-            </w:r>
-          </w:p>
-        </w:tc>
-        <w:tc>
-          <w:tcPr>
-            <w:tcW w:type="dxa" w:w="6192"/>
-            <w:shd w:fill="FFFFFF"/>
-            <w:tcBorders>
-              <w:top w:val="single" w:sz="4" w:space="0" w:color="CCCCCC"/>
-              <w:bottom w:val="single" w:sz="4" w:space="0" w:color="CCCCCC"/>
-              <w:left w:val="single" w:sz="4" w:space="0" w:color="CCCCCC"/>
-              <w:right w:val="single" w:sz="4" w:space="0" w:color="CCCCCC"/>
-            </w:tcBorders>
-          </w:tcPr>
-          <w:p>
-            <w:pPr>
-              <w:spacing w:before="40" w:after="40"/>
-              <w:jc w:val="left"/>
-            </w:pPr>
-            <w:r>
-              <w:rPr>
-                <w:rFonts w:ascii="Times New Roman" w:hAnsi="Times New Roman"/>
-                <w:color w:val="000000"/>
-                <w:sz w:val="22"/>
-              </w:rPr>
-              <w:t>Các phân hệ chính trong ứng dụng demo Streamlit và module camera</w:t>
-            </w:r>
-          </w:p>
-        </w:tc>
-        <w:tc>
-          <w:tcPr>
-            <w:tcW w:type="dxa" w:w="1008"/>
-            <w:shd w:fill="FFFFFF"/>
-            <w:tcBorders>
-              <w:top w:val="single" w:sz="4" w:space="0" w:color="CCCCCC"/>
-              <w:bottom w:val="single" w:sz="4" w:space="0" w:color="CCCCCC"/>
-              <w:left w:val="single" w:sz="4" w:space="0" w:color="CCCCCC"/>
-              <w:right w:val="single" w:sz="4" w:space="0" w:color="CCCCCC"/>
-            </w:tcBorders>
-          </w:tcPr>
-          <w:p>
-            <w:pPr>
-              <w:spacing w:before="40" w:after="40"/>
-              <w:jc w:val="center"/>
-            </w:pPr>
-            <w:r>
-              <w:rPr>
-                <w:rFonts w:ascii="Times New Roman" w:hAnsi="Times New Roman"/>
-                <w:color w:val="000000"/>
-                <w:sz w:val="22"/>
-              </w:rPr>
-              <w:t>38</w:t>
+              <w:t>33</w:t>
             </w:r>
           </w:p>
         </w:tc>
@@ -7602,6 +7137,7 @@
         <w:rPr>
           <w:rFonts w:ascii="Times New Roman" w:hAnsi="Times New Roman"/>
           <w:b/>
+          <w:i w:val="0"/>
           <w:color w:val="000000"/>
           <w:sz w:val="30"/>
         </w:rPr>
@@ -7783,7 +7319,7 @@
                 <w:color w:val="000000"/>
                 <w:sz w:val="22"/>
               </w:rPr>
-              <w:t>13</w:t>
+              <w:t>15</w:t>
             </w:r>
           </w:p>
         </w:tc>
@@ -7943,7 +7479,7 @@
                 <w:color w:val="000000"/>
                 <w:sz w:val="22"/>
               </w:rPr>
-              <w:t>25</w:t>
+              <w:t>24</w:t>
             </w:r>
           </w:p>
         </w:tc>
@@ -8023,7 +7559,7 @@
                 <w:color w:val="000000"/>
                 <w:sz w:val="22"/>
               </w:rPr>
-              <w:t>29</w:t>
+              <w:t>27</w:t>
             </w:r>
           </w:p>
         </w:tc>
@@ -8103,7 +7639,7 @@
                 <w:color w:val="000000"/>
                 <w:sz w:val="22"/>
               </w:rPr>
-              <w:t>32</w:t>
+              <w:t>29</w:t>
             </w:r>
           </w:p>
         </w:tc>
@@ -8183,7 +7719,7 @@
                 <w:color w:val="000000"/>
                 <w:sz w:val="22"/>
               </w:rPr>
-              <w:t>35</w:t>
+              <w:t>31</w:t>
             </w:r>
           </w:p>
         </w:tc>
@@ -8208,6 +7744,7 @@
         <w:rPr>
           <w:rFonts w:ascii="Times New Roman" w:hAnsi="Times New Roman"/>
           <w:b/>
+          <w:i w:val="0"/>
           <w:color w:val="000000"/>
           <w:sz w:val="30"/>
         </w:rPr>
@@ -8363,6 +7900,7 @@
         <w:rPr>
           <w:rFonts w:ascii="Times New Roman" w:hAnsi="Times New Roman"/>
           <w:b/>
+          <w:i w:val="0"/>
           <w:color w:val="000000"/>
           <w:sz w:val="30"/>
         </w:rPr>
@@ -8378,6 +7916,7 @@
         <w:rPr>
           <w:rFonts w:ascii="Times New Roman" w:hAnsi="Times New Roman"/>
           <w:b/>
+          <w:i w:val="0"/>
           <w:color w:val="000000"/>
           <w:sz w:val="27"/>
         </w:rPr>
@@ -8468,6 +8007,7 @@
         <w:rPr>
           <w:rFonts w:ascii="Times New Roman" w:hAnsi="Times New Roman"/>
           <w:b/>
+          <w:i w:val="0"/>
           <w:color w:val="000000"/>
           <w:sz w:val="27"/>
         </w:rPr>
@@ -8558,6 +8098,7 @@
         <w:rPr>
           <w:rFonts w:ascii="Times New Roman" w:hAnsi="Times New Roman"/>
           <w:b/>
+          <w:i w:val="0"/>
           <w:color w:val="000000"/>
           <w:sz w:val="27"/>
         </w:rPr>
@@ -8618,6 +8159,7 @@
         <w:rPr>
           <w:rFonts w:ascii="Times New Roman" w:hAnsi="Times New Roman"/>
           <w:b/>
+          <w:i w:val="0"/>
           <w:color w:val="000000"/>
           <w:sz w:val="27"/>
         </w:rPr>
@@ -8678,6 +8220,7 @@
         <w:rPr>
           <w:rFonts w:ascii="Times New Roman" w:hAnsi="Times New Roman"/>
           <w:b/>
+          <w:i w:val="0"/>
           <w:color w:val="000000"/>
           <w:sz w:val="27"/>
         </w:rPr>
@@ -8803,6 +8346,7 @@
         <w:rPr>
           <w:rFonts w:ascii="Times New Roman" w:hAnsi="Times New Roman"/>
           <w:b/>
+          <w:i w:val="0"/>
           <w:color w:val="000000"/>
           <w:sz w:val="30"/>
         </w:rPr>
@@ -8818,6 +8362,7 @@
         <w:rPr>
           <w:rFonts w:ascii="Times New Roman" w:hAnsi="Times New Roman"/>
           <w:b/>
+          <w:i w:val="0"/>
           <w:color w:val="000000"/>
           <w:sz w:val="27"/>
         </w:rPr>
@@ -8893,6 +8438,7 @@
         <w:rPr>
           <w:rFonts w:ascii="Times New Roman" w:hAnsi="Times New Roman"/>
           <w:b/>
+          <w:i w:val="0"/>
           <w:color w:val="000000"/>
           <w:sz w:val="27"/>
         </w:rPr>
@@ -8923,6 +8469,7 @@
         <w:rPr>
           <w:rFonts w:ascii="Times New Roman" w:hAnsi="Times New Roman"/>
           <w:b/>
+          <w:i w:val="0"/>
           <w:color w:val="000000"/>
           <w:sz w:val="26"/>
         </w:rPr>
@@ -10091,6 +9638,7 @@
         <w:rPr>
           <w:rFonts w:ascii="Times New Roman" w:hAnsi="Times New Roman"/>
           <w:b/>
+          <w:i w:val="0"/>
           <w:color w:val="000000"/>
           <w:sz w:val="27"/>
         </w:rPr>
@@ -10136,6 +9684,7 @@
         <w:rPr>
           <w:rFonts w:ascii="Times New Roman" w:hAnsi="Times New Roman"/>
           <w:b/>
+          <w:i w:val="0"/>
           <w:color w:val="000000"/>
           <w:sz w:val="26"/>
         </w:rPr>
@@ -10841,6 +10390,7 @@
         <w:rPr>
           <w:rFonts w:ascii="Times New Roman" w:hAnsi="Times New Roman"/>
           <w:b/>
+          <w:i w:val="0"/>
           <w:color w:val="000000"/>
           <w:sz w:val="27"/>
         </w:rPr>
@@ -10871,6 +10421,7 @@
         <w:rPr>
           <w:rFonts w:ascii="Times New Roman" w:hAnsi="Times New Roman"/>
           <w:b/>
+          <w:i w:val="0"/>
           <w:color w:val="000000"/>
           <w:sz w:val="26"/>
         </w:rPr>
@@ -11492,6 +11043,7 @@
         <w:rPr>
           <w:rFonts w:ascii="Times New Roman" w:hAnsi="Times New Roman"/>
           <w:b/>
+          <w:i w:val="0"/>
           <w:color w:val="000000"/>
           <w:sz w:val="30"/>
         </w:rPr>
@@ -11507,6 +11059,7 @@
         <w:rPr>
           <w:rFonts w:ascii="Times New Roman" w:hAnsi="Times New Roman"/>
           <w:b/>
+          <w:i w:val="0"/>
           <w:color w:val="000000"/>
           <w:sz w:val="27"/>
         </w:rPr>
@@ -11612,6 +11165,7 @@
         <w:rPr>
           <w:rFonts w:ascii="Times New Roman" w:hAnsi="Times New Roman"/>
           <w:b/>
+          <w:i w:val="0"/>
           <w:color w:val="000000"/>
           <w:sz w:val="26"/>
         </w:rPr>
@@ -12608,6 +12162,7 @@
         <w:rPr>
           <w:rFonts w:ascii="Times New Roman" w:hAnsi="Times New Roman"/>
           <w:b/>
+          <w:i w:val="0"/>
           <w:color w:val="000000"/>
           <w:sz w:val="27"/>
         </w:rPr>
@@ -12706,6 +12261,7 @@
         <w:rPr>
           <w:rFonts w:ascii="Times New Roman" w:hAnsi="Times New Roman"/>
           <w:b/>
+          <w:i w:val="0"/>
           <w:color w:val="000000"/>
           <w:sz w:val="27"/>
         </w:rPr>
@@ -12736,6 +12292,7 @@
         <w:rPr>
           <w:rFonts w:ascii="Times New Roman" w:hAnsi="Times New Roman"/>
           <w:b/>
+          <w:i w:val="0"/>
           <w:color w:val="000000"/>
           <w:sz w:val="26"/>
         </w:rPr>
@@ -16714,6 +16271,7 @@
         <w:rPr>
           <w:rFonts w:ascii="Times New Roman" w:hAnsi="Times New Roman"/>
           <w:b/>
+          <w:i w:val="0"/>
           <w:color w:val="000000"/>
           <w:sz w:val="30"/>
         </w:rPr>
@@ -16729,6 +16287,7 @@
         <w:rPr>
           <w:rFonts w:ascii="Times New Roman" w:hAnsi="Times New Roman"/>
           <w:b/>
+          <w:i w:val="0"/>
           <w:color w:val="000000"/>
           <w:sz w:val="27"/>
         </w:rPr>
@@ -16819,6 +16378,7 @@
         <w:rPr>
           <w:rFonts w:ascii="Times New Roman" w:hAnsi="Times New Roman"/>
           <w:b/>
+          <w:i w:val="0"/>
           <w:color w:val="000000"/>
           <w:sz w:val="26"/>
         </w:rPr>
@@ -17498,6 +17058,7 @@
         <w:rPr>
           <w:rFonts w:ascii="Times New Roman" w:hAnsi="Times New Roman"/>
           <w:b/>
+          <w:i w:val="0"/>
           <w:color w:val="000000"/>
           <w:sz w:val="27"/>
         </w:rPr>
@@ -17558,6 +17119,7 @@
         <w:rPr>
           <w:rFonts w:ascii="Times New Roman" w:hAnsi="Times New Roman"/>
           <w:b/>
+          <w:i w:val="0"/>
           <w:color w:val="000000"/>
           <w:sz w:val="26"/>
         </w:rPr>
@@ -17999,6 +17561,7 @@
         <w:rPr>
           <w:rFonts w:ascii="Times New Roman" w:hAnsi="Times New Roman"/>
           <w:b/>
+          <w:i w:val="0"/>
           <w:color w:val="000000"/>
           <w:sz w:val="27"/>
         </w:rPr>
@@ -18029,6 +17592,7 @@
         <w:rPr>
           <w:rFonts w:ascii="Times New Roman" w:hAnsi="Times New Roman"/>
           <w:b/>
+          <w:i w:val="0"/>
           <w:color w:val="000000"/>
           <w:sz w:val="26"/>
         </w:rPr>
@@ -19814,6 +19378,7 @@
         <w:rPr>
           <w:rFonts w:ascii="Times New Roman" w:hAnsi="Times New Roman"/>
           <w:b/>
+          <w:i w:val="0"/>
           <w:color w:val="000000"/>
           <w:sz w:val="26"/>
         </w:rPr>
@@ -21599,6 +21164,7 @@
         <w:rPr>
           <w:rFonts w:ascii="Times New Roman" w:hAnsi="Times New Roman"/>
           <w:b/>
+          <w:i w:val="0"/>
           <w:color w:val="000000"/>
           <w:sz w:val="26"/>
         </w:rPr>
@@ -23444,6 +23010,7 @@
         <w:rPr>
           <w:rFonts w:ascii="Times New Roman" w:hAnsi="Times New Roman"/>
           <w:b/>
+          <w:i w:val="0"/>
           <w:color w:val="000000"/>
           <w:sz w:val="30"/>
         </w:rPr>
@@ -23459,6 +23026,7 @@
         <w:rPr>
           <w:rFonts w:ascii="Times New Roman" w:hAnsi="Times New Roman"/>
           <w:b/>
+          <w:i w:val="0"/>
           <w:color w:val="000000"/>
           <w:sz w:val="27"/>
         </w:rPr>
@@ -23625,6 +23193,7 @@
         <w:rPr>
           <w:rFonts w:ascii="Times New Roman" w:hAnsi="Times New Roman"/>
           <w:b/>
+          <w:i w:val="0"/>
           <w:color w:val="000000"/>
           <w:sz w:val="27"/>
         </w:rPr>
@@ -23655,6 +23224,7 @@
         <w:rPr>
           <w:rFonts w:ascii="Times New Roman" w:hAnsi="Times New Roman"/>
           <w:b/>
+          <w:i w:val="0"/>
           <w:color w:val="000000"/>
           <w:sz w:val="26"/>
         </w:rPr>
@@ -24888,6 +24458,7 @@
         <w:rPr>
           <w:rFonts w:ascii="Times New Roman" w:hAnsi="Times New Roman"/>
           <w:b/>
+          <w:i w:val="0"/>
           <w:color w:val="000000"/>
           <w:sz w:val="27"/>
         </w:rPr>
@@ -24918,6 +24489,7 @@
         <w:rPr>
           <w:rFonts w:ascii="Times New Roman" w:hAnsi="Times New Roman"/>
           <w:b/>
+          <w:i w:val="0"/>
           <w:color w:val="000000"/>
           <w:sz w:val="26"/>
         </w:rPr>
@@ -25860,6 +25432,7 @@
         <w:rPr>
           <w:rFonts w:ascii="Times New Roman" w:hAnsi="Times New Roman"/>
           <w:b/>
+          <w:i w:val="0"/>
           <w:color w:val="000000"/>
           <w:sz w:val="30"/>
         </w:rPr>
@@ -25875,6 +25448,7 @@
         <w:rPr>
           <w:rFonts w:ascii="Times New Roman" w:hAnsi="Times New Roman"/>
           <w:b/>
+          <w:i w:val="0"/>
           <w:color w:val="000000"/>
           <w:sz w:val="27"/>
         </w:rPr>
@@ -26011,6 +25585,7 @@
         <w:rPr>
           <w:rFonts w:ascii="Times New Roman" w:hAnsi="Times New Roman"/>
           <w:b/>
+          <w:i w:val="0"/>
           <w:color w:val="000000"/>
           <w:sz w:val="27"/>
         </w:rPr>
@@ -26134,6 +25709,7 @@
         <w:rPr>
           <w:rFonts w:ascii="Times New Roman" w:hAnsi="Times New Roman"/>
           <w:b/>
+          <w:i w:val="0"/>
           <w:color w:val="000000"/>
           <w:sz w:val="27"/>
         </w:rPr>
@@ -26164,6 +25740,7 @@
         <w:rPr>
           <w:rFonts w:ascii="Times New Roman" w:hAnsi="Times New Roman"/>
           <w:b/>
+          <w:i w:val="0"/>
           <w:color w:val="000000"/>
           <w:sz w:val="26"/>
         </w:rPr>
@@ -27282,6 +26859,7 @@
         <w:rPr>
           <w:rFonts w:ascii="Times New Roman" w:hAnsi="Times New Roman"/>
           <w:b/>
+          <w:i w:val="0"/>
           <w:color w:val="000000"/>
           <w:sz w:val="27"/>
         </w:rPr>
@@ -27312,6 +26890,7 @@
         <w:rPr>
           <w:rFonts w:ascii="Times New Roman" w:hAnsi="Times New Roman"/>
           <w:b/>
+          <w:i w:val="0"/>
           <w:color w:val="000000"/>
           <w:sz w:val="26"/>
         </w:rPr>
@@ -28369,6 +27948,7 @@
         <w:rPr>
           <w:rFonts w:ascii="Times New Roman" w:hAnsi="Times New Roman"/>
           <w:b/>
+          <w:i w:val="0"/>
           <w:color w:val="000000"/>
           <w:sz w:val="30"/>
         </w:rPr>
@@ -28384,6 +27964,7 @@
         <w:rPr>
           <w:rFonts w:ascii="Times New Roman" w:hAnsi="Times New Roman"/>
           <w:b/>
+          <w:i w:val="0"/>
           <w:color w:val="000000"/>
           <w:sz w:val="27"/>
         </w:rPr>
@@ -28474,6 +28055,7 @@
         <w:rPr>
           <w:rFonts w:ascii="Times New Roman" w:hAnsi="Times New Roman"/>
           <w:b/>
+          <w:i w:val="0"/>
           <w:color w:val="000000"/>
           <w:sz w:val="27"/>
         </w:rPr>
@@ -28564,6 +28146,7 @@
         <w:rPr>
           <w:rFonts w:ascii="Times New Roman" w:hAnsi="Times New Roman"/>
           <w:b/>
+          <w:i w:val="0"/>
           <w:color w:val="000000"/>
           <w:sz w:val="27"/>
         </w:rPr>
@@ -28684,6 +28267,7 @@
         <w:rPr>
           <w:rFonts w:ascii="Times New Roman" w:hAnsi="Times New Roman"/>
           <w:b/>
+          <w:i w:val="0"/>
           <w:color w:val="000000"/>
           <w:sz w:val="26"/>
         </w:rPr>
@@ -29257,6 +28841,7 @@
         <w:rPr>
           <w:rFonts w:ascii="Times New Roman" w:hAnsi="Times New Roman"/>
           <w:b/>
+          <w:i w:val="0"/>
           <w:color w:val="000000"/>
           <w:sz w:val="27"/>
         </w:rPr>
@@ -29337,6 +28922,7 @@
         <w:rPr>
           <w:rFonts w:ascii="Times New Roman" w:hAnsi="Times New Roman"/>
           <w:b/>
+          <w:i w:val="0"/>
           <w:color w:val="000000"/>
           <w:sz w:val="30"/>
         </w:rPr>
@@ -29352,6 +28938,7 @@
         <w:rPr>
           <w:rFonts w:ascii="Times New Roman" w:hAnsi="Times New Roman"/>
           <w:b/>
+          <w:i w:val="0"/>
           <w:color w:val="000000"/>
           <w:sz w:val="27"/>
         </w:rPr>
@@ -29457,6 +29044,7 @@
         <w:rPr>
           <w:rFonts w:ascii="Times New Roman" w:hAnsi="Times New Roman"/>
           <w:b/>
+          <w:i w:val="0"/>
           <w:color w:val="000000"/>
           <w:sz w:val="27"/>
         </w:rPr>
@@ -29532,6 +29120,7 @@
         <w:rPr>
           <w:rFonts w:ascii="Times New Roman" w:hAnsi="Times New Roman"/>
           <w:b/>
+          <w:i w:val="0"/>
           <w:color w:val="000000"/>
           <w:sz w:val="27"/>
         </w:rPr>
@@ -29607,6 +29196,7 @@
         <w:rPr>
           <w:rFonts w:ascii="Times New Roman" w:hAnsi="Times New Roman"/>
           <w:b/>
+          <w:i w:val="0"/>
           <w:color w:val="000000"/>
           <w:sz w:val="27"/>
         </w:rPr>
@@ -29672,6 +29262,7 @@
         <w:rPr>
           <w:rFonts w:ascii="Times New Roman" w:hAnsi="Times New Roman"/>
           <w:b/>
+          <w:i w:val="0"/>
           <w:color w:val="000000"/>
           <w:sz w:val="30"/>
         </w:rPr>
@@ -29796,6 +29387,7 @@
         <w:rPr>
           <w:rFonts w:ascii="Times New Roman" w:hAnsi="Times New Roman"/>
           <w:b/>
+          <w:i w:val="0"/>
           <w:color w:val="000000"/>
           <w:sz w:val="30"/>
         </w:rPr>
@@ -29811,6 +29403,7 @@
         <w:rPr>
           <w:rFonts w:ascii="Times New Roman" w:hAnsi="Times New Roman"/>
           <w:b/>
+          <w:i w:val="0"/>
           <w:color w:val="000000"/>
           <w:sz w:val="27"/>
         </w:rPr>
@@ -29916,6 +29509,7 @@
         <w:rPr>
           <w:rFonts w:ascii="Times New Roman" w:hAnsi="Times New Roman"/>
           <w:b/>
+          <w:i w:val="0"/>
           <w:color w:val="000000"/>
           <w:sz w:val="27"/>
         </w:rPr>

</xml_diff>

<commit_message>
docs: remove sub-cover page, start Section 1 at acknowledgements with header Project 13 and page 1 footer
</commit_message>
<xml_diff>
--- a/report/BaoCao_Project13_LeThanhDuoc_SIC2026.docx
+++ b/report/BaoCao_Project13_LeThanhDuoc_SIC2026.docx
@@ -306,506 +306,6 @@
           <w:pgNumType w:start="0"/>
         </w:sectPr>
       </w:pPr>
-    </w:p>
-    <w:p>
-      <w:pPr>
-        <w:spacing w:before="100" w:after="40"/>
-        <w:jc w:val="center"/>
-      </w:pPr>
-      <w:r>
-        <w:rPr>
-          <w:rFonts w:ascii="Times New Roman" w:hAnsi="Times New Roman"/>
-          <w:b/>
-          <w:i w:val="0"/>
-          <w:color w:val="000000"/>
-          <w:sz w:val="24"/>
-        </w:rPr>
-        <w:t>CHƯƠNG TRÌNH ĐÀO TẠO CÔNG NGHỆ SAMSUNG INNOVATION CAMPUS (SIC 2026)</w:t>
-      </w:r>
-    </w:p>
-    <w:p>
-      <w:pPr>
-        <w:spacing w:before="0" w:after="280"/>
-        <w:jc w:val="center"/>
-      </w:pPr>
-      <w:r>
-        <w:rPr>
-          <w:rFonts w:ascii="Times New Roman" w:hAnsi="Times New Roman"/>
-          <w:b/>
-          <w:i w:val="0"/>
-          <w:color w:val="000000"/>
-          <w:sz w:val="22"/>
-        </w:rPr>
-        <w:t>HỌC PHẦN: TRÍ TUỆ NHÂN TẠO &amp; HỌC SÂU (AI &amp; DEEP LEARNING)</w:t>
-      </w:r>
-    </w:p>
-    <w:p>
-      <w:pPr>
-        <w:spacing w:before="0" w:after="120"/>
-        <w:jc w:val="center"/>
-      </w:pPr>
-      <w:r>
-        <w:rPr>
-          <w:rFonts w:ascii="Times New Roman" w:hAnsi="Times New Roman"/>
-          <w:b/>
-          <w:i w:val="0"/>
-          <w:color w:val="000000"/>
-          <w:sz w:val="27"/>
-        </w:rPr>
-        <w:t>TRANG PHỤ BÌA — HỒ SƠ ĐỒ ÁN TIỂU LUẬN</w:t>
-      </w:r>
-    </w:p>
-    <w:p>
-      <w:pPr>
-        <w:spacing w:before="0" w:after="400"/>
-        <w:jc w:val="center"/>
-      </w:pPr>
-      <w:r>
-        <w:rPr>
-          <w:rFonts w:ascii="Times New Roman" w:hAnsi="Times New Roman"/>
-          <w:b/>
-          <w:i w:val="0"/>
-          <w:color w:val="000000"/>
-          <w:sz w:val="28"/>
-        </w:rPr>
-        <w:t>HỆ THỐNG PHÂN LOẠI CHẤT LƯỢNG NÔNG SẢN BẰNG THỊ GIÁC MÁY TÍNH</w:t>
-        <w:br/>
-        <w:t>(PROJECT 13: FRUIT VISUAL QUALITY CONTROL)</w:t>
-      </w:r>
-    </w:p>
-    <w:p>
-      <w:pPr>
-        <w:spacing w:before="280" w:after="100"/>
-        <w:jc w:val="left"/>
-      </w:pPr>
-      <w:r>
-        <w:rPr>
-          <w:rFonts w:ascii="Times New Roman" w:hAnsi="Times New Roman"/>
-          <w:b/>
-          <w:color w:val="000000"/>
-          <w:sz w:val="24"/>
-        </w:rPr>
-        <w:t>I. THÔNG TIN HỌC THUẬT VÀ NHÂN SỰ</w:t>
-      </w:r>
-    </w:p>
-    <w:p>
-      <w:pPr>
-        <w:spacing w:before="0" w:after="90" w:line="300" w:lineRule="auto"/>
-        <w:ind w:left="288"/>
-        <w:jc w:val="both"/>
-      </w:pPr>
-      <w:r>
-        <w:rPr>
-          <w:rFonts w:ascii="Times New Roman" w:hAnsi="Times New Roman"/>
-          <w:color w:val="444444"/>
-          <w:sz w:val="18"/>
-        </w:rPr>
-        <w:t xml:space="preserve">▪  </w:t>
-      </w:r>
-      <w:r>
-        <w:rPr>
-          <w:rFonts w:ascii="Times New Roman" w:hAnsi="Times New Roman"/>
-          <w:b/>
-          <w:color w:val="000000"/>
-          <w:sz w:val="22"/>
-        </w:rPr>
-        <w:t xml:space="preserve">Đơn vị đào tạo: </w:t>
-      </w:r>
-      <w:r>
-        <w:rPr>
-          <w:rFonts w:ascii="Times New Roman" w:hAnsi="Times New Roman"/>
-          <w:color w:val="111111"/>
-          <w:sz w:val="22"/>
-        </w:rPr>
-        <w:t>Chương trình Samsung Innovation Campus 2026 (SIC 2026)</w:t>
-      </w:r>
-    </w:p>
-    <w:p>
-      <w:pPr>
-        <w:spacing w:before="0" w:after="90" w:line="300" w:lineRule="auto"/>
-        <w:ind w:left="288"/>
-        <w:jc w:val="both"/>
-      </w:pPr>
-      <w:r>
-        <w:rPr>
-          <w:rFonts w:ascii="Times New Roman" w:hAnsi="Times New Roman"/>
-          <w:color w:val="444444"/>
-          <w:sz w:val="18"/>
-        </w:rPr>
-        <w:t xml:space="preserve">▪  </w:t>
-      </w:r>
-      <w:r>
-        <w:rPr>
-          <w:rFonts w:ascii="Times New Roman" w:hAnsi="Times New Roman"/>
-          <w:b/>
-          <w:color w:val="000000"/>
-          <w:sz w:val="22"/>
-        </w:rPr>
-        <w:t xml:space="preserve">Tên học phần: </w:t>
-      </w:r>
-      <w:r>
-        <w:rPr>
-          <w:rFonts w:ascii="Times New Roman" w:hAnsi="Times New Roman"/>
-          <w:color w:val="111111"/>
-          <w:sz w:val="22"/>
-        </w:rPr>
-        <w:t>Trí Tuệ Nhân Tạo &amp; Học Sâu (AI &amp; Deep Learning)</w:t>
-      </w:r>
-    </w:p>
-    <w:p>
-      <w:pPr>
-        <w:spacing w:before="0" w:after="90" w:line="300" w:lineRule="auto"/>
-        <w:ind w:left="288"/>
-        <w:jc w:val="both"/>
-      </w:pPr>
-      <w:r>
-        <w:rPr>
-          <w:rFonts w:ascii="Times New Roman" w:hAnsi="Times New Roman"/>
-          <w:color w:val="444444"/>
-          <w:sz w:val="18"/>
-        </w:rPr>
-        <w:t xml:space="preserve">▪  </w:t>
-      </w:r>
-      <w:r>
-        <w:rPr>
-          <w:rFonts w:ascii="Times New Roman" w:hAnsi="Times New Roman"/>
-          <w:b/>
-          <w:color w:val="000000"/>
-          <w:sz w:val="22"/>
-        </w:rPr>
-        <w:t xml:space="preserve">Giảng viên hướng dẫn: </w:t>
-      </w:r>
-      <w:r>
-        <w:rPr>
-          <w:rFonts w:ascii="Times New Roman" w:hAnsi="Times New Roman"/>
-          <w:color w:val="111111"/>
-          <w:sz w:val="22"/>
-        </w:rPr>
-        <w:t>Thầy Trần Mạnh Tường</w:t>
-      </w:r>
-    </w:p>
-    <w:p>
-      <w:pPr>
-        <w:spacing w:before="0" w:after="90" w:line="300" w:lineRule="auto"/>
-        <w:ind w:left="288"/>
-        <w:jc w:val="both"/>
-      </w:pPr>
-      <w:r>
-        <w:rPr>
-          <w:rFonts w:ascii="Times New Roman" w:hAnsi="Times New Roman"/>
-          <w:color w:val="444444"/>
-          <w:sz w:val="18"/>
-        </w:rPr>
-        <w:t xml:space="preserve">▪  </w:t>
-      </w:r>
-      <w:r>
-        <w:rPr>
-          <w:rFonts w:ascii="Times New Roman" w:hAnsi="Times New Roman"/>
-          <w:b/>
-          <w:color w:val="000000"/>
-          <w:sz w:val="22"/>
-        </w:rPr>
-        <w:t xml:space="preserve">Học viên thực hiện: </w:t>
-      </w:r>
-      <w:r>
-        <w:rPr>
-          <w:rFonts w:ascii="Times New Roman" w:hAnsi="Times New Roman"/>
-          <w:color w:val="111111"/>
-          <w:sz w:val="22"/>
-        </w:rPr>
-        <w:t>Lê Thành Được (Lớp học phần: AI1)</w:t>
-      </w:r>
-    </w:p>
-    <w:p>
-      <w:pPr>
-        <w:spacing w:before="0" w:after="90" w:line="300" w:lineRule="auto"/>
-        <w:ind w:left="288"/>
-        <w:jc w:val="both"/>
-      </w:pPr>
-      <w:r>
-        <w:rPr>
-          <w:rFonts w:ascii="Times New Roman" w:hAnsi="Times New Roman"/>
-          <w:color w:val="444444"/>
-          <w:sz w:val="18"/>
-        </w:rPr>
-        <w:t xml:space="preserve">▪  </w:t>
-      </w:r>
-      <w:r>
-        <w:rPr>
-          <w:rFonts w:ascii="Times New Roman" w:hAnsi="Times New Roman"/>
-          <w:b/>
-          <w:color w:val="000000"/>
-          <w:sz w:val="22"/>
-        </w:rPr>
-        <w:t xml:space="preserve">Thông tin liên hệ: </w:t>
-      </w:r>
-      <w:r>
-        <w:rPr>
-          <w:rFonts w:ascii="Times New Roman" w:hAnsi="Times New Roman"/>
-          <w:color w:val="111111"/>
-          <w:sz w:val="22"/>
-        </w:rPr>
-        <w:t>Email: 2000.leduoc@gmail.com | SĐT: 0379.885.508</w:t>
-      </w:r>
-    </w:p>
-    <w:p>
-      <w:pPr>
-        <w:spacing w:before="360" w:after="100"/>
-        <w:jc w:val="left"/>
-      </w:pPr>
-      <w:r>
-        <w:rPr>
-          <w:rFonts w:ascii="Times New Roman" w:hAnsi="Times New Roman"/>
-          <w:b/>
-          <w:color w:val="000000"/>
-          <w:sz w:val="24"/>
-        </w:rPr>
-        <w:t>II. THÔNG SỐ VÀ CẤU HÌNH KỸ THUẬT CỐT LÕI</w:t>
-      </w:r>
-    </w:p>
-    <w:p>
-      <w:pPr>
-        <w:spacing w:before="0" w:after="90" w:line="300" w:lineRule="auto"/>
-        <w:ind w:left="288"/>
-        <w:jc w:val="both"/>
-      </w:pPr>
-      <w:r>
-        <w:rPr>
-          <w:rFonts w:ascii="Times New Roman" w:hAnsi="Times New Roman"/>
-          <w:color w:val="444444"/>
-          <w:sz w:val="18"/>
-        </w:rPr>
-        <w:t xml:space="preserve">▪  </w:t>
-      </w:r>
-      <w:r>
-        <w:rPr>
-          <w:rFonts w:ascii="Times New Roman" w:hAnsi="Times New Roman"/>
-          <w:b/>
-          <w:color w:val="000000"/>
-          <w:sz w:val="22"/>
-        </w:rPr>
-        <w:t xml:space="preserve">Mã đề tài &amp; Dự án: </w:t>
-      </w:r>
-      <w:r>
-        <w:rPr>
-          <w:rFonts w:ascii="Times New Roman" w:hAnsi="Times New Roman"/>
-          <w:color w:val="111111"/>
-          <w:sz w:val="22"/>
-        </w:rPr>
-        <w:t>Project 13: Fruit Visual Quality Control</w:t>
-      </w:r>
-    </w:p>
-    <w:p>
-      <w:pPr>
-        <w:spacing w:before="0" w:after="90" w:line="300" w:lineRule="auto"/>
-        <w:ind w:left="288"/>
-        <w:jc w:val="both"/>
-      </w:pPr>
-      <w:r>
-        <w:rPr>
-          <w:rFonts w:ascii="Times New Roman" w:hAnsi="Times New Roman"/>
-          <w:color w:val="444444"/>
-          <w:sz w:val="18"/>
-        </w:rPr>
-        <w:t xml:space="preserve">▪  </w:t>
-      </w:r>
-      <w:r>
-        <w:rPr>
-          <w:rFonts w:ascii="Times New Roman" w:hAnsi="Times New Roman"/>
-          <w:b/>
-          <w:color w:val="000000"/>
-          <w:sz w:val="22"/>
-        </w:rPr>
-        <w:t xml:space="preserve">Tập dữ liệu nghiên cứu: </w:t>
-      </w:r>
-      <w:r>
-        <w:rPr>
-          <w:rFonts w:ascii="Times New Roman" w:hAnsi="Times New Roman"/>
-          <w:color w:val="111111"/>
-          <w:sz w:val="22"/>
-        </w:rPr>
-        <w:t>27,198 ảnh RGB chia phân tầng 70/15/15 (SEED = 42)</w:t>
-      </w:r>
-    </w:p>
-    <w:p>
-      <w:pPr>
-        <w:spacing w:before="0" w:after="90" w:line="300" w:lineRule="auto"/>
-        <w:ind w:left="288"/>
-        <w:jc w:val="both"/>
-      </w:pPr>
-      <w:r>
-        <w:rPr>
-          <w:rFonts w:ascii="Times New Roman" w:hAnsi="Times New Roman"/>
-          <w:color w:val="444444"/>
-          <w:sz w:val="18"/>
-        </w:rPr>
-        <w:t xml:space="preserve">▪  </w:t>
-      </w:r>
-      <w:r>
-        <w:rPr>
-          <w:rFonts w:ascii="Times New Roman" w:hAnsi="Times New Roman"/>
-          <w:b/>
-          <w:color w:val="000000"/>
-          <w:sz w:val="22"/>
-        </w:rPr>
-        <w:t xml:space="preserve">Các mô hình nghiên cứu: </w:t>
-      </w:r>
-      <w:r>
-        <w:rPr>
-          <w:rFonts w:ascii="Times New Roman" w:hAnsi="Times New Roman"/>
-          <w:color w:val="111111"/>
-          <w:sz w:val="22"/>
-        </w:rPr>
-        <w:t>Baseline CNN, VGG16, ResNet50, EfficientNetB0</w:t>
-      </w:r>
-    </w:p>
-    <w:p>
-      <w:pPr>
-        <w:spacing w:before="0" w:after="90" w:line="300" w:lineRule="auto"/>
-        <w:ind w:left="288"/>
-        <w:jc w:val="both"/>
-      </w:pPr>
-      <w:r>
-        <w:rPr>
-          <w:rFonts w:ascii="Times New Roman" w:hAnsi="Times New Roman"/>
-          <w:color w:val="444444"/>
-          <w:sz w:val="18"/>
-        </w:rPr>
-        <w:t xml:space="preserve">▪  </w:t>
-      </w:r>
-      <w:r>
-        <w:rPr>
-          <w:rFonts w:ascii="Times New Roman" w:hAnsi="Times New Roman"/>
-          <w:b/>
-          <w:color w:val="000000"/>
-          <w:sz w:val="22"/>
-        </w:rPr>
-        <w:t xml:space="preserve">Phương pháp giải thích AI: </w:t>
-      </w:r>
-      <w:r>
-        <w:rPr>
-          <w:rFonts w:ascii="Times New Roman" w:hAnsi="Times New Roman"/>
-          <w:color w:val="111111"/>
-          <w:sz w:val="22"/>
-        </w:rPr>
-        <w:t>Linear Logit Grad-CAM kết hợp trộn mặt nạ thích nghi Alpha</w:t>
-      </w:r>
-    </w:p>
-    <w:p>
-      <w:pPr>
-        <w:spacing w:before="0" w:after="90" w:line="300" w:lineRule="auto"/>
-        <w:ind w:left="288"/>
-        <w:jc w:val="both"/>
-      </w:pPr>
-      <w:r>
-        <w:rPr>
-          <w:rFonts w:ascii="Times New Roman" w:hAnsi="Times New Roman"/>
-          <w:color w:val="444444"/>
-          <w:sz w:val="18"/>
-        </w:rPr>
-        <w:t xml:space="preserve">▪  </w:t>
-      </w:r>
-      <w:r>
-        <w:rPr>
-          <w:rFonts w:ascii="Times New Roman" w:hAnsi="Times New Roman"/>
-          <w:b/>
-          <w:color w:val="000000"/>
-          <w:sz w:val="22"/>
-        </w:rPr>
-        <w:t xml:space="preserve">Ứng dụng thử nghiệm: </w:t>
-      </w:r>
-      <w:r>
-        <w:rPr>
-          <w:rFonts w:ascii="Times New Roman" w:hAnsi="Times New Roman"/>
-          <w:color w:val="111111"/>
-          <w:sz w:val="22"/>
-        </w:rPr>
-        <w:t>Giao diện Web Streamlit kết nối camera thời gian thực (DroidCam)</w:t>
-      </w:r>
-    </w:p>
-    <w:p>
-      <w:pPr>
-        <w:spacing w:before="360" w:after="100"/>
-        <w:jc w:val="left"/>
-      </w:pPr>
-      <w:r>
-        <w:rPr>
-          <w:rFonts w:ascii="Times New Roman" w:hAnsi="Times New Roman"/>
-          <w:b/>
-          <w:color w:val="000000"/>
-          <w:sz w:val="24"/>
-        </w:rPr>
-        <w:t>III. THỜI GIAN VÀ ĐỊA ĐIỂM NGHIỆM THU</w:t>
-      </w:r>
-    </w:p>
-    <w:p>
-      <w:pPr>
-        <w:spacing w:before="0" w:after="90" w:line="300" w:lineRule="auto"/>
-        <w:ind w:left="288"/>
-        <w:jc w:val="both"/>
-      </w:pPr>
-      <w:r>
-        <w:rPr>
-          <w:rFonts w:ascii="Times New Roman" w:hAnsi="Times New Roman"/>
-          <w:color w:val="444444"/>
-          <w:sz w:val="18"/>
-        </w:rPr>
-        <w:t xml:space="preserve">▪  </w:t>
-      </w:r>
-      <w:r>
-        <w:rPr>
-          <w:rFonts w:ascii="Times New Roman" w:hAnsi="Times New Roman"/>
-          <w:b/>
-          <w:color w:val="000000"/>
-          <w:sz w:val="22"/>
-        </w:rPr>
-        <w:t xml:space="preserve">Thời gian thực hiện: </w:t>
-      </w:r>
-      <w:r>
-        <w:rPr>
-          <w:rFonts w:ascii="Times New Roman" w:hAnsi="Times New Roman"/>
-          <w:color w:val="111111"/>
-          <w:sz w:val="22"/>
-        </w:rPr>
-        <w:t>Khóa đào tạo SIC 2026 (Nghiệm thu tháng 10 năm 2026)</w:t>
-      </w:r>
-    </w:p>
-    <w:p>
-      <w:pPr>
-        <w:spacing w:before="0" w:after="90" w:line="300" w:lineRule="auto"/>
-        <w:ind w:left="288"/>
-        <w:jc w:val="both"/>
-      </w:pPr>
-      <w:r>
-        <w:rPr>
-          <w:rFonts w:ascii="Times New Roman" w:hAnsi="Times New Roman"/>
-          <w:color w:val="444444"/>
-          <w:sz w:val="18"/>
-        </w:rPr>
-        <w:t xml:space="preserve">▪  </w:t>
-      </w:r>
-      <w:r>
-        <w:rPr>
-          <w:rFonts w:ascii="Times New Roman" w:hAnsi="Times New Roman"/>
-          <w:b/>
-          <w:color w:val="000000"/>
-          <w:sz w:val="22"/>
-        </w:rPr>
-        <w:t xml:space="preserve">Địa điểm hoàn thành: </w:t>
-      </w:r>
-      <w:r>
-        <w:rPr>
-          <w:rFonts w:ascii="Times New Roman" w:hAnsi="Times New Roman"/>
-          <w:color w:val="111111"/>
-          <w:sz w:val="22"/>
-        </w:rPr>
-        <w:t>Thành phố Hồ Chí Minh</w:t>
-      </w:r>
-    </w:p>
-    <w:p>
-      <w:r>
-        <w:br w:type="page"/>
-      </w:r>
     </w:p>
     <w:p>
       <w:pPr>
@@ -1200,7 +700,7 @@
                 <w:color w:val="000000"/>
                 <w:sz w:val="22"/>
               </w:rPr>
-              <w:t>TRANG PHỤ BÌA — HỒ SƠ ĐỒ ÁN TIỂU LUẬN</w:t>
+              <w:t>LỜI CẢM ƠN</w:t>
             </w:r>
           </w:p>
         </w:tc>
@@ -1254,7 +754,7 @@
                 <w:color w:val="000000"/>
                 <w:sz w:val="22"/>
               </w:rPr>
-              <w:t>LỜI CẢM ƠN</w:t>
+              <w:t>LỜI CAM ĐOAN</w:t>
             </w:r>
           </w:p>
         </w:tc>
@@ -1308,7 +808,7 @@
                 <w:color w:val="000000"/>
                 <w:sz w:val="22"/>
               </w:rPr>
-              <w:t>LỜI CAM ĐOAN</w:t>
+              <w:t>DANH MỤC CÁC CHỮ VIẾT TẮT</w:t>
             </w:r>
           </w:p>
         </w:tc>
@@ -1334,7 +834,7 @@
                 <w:color w:val="000000"/>
                 <w:sz w:val="22"/>
               </w:rPr>
-              <w:t>3</w:t>
+              <w:t>6</w:t>
             </w:r>
           </w:p>
         </w:tc>
@@ -1362,7 +862,7 @@
                 <w:color w:val="000000"/>
                 <w:sz w:val="22"/>
               </w:rPr>
-              <w:t>DANH MỤC CÁC CHỮ VIẾT TẮT</w:t>
+              <w:t>DANH MỤC CÁC BẢNG BIỂU</w:t>
             </w:r>
           </w:p>
         </w:tc>
@@ -1388,7 +888,7 @@
                 <w:color w:val="000000"/>
                 <w:sz w:val="22"/>
               </w:rPr>
-              <w:t>7</w:t>
+              <w:t>8</w:t>
             </w:r>
           </w:p>
         </w:tc>
@@ -1416,7 +916,7 @@
                 <w:color w:val="000000"/>
                 <w:sz w:val="22"/>
               </w:rPr>
-              <w:t>DANH MỤC CÁC BẢNG BIỂU</w:t>
+              <w:t>DANH MỤC CÁC HÌNH VẼ</w:t>
             </w:r>
           </w:p>
         </w:tc>
@@ -1470,7 +970,7 @@
                 <w:color w:val="000000"/>
                 <w:sz w:val="22"/>
               </w:rPr>
-              <w:t>DANH MỤC CÁC HÌNH VẼ</w:t>
+              <w:t>TÓM TẮT TIỂU LUẬN</w:t>
             </w:r>
           </w:p>
         </w:tc>
@@ -1524,7 +1024,7 @@
                 <w:color w:val="000000"/>
                 <w:sz w:val="22"/>
               </w:rPr>
-              <w:t>TÓM TẮT TIỂU LUẬN</w:t>
+              <w:t>PHẦN MỞ ĐẦU</w:t>
             </w:r>
           </w:p>
         </w:tc>
@@ -1578,7 +1078,7 @@
                 <w:color w:val="000000"/>
                 <w:sz w:val="22"/>
               </w:rPr>
-              <w:t>PHẦN MỞ ĐẦU</w:t>
+              <w:t xml:space="preserve">   1. Lý do chọn đề tài</w:t>
             </w:r>
           </w:p>
         </w:tc>
@@ -1604,7 +1104,7 @@
                 <w:color w:val="000000"/>
                 <w:sz w:val="22"/>
               </w:rPr>
-              <w:t>12</w:t>
+              <w:t>11</w:t>
             </w:r>
           </w:p>
         </w:tc>
@@ -1632,7 +1132,7 @@
                 <w:color w:val="000000"/>
                 <w:sz w:val="22"/>
               </w:rPr>
-              <w:t xml:space="preserve">   1. Lý do chọn đề tài</w:t>
+              <w:t xml:space="preserve">   2. Mục tiêu nghiên cứu của đồ án</w:t>
             </w:r>
           </w:p>
         </w:tc>
@@ -1658,7 +1158,7 @@
                 <w:color w:val="000000"/>
                 <w:sz w:val="22"/>
               </w:rPr>
-              <w:t>12</w:t>
+              <w:t>11</w:t>
             </w:r>
           </w:p>
         </w:tc>
@@ -1686,7 +1186,7 @@
                 <w:color w:val="000000"/>
                 <w:sz w:val="22"/>
               </w:rPr>
-              <w:t xml:space="preserve">   2. Mục tiêu nghiên cứu của đồ án</w:t>
+              <w:t xml:space="preserve">   3. Đối tượng và phạm vi nghiên cứu</w:t>
             </w:r>
           </w:p>
         </w:tc>
@@ -1740,7 +1240,7 @@
                 <w:color w:val="000000"/>
                 <w:sz w:val="22"/>
               </w:rPr>
-              <w:t xml:space="preserve">   3. Đối tượng và phạm vi nghiên cứu</w:t>
+              <w:t xml:space="preserve">   4. Phương pháp nghiên cứu</w:t>
             </w:r>
           </w:p>
         </w:tc>
@@ -1766,7 +1266,7 @@
                 <w:color w:val="000000"/>
                 <w:sz w:val="22"/>
               </w:rPr>
-              <w:t>13</w:t>
+              <w:t>12</w:t>
             </w:r>
           </w:p>
         </w:tc>
@@ -1794,7 +1294,7 @@
                 <w:color w:val="000000"/>
                 <w:sz w:val="22"/>
               </w:rPr>
-              <w:t xml:space="preserve">   4. Phương pháp nghiên cứu</w:t>
+              <w:t xml:space="preserve">   5. Bố cục của bài tiểu luận</w:t>
             </w:r>
           </w:p>
         </w:tc>
@@ -1820,7 +1320,7 @@
                 <w:color w:val="000000"/>
                 <w:sz w:val="22"/>
               </w:rPr>
-              <w:t>13</w:t>
+              <w:t>12</w:t>
             </w:r>
           </w:p>
         </w:tc>
@@ -1848,7 +1348,7 @@
                 <w:color w:val="000000"/>
                 <w:sz w:val="22"/>
               </w:rPr>
-              <w:t xml:space="preserve">   5. Bố cục của bài tiểu luận</w:t>
+              <w:t>CHƯƠNG 1: TẬP DỮ LIỆU VÀ ĐƯỜNG ỐNG TIỀN XỬ LÝ</w:t>
             </w:r>
           </w:p>
         </w:tc>
@@ -1902,7 +1402,7 @@
                 <w:color w:val="000000"/>
                 <w:sz w:val="22"/>
               </w:rPr>
-              <w:t>CHƯƠNG 1: TẬP DỮ LIỆU VÀ ĐƯỜNG ỐNG TIỀN XỬ LÝ</w:t>
+              <w:t xml:space="preserve">   1.1. Giới thiệu tập dữ liệu nông sản</w:t>
             </w:r>
           </w:p>
         </w:tc>
@@ -1928,7 +1428,7 @@
                 <w:color w:val="000000"/>
                 <w:sz w:val="22"/>
               </w:rPr>
-              <w:t>14</w:t>
+              <w:t>13</w:t>
             </w:r>
           </w:p>
         </w:tc>
@@ -1956,7 +1456,7 @@
                 <w:color w:val="000000"/>
                 <w:sz w:val="22"/>
               </w:rPr>
-              <w:t xml:space="preserve">   1.1. Giới thiệu tập dữ liệu nông sản</w:t>
+              <w:t xml:space="preserve">   1.2. Phân bố số lượng mẫu và kiểm toán chất lượng ảnh</w:t>
             </w:r>
           </w:p>
         </w:tc>
@@ -1982,7 +1482,7 @@
                 <w:color w:val="000000"/>
                 <w:sz w:val="22"/>
               </w:rPr>
-              <w:t>14</w:t>
+              <w:t>13</w:t>
             </w:r>
           </w:p>
         </w:tc>
@@ -2010,7 +1510,7 @@
                 <w:color w:val="000000"/>
                 <w:sz w:val="22"/>
               </w:rPr>
-              <w:t xml:space="preserve">   1.2. Phân bố số lượng mẫu và kiểm toán chất lượng ảnh</w:t>
+              <w:t xml:space="preserve">   1.3. Phương pháp phân chia tập dữ liệu (Stratified Split)</w:t>
             </w:r>
           </w:p>
         </w:tc>
@@ -2064,7 +1564,7 @@
                 <w:color w:val="000000"/>
                 <w:sz w:val="22"/>
               </w:rPr>
-              <w:t xml:space="preserve">   1.3. Phương pháp phân chia tập dữ liệu (Stratified Split)</w:t>
+              <w:t xml:space="preserve">   1.4. Tăng cường dữ liệu và đường ống bất đồng bộ tf.data</w:t>
             </w:r>
           </w:p>
         </w:tc>
@@ -2090,7 +1590,7 @@
                 <w:color w:val="000000"/>
                 <w:sz w:val="22"/>
               </w:rPr>
-              <w:t>15</w:t>
+              <w:t>14</w:t>
             </w:r>
           </w:p>
         </w:tc>
@@ -2118,7 +1618,7 @@
                 <w:color w:val="000000"/>
                 <w:sz w:val="22"/>
               </w:rPr>
-              <w:t xml:space="preserve">   1.4. Tăng cường dữ liệu và đường ống bất đồng bộ tf.data</w:t>
+              <w:t>CHƯƠNG 2: MÔ HÌNH CƠ SỞ (BASELINE CNN) VÀ ĐIỂM CHUẨN ĐỐI SÁNH</w:t>
             </w:r>
           </w:p>
         </w:tc>
@@ -2144,7 +1644,7 @@
                 <w:color w:val="000000"/>
                 <w:sz w:val="22"/>
               </w:rPr>
-              <w:t>15</w:t>
+              <w:t>16</w:t>
             </w:r>
           </w:p>
         </w:tc>
@@ -2172,7 +1672,7 @@
                 <w:color w:val="000000"/>
                 <w:sz w:val="22"/>
               </w:rPr>
-              <w:t>CHƯƠNG 2: MÔ HÌNH CƠ SỞ (BASELINE CNN) VÀ ĐIỂM CHUẨN ĐỐI SÁNH</w:t>
+              <w:t xml:space="preserve">   2.1. Cấu trúc mạng Baseline CNN xây dựng từ đầu</w:t>
             </w:r>
           </w:p>
         </w:tc>
@@ -2198,7 +1698,7 @@
                 <w:color w:val="000000"/>
                 <w:sz w:val="22"/>
               </w:rPr>
-              <w:t>17</w:t>
+              <w:t>16</w:t>
             </w:r>
           </w:p>
         </w:tc>
@@ -2226,7 +1726,7 @@
                 <w:color w:val="000000"/>
                 <w:sz w:val="22"/>
               </w:rPr>
-              <w:t xml:space="preserve">   2.1. Cấu trúc mạng Baseline CNN xây dựng từ đầu</w:t>
+              <w:t xml:space="preserve">   2.2. Quá trình huấn luyện và hàm mất mát</w:t>
             </w:r>
           </w:p>
         </w:tc>
@@ -2280,7 +1780,7 @@
                 <w:color w:val="000000"/>
                 <w:sz w:val="22"/>
               </w:rPr>
-              <w:t xml:space="preserve">   2.2. Quá trình huấn luyện và hàm mất mát</w:t>
+              <w:t xml:space="preserve">   2.3. Kết quả huấn luyện của mô hình Baseline CNN</w:t>
             </w:r>
           </w:p>
         </w:tc>
@@ -2306,7 +1806,7 @@
                 <w:color w:val="000000"/>
                 <w:sz w:val="22"/>
               </w:rPr>
-              <w:t>18</w:t>
+              <w:t>17</w:t>
             </w:r>
           </w:p>
         </w:tc>
@@ -2334,7 +1834,7 @@
                 <w:color w:val="000000"/>
                 <w:sz w:val="22"/>
               </w:rPr>
-              <w:t xml:space="preserve">   2.3. Kết quả huấn luyện của mô hình Baseline CNN</w:t>
+              <w:t>CHƯƠNG 3: ÁP DỤNG HỌC CHUYỂN GIAO VỚI CÁC KIẾN TRÚC MẠNG SÂU</w:t>
             </w:r>
           </w:p>
         </w:tc>
@@ -2360,7 +1860,7 @@
                 <w:color w:val="000000"/>
                 <w:sz w:val="22"/>
               </w:rPr>
-              <w:t>18</w:t>
+              <w:t>20</w:t>
             </w:r>
           </w:p>
         </w:tc>
@@ -2388,7 +1888,7 @@
                 <w:color w:val="000000"/>
                 <w:sz w:val="22"/>
               </w:rPr>
-              <w:t>CHƯƠNG 3: ÁP DỤNG HỌC CHUYỂN GIAO VỚI CÁC KIẾN TRÚC MẠNG SÂU</w:t>
+              <w:t xml:space="preserve">   3.1. Lý thuyết học chuyển giao và ba kiến trúc VGG16, ResNet50, EfficientNetB0</w:t>
             </w:r>
           </w:p>
         </w:tc>
@@ -2414,7 +1914,7 @@
                 <w:color w:val="000000"/>
                 <w:sz w:val="22"/>
               </w:rPr>
-              <w:t>21</w:t>
+              <w:t>20</w:t>
             </w:r>
           </w:p>
         </w:tc>
@@ -2442,7 +1942,7 @@
                 <w:color w:val="000000"/>
                 <w:sz w:val="22"/>
               </w:rPr>
-              <w:t xml:space="preserve">   3.1. Lý thuyết học chuyển giao và ba kiến trúc VGG16, ResNet50, EfficientNetB0</w:t>
+              <w:t xml:space="preserve">   3.2. Quy trình tinh chỉnh mạng nơ-ron (Fine-tuning)</w:t>
             </w:r>
           </w:p>
         </w:tc>
@@ -2496,7 +1996,7 @@
                 <w:color w:val="000000"/>
                 <w:sz w:val="22"/>
               </w:rPr>
-              <w:t xml:space="preserve">   3.2. Quy trình tinh chỉnh mạng nơ-ron (Fine-tuning)</w:t>
+              <w:t xml:space="preserve">   3.3. Diễn biến huấn luyện và hội tụ của các mô hình chuyển giao</w:t>
             </w:r>
           </w:p>
         </w:tc>
@@ -2522,7 +2022,7 @@
                 <w:color w:val="000000"/>
                 <w:sz w:val="22"/>
               </w:rPr>
-              <w:t>22</w:t>
+              <w:t>21</w:t>
             </w:r>
           </w:p>
         </w:tc>
@@ -2550,7 +2050,7 @@
                 <w:color w:val="000000"/>
                 <w:sz w:val="22"/>
               </w:rPr>
-              <w:t xml:space="preserve">   3.3. Diễn biến huấn luyện và hội tụ của các mô hình chuyển giao</w:t>
+              <w:t>CHƯƠNG 4: ĐÁNH GIÁ VÀ SO SÁNH HIỆU NĂNG CÁC MÔ HÌNH</w:t>
             </w:r>
           </w:p>
         </w:tc>
@@ -2576,7 +2076,7 @@
                 <w:color w:val="000000"/>
                 <w:sz w:val="22"/>
               </w:rPr>
-              <w:t>22</w:t>
+              <w:t>24</w:t>
             </w:r>
           </w:p>
         </w:tc>
@@ -2604,7 +2104,7 @@
                 <w:color w:val="000000"/>
                 <w:sz w:val="22"/>
               </w:rPr>
-              <w:t>CHƯƠNG 4: ĐÁNH GIÁ VÀ SO SÁNH HIỆU NĂNG CÁC MÔ HÌNH</w:t>
+              <w:t xml:space="preserve">   4.1. Các chỉ số đánh giá và ý nghĩa của độ nhạy Recall</w:t>
             </w:r>
           </w:p>
         </w:tc>
@@ -2630,7 +2130,7 @@
                 <w:color w:val="000000"/>
                 <w:sz w:val="22"/>
               </w:rPr>
-              <w:t>25</w:t>
+              <w:t>24</w:t>
             </w:r>
           </w:p>
         </w:tc>
@@ -2658,7 +2158,7 @@
                 <w:color w:val="000000"/>
                 <w:sz w:val="22"/>
               </w:rPr>
-              <w:t xml:space="preserve">   4.1. Các chỉ số đánh giá và ý nghĩa của độ nhạy Recall</w:t>
+              <w:t xml:space="preserve">   4.2. Bảng so sánh kết quả thực nghiệm trên tập kiểm thử độc lập</w:t>
             </w:r>
           </w:p>
         </w:tc>
@@ -2684,7 +2184,7 @@
                 <w:color w:val="000000"/>
                 <w:sz w:val="22"/>
               </w:rPr>
-              <w:t>25</w:t>
+              <w:t>24</w:t>
             </w:r>
           </w:p>
         </w:tc>
@@ -2712,7 +2212,7 @@
                 <w:color w:val="000000"/>
                 <w:sz w:val="22"/>
               </w:rPr>
-              <w:t xml:space="preserve">   4.2. Bảng so sánh kết quả thực nghiệm trên tập kiểm thử độc lập</w:t>
+              <w:t xml:space="preserve">   4.3. Phân tích ma trận nhầm lẫn của từng mô hình</w:t>
             </w:r>
           </w:p>
         </w:tc>
@@ -2766,7 +2266,7 @@
                 <w:color w:val="000000"/>
                 <w:sz w:val="22"/>
               </w:rPr>
-              <w:t xml:space="preserve">   4.3. Phân tích ma trận nhầm lẫn của từng mô hình</w:t>
+              <w:t>CHƯƠNG 5: GIẢI THÍCH MÔ HÌNH VỚI GRAD-CAM VÀ PHÂN TÍCH NGƯỠNG QUYẾT ĐỊNH</w:t>
             </w:r>
           </w:p>
         </w:tc>
@@ -2792,7 +2292,7 @@
                 <w:color w:val="000000"/>
                 <w:sz w:val="22"/>
               </w:rPr>
-              <w:t>26</w:t>
+              <w:t>27</w:t>
             </w:r>
           </w:p>
         </w:tc>
@@ -2820,7 +2320,7 @@
                 <w:color w:val="000000"/>
                 <w:sz w:val="22"/>
               </w:rPr>
-              <w:t>CHƯƠNG 5: GIẢI THÍCH MÔ HÌNH VỚI GRAD-CAM VÀ PHÂN TÍCH NGƯỠNG QUYẾT ĐỊNH</w:t>
+              <w:t xml:space="preserve">   5.1. Vấn đề bão hòa đạo hàm Sigmoid và giải pháp Linear Logit Grad-CAM</w:t>
             </w:r>
           </w:p>
         </w:tc>
@@ -2846,7 +2346,7 @@
                 <w:color w:val="000000"/>
                 <w:sz w:val="22"/>
               </w:rPr>
-              <w:t>28</w:t>
+              <w:t>27</w:t>
             </w:r>
           </w:p>
         </w:tc>
@@ -2874,7 +2374,7 @@
                 <w:color w:val="000000"/>
                 <w:sz w:val="22"/>
               </w:rPr>
-              <w:t xml:space="preserve">   5.1. Vấn đề bão hòa đạo hàm Sigmoid và giải pháp Linear Logit Grad-CAM</w:t>
+              <w:t xml:space="preserve">   5.2. Trực quan hóa vùng đặc trưng khuyết tật với mặt nạ thích nghi</w:t>
             </w:r>
           </w:p>
         </w:tc>
@@ -2900,7 +2400,7 @@
                 <w:color w:val="000000"/>
                 <w:sz w:val="22"/>
               </w:rPr>
-              <w:t>28</w:t>
+              <w:t>27</w:t>
             </w:r>
           </w:p>
         </w:tc>
@@ -2928,7 +2428,7 @@
                 <w:color w:val="000000"/>
                 <w:sz w:val="22"/>
               </w:rPr>
-              <w:t xml:space="preserve">   5.2. Trực quan hóa vùng đặc trưng khuyết tật với mặt nạ thích nghi</w:t>
+              <w:t xml:space="preserve">   5.3. Phân tích lựa chọn ngưỡng quyết định ưu tiên phát hiện lỗi</w:t>
             </w:r>
           </w:p>
         </w:tc>
@@ -2982,7 +2482,7 @@
                 <w:color w:val="000000"/>
                 <w:sz w:val="22"/>
               </w:rPr>
-              <w:t xml:space="preserve">   5.3. Phân tích lựa chọn ngưỡng quyết định ưu tiên phát hiện lỗi</w:t>
+              <w:t xml:space="preserve">   5.4. Đánh giá tốc độ suy luận của các mô hình</w:t>
             </w:r>
           </w:p>
         </w:tc>
@@ -3036,7 +2536,7 @@
                 <w:color w:val="000000"/>
                 <w:sz w:val="22"/>
               </w:rPr>
-              <w:t xml:space="preserve">   5.4. Đánh giá tốc độ suy luận của các mô hình</w:t>
+              <w:t>CHƯƠNG 6: XÂY DỰNG ỨNG DỤNG DEMO THỜI GIAN THỰC VÀ THỬ NGHIỆM VẬN HÀNH</w:t>
             </w:r>
           </w:p>
         </w:tc>
@@ -3062,7 +2562,7 @@
                 <w:color w:val="000000"/>
                 <w:sz w:val="22"/>
               </w:rPr>
-              <w:t>30</w:t>
+              <w:t>31</w:t>
             </w:r>
           </w:p>
         </w:tc>
@@ -3090,7 +2590,7 @@
                 <w:color w:val="000000"/>
                 <w:sz w:val="22"/>
               </w:rPr>
-              <w:t>CHƯƠNG 6: XÂY DỰNG ỨNG DỤNG DEMO THỜI GIAN THỰC VÀ THỬ NGHIỆM VẬN HÀNH</w:t>
+              <w:t xml:space="preserve">   6.1. Giao diện điều khiển và giám sát bằng Streamlit</w:t>
             </w:r>
           </w:p>
         </w:tc>
@@ -3116,7 +2616,7 @@
                 <w:color w:val="000000"/>
                 <w:sz w:val="22"/>
               </w:rPr>
-              <w:t>32</w:t>
+              <w:t>31</w:t>
             </w:r>
           </w:p>
         </w:tc>
@@ -3144,7 +2644,7 @@
                 <w:color w:val="000000"/>
                 <w:sz w:val="22"/>
               </w:rPr>
-              <w:t xml:space="preserve">   6.1. Giao diện điều khiển và giám sát bằng Streamlit</w:t>
+              <w:t xml:space="preserve">   6.2. Kết nối camera điện thoại qua DroidCam và xử lý trôi khung hình bằng ThreadedCamera</w:t>
             </w:r>
           </w:p>
         </w:tc>
@@ -3170,7 +2670,7 @@
                 <w:color w:val="000000"/>
                 <w:sz w:val="22"/>
               </w:rPr>
-              <w:t>32</w:t>
+              <w:t>31</w:t>
             </w:r>
           </w:p>
         </w:tc>
@@ -3198,7 +2698,7 @@
                 <w:color w:val="000000"/>
                 <w:sz w:val="22"/>
               </w:rPr>
-              <w:t xml:space="preserve">   6.2. Kết nối camera điện thoại qua DroidCam và xử lý trôi khung hình bằng ThreadedCamera</w:t>
+              <w:t xml:space="preserve">   6.3. Động cơ phân tích dự phòng trên CPU khi không có GPU</w:t>
             </w:r>
           </w:p>
         </w:tc>
@@ -3252,7 +2752,7 @@
                 <w:color w:val="000000"/>
                 <w:sz w:val="22"/>
               </w:rPr>
-              <w:t xml:space="preserve">   6.3. Động cơ phân tích dự phòng trên CPU khi không có GPU</w:t>
+              <w:t xml:space="preserve">   6.4. Đánh giá thử nghiệm vận hành ứng dụng trong thực tế</w:t>
             </w:r>
           </w:p>
         </w:tc>
@@ -3306,7 +2806,7 @@
                 <w:color w:val="000000"/>
                 <w:sz w:val="22"/>
               </w:rPr>
-              <w:t xml:space="preserve">   6.4. Đánh giá thử nghiệm vận hành ứng dụng trong thực tế</w:t>
+              <w:t>KẾT LUẬN VÀ HƯỚNG PHÁT TRIỂN</w:t>
             </w:r>
           </w:p>
         </w:tc>
@@ -3360,7 +2860,7 @@
                 <w:color w:val="000000"/>
                 <w:sz w:val="22"/>
               </w:rPr>
-              <w:t>KẾT LUẬN VÀ HƯỚNG PHÁT TRIỂN</w:t>
+              <w:t xml:space="preserve">   1. Kết luận về các kết quả đạt được</w:t>
             </w:r>
           </w:p>
         </w:tc>
@@ -3386,7 +2886,7 @@
                 <w:color w:val="000000"/>
                 <w:sz w:val="22"/>
               </w:rPr>
-              <w:t>35</w:t>
+              <w:t>34</w:t>
             </w:r>
           </w:p>
         </w:tc>
@@ -3414,7 +2914,7 @@
                 <w:color w:val="000000"/>
                 <w:sz w:val="22"/>
               </w:rPr>
-              <w:t xml:space="preserve">   1. Kết luận về các kết quả đạt được</w:t>
+              <w:t xml:space="preserve">   2. Bài học kinh nghiệm đúc kết từ quá trình làm đồ án</w:t>
             </w:r>
           </w:p>
         </w:tc>
@@ -3440,7 +2940,7 @@
                 <w:color w:val="000000"/>
                 <w:sz w:val="22"/>
               </w:rPr>
-              <w:t>35</w:t>
+              <w:t>34</w:t>
             </w:r>
           </w:p>
         </w:tc>
@@ -3468,7 +2968,7 @@
                 <w:color w:val="000000"/>
                 <w:sz w:val="22"/>
               </w:rPr>
-              <w:t xml:space="preserve">   2. Bài học kinh nghiệm đúc kết từ quá trình làm đồ án</w:t>
+              <w:t xml:space="preserve">   3. Hạn chế hiện tại của hệ thống</w:t>
             </w:r>
           </w:p>
         </w:tc>
@@ -3522,7 +3022,7 @@
                 <w:color w:val="000000"/>
                 <w:sz w:val="22"/>
               </w:rPr>
-              <w:t xml:space="preserve">   3. Hạn chế hiện tại của hệ thống</w:t>
+              <w:t xml:space="preserve">   4. Hướng phát triển trong tương lai</w:t>
             </w:r>
           </w:p>
         </w:tc>
@@ -3548,7 +3048,7 @@
                 <w:color w:val="000000"/>
                 <w:sz w:val="22"/>
               </w:rPr>
-              <w:t>36</w:t>
+              <w:t>35</w:t>
             </w:r>
           </w:p>
         </w:tc>
@@ -3576,7 +3076,7 @@
                 <w:color w:val="000000"/>
                 <w:sz w:val="22"/>
               </w:rPr>
-              <w:t xml:space="preserve">   4. Hướng phát triển trong tương lai</w:t>
+              <w:t>TÀI LIỆU THAM KHẢO</w:t>
             </w:r>
           </w:p>
         </w:tc>
@@ -3630,7 +3130,7 @@
                 <w:color w:val="000000"/>
                 <w:sz w:val="22"/>
               </w:rPr>
-              <w:t>TÀI LIỆU THAM KHẢO</w:t>
+              <w:t>PHỤ LỤC</w:t>
             </w:r>
           </w:p>
         </w:tc>
@@ -3684,7 +3184,7 @@
                 <w:color w:val="000000"/>
                 <w:sz w:val="22"/>
               </w:rPr>
-              <w:t>PHỤ LỤC</w:t>
+              <w:t xml:space="preserve">   Phụ lục A: Cấu trúc thư mục mã nguồn đồ án</w:t>
             </w:r>
           </w:p>
         </w:tc>
@@ -3710,7 +3210,7 @@
                 <w:color w:val="000000"/>
                 <w:sz w:val="22"/>
               </w:rPr>
-              <w:t>38</w:t>
+              <w:t>37</w:t>
             </w:r>
           </w:p>
         </w:tc>
@@ -3738,7 +3238,7 @@
                 <w:color w:val="000000"/>
                 <w:sz w:val="22"/>
               </w:rPr>
-              <w:t xml:space="preserve">   Phụ lục A: Cấu trúc thư mục mã nguồn đồ án</w:t>
+              <w:t xml:space="preserve">   Phụ lục B: Hướng dẫn cài đặt và chạy ứng dụng demo</w:t>
             </w:r>
           </w:p>
         </w:tc>
@@ -3764,61 +3264,7 @@
                 <w:color w:val="000000"/>
                 <w:sz w:val="22"/>
               </w:rPr>
-              <w:t>38</w:t>
-            </w:r>
-          </w:p>
-        </w:tc>
-      </w:tr>
-      <w:tr>
-        <w:tc>
-          <w:tcPr>
-            <w:tcW w:type="dxa" w:w="7920"/>
-            <w:shd w:fill="FFFFFF"/>
-            <w:tcBorders>
-              <w:top w:val="single" w:sz="4" w:space="0" w:color="CCCCCC"/>
-              <w:bottom w:val="single" w:sz="4" w:space="0" w:color="CCCCCC"/>
-              <w:left w:val="single" w:sz="4" w:space="0" w:color="CCCCCC"/>
-              <w:right w:val="single" w:sz="4" w:space="0" w:color="CCCCCC"/>
-            </w:tcBorders>
-          </w:tcPr>
-          <w:p>
-            <w:pPr>
-              <w:spacing w:before="40" w:after="40"/>
-              <w:jc w:val="left"/>
-            </w:pPr>
-            <w:r>
-              <w:rPr>
-                <w:rFonts w:ascii="Times New Roman" w:hAnsi="Times New Roman"/>
-                <w:color w:val="000000"/>
-                <w:sz w:val="22"/>
-              </w:rPr>
-              <w:t xml:space="preserve">   Phụ lục B: Hướng dẫn cài đặt và chạy ứng dụng demo</w:t>
-            </w:r>
-          </w:p>
-        </w:tc>
-        <w:tc>
-          <w:tcPr>
-            <w:tcW w:type="dxa" w:w="1440"/>
-            <w:shd w:fill="FFFFFF"/>
-            <w:tcBorders>
-              <w:top w:val="single" w:sz="4" w:space="0" w:color="CCCCCC"/>
-              <w:bottom w:val="single" w:sz="4" w:space="0" w:color="CCCCCC"/>
-              <w:left w:val="single" w:sz="4" w:space="0" w:color="CCCCCC"/>
-              <w:right w:val="single" w:sz="4" w:space="0" w:color="CCCCCC"/>
-            </w:tcBorders>
-          </w:tcPr>
-          <w:p>
-            <w:pPr>
-              <w:spacing w:before="40" w:after="40"/>
-              <w:jc w:val="center"/>
-            </w:pPr>
-            <w:r>
-              <w:rPr>
-                <w:rFonts w:ascii="Times New Roman" w:hAnsi="Times New Roman"/>
-                <w:color w:val="000000"/>
-                <w:sz w:val="22"/>
-              </w:rPr>
-              <w:t>38</w:t>
+              <w:t>37</w:t>
             </w:r>
           </w:p>
         </w:tc>
@@ -29732,7 +29178,7 @@
         <w:color w:val="666666"/>
         <w:sz w:val="19"/>
       </w:rPr>
-      <w:t>Samsung Innovation Campus 2026 — Project 13: Phân loại chất lượng nông sản (Lê Thành Được)</w:t>
+      <w:t>Project 13: Phân loại chất lượng nông sản (Lê Thành Được)</w:t>
     </w:r>
   </w:p>
 </w:hdr>

</xml_diff>

<commit_message>
fix(report): remove repeating table headers and enable continuous chapter flow
</commit_message>
<xml_diff>
--- a/report/BaoCao_Project13_LeThanhDuoc_SIC2026.docx
+++ b/report/BaoCao_Project13_LeThanhDuoc_SIC2026.docx
@@ -618,7 +618,7 @@
       </w:tblGrid>
       <w:tr>
         <w:trPr>
-          <w:tblHeader/>
+          <w:cantSplit/>
         </w:trPr>
         <w:tc>
           <w:tcPr>
@@ -955,7 +955,7 @@
                 <w:color w:val="000000"/>
                 <w:sz w:val="21"/>
               </w:rPr>
-              <w:t>7</w:t>
+              <w:t>6</w:t>
             </w:r>
           </w:p>
         </w:tc>
@@ -1012,7 +1012,7 @@
                 <w:color w:val="000000"/>
                 <w:sz w:val="21"/>
               </w:rPr>
-              <w:t>8</w:t>
+              <w:t>7</w:t>
             </w:r>
           </w:p>
         </w:tc>
@@ -1069,7 +1069,7 @@
                 <w:color w:val="000000"/>
                 <w:sz w:val="21"/>
               </w:rPr>
-              <w:t>9</w:t>
+              <w:t>8</w:t>
             </w:r>
           </w:p>
         </w:tc>
@@ -1126,7 +1126,7 @@
                 <w:color w:val="000000"/>
                 <w:sz w:val="21"/>
               </w:rPr>
-              <w:t>9</w:t>
+              <w:t>8</w:t>
             </w:r>
           </w:p>
         </w:tc>
@@ -1183,7 +1183,7 @@
                 <w:color w:val="000000"/>
                 <w:sz w:val="21"/>
               </w:rPr>
-              <w:t>9</w:t>
+              <w:t>8</w:t>
             </w:r>
           </w:p>
         </w:tc>
@@ -1240,7 +1240,7 @@
                 <w:color w:val="000000"/>
                 <w:sz w:val="21"/>
               </w:rPr>
-              <w:t>10</w:t>
+              <w:t>9</w:t>
             </w:r>
           </w:p>
         </w:tc>
@@ -1297,7 +1297,7 @@
                 <w:color w:val="000000"/>
                 <w:sz w:val="21"/>
               </w:rPr>
-              <w:t>10</w:t>
+              <w:t>9</w:t>
             </w:r>
           </w:p>
         </w:tc>
@@ -1354,7 +1354,7 @@
                 <w:color w:val="000000"/>
                 <w:sz w:val="21"/>
               </w:rPr>
-              <w:t>10</w:t>
+              <w:t>9</w:t>
             </w:r>
           </w:p>
         </w:tc>
@@ -1411,7 +1411,7 @@
                 <w:color w:val="000000"/>
                 <w:sz w:val="21"/>
               </w:rPr>
-              <w:t>11</w:t>
+              <w:t>10</w:t>
             </w:r>
           </w:p>
         </w:tc>
@@ -1468,7 +1468,7 @@
                 <w:color w:val="000000"/>
                 <w:sz w:val="21"/>
               </w:rPr>
-              <w:t>11</w:t>
+              <w:t>10</w:t>
             </w:r>
           </w:p>
         </w:tc>
@@ -1525,7 +1525,7 @@
                 <w:color w:val="000000"/>
                 <w:sz w:val="21"/>
               </w:rPr>
-              <w:t>11</w:t>
+              <w:t>10</w:t>
             </w:r>
           </w:p>
         </w:tc>
@@ -1582,7 +1582,7 @@
                 <w:color w:val="000000"/>
                 <w:sz w:val="21"/>
               </w:rPr>
-              <w:t>12</w:t>
+              <w:t>11</w:t>
             </w:r>
           </w:p>
         </w:tc>
@@ -1639,7 +1639,7 @@
                 <w:color w:val="000000"/>
                 <w:sz w:val="21"/>
               </w:rPr>
-              <w:t>12</w:t>
+              <w:t>11</w:t>
             </w:r>
           </w:p>
         </w:tc>
@@ -1696,7 +1696,7 @@
                 <w:color w:val="000000"/>
                 <w:sz w:val="21"/>
               </w:rPr>
-              <w:t>14</w:t>
+              <w:t>12</w:t>
             </w:r>
           </w:p>
         </w:tc>
@@ -1753,7 +1753,7 @@
                 <w:color w:val="000000"/>
                 <w:sz w:val="21"/>
               </w:rPr>
-              <w:t>14</w:t>
+              <w:t>12</w:t>
             </w:r>
           </w:p>
         </w:tc>
@@ -1810,7 +1810,7 @@
                 <w:color w:val="000000"/>
                 <w:sz w:val="21"/>
               </w:rPr>
-              <w:t>15</w:t>
+              <w:t>13</w:t>
             </w:r>
           </w:p>
         </w:tc>
@@ -1867,7 +1867,7 @@
                 <w:color w:val="000000"/>
                 <w:sz w:val="21"/>
               </w:rPr>
-              <w:t>15</w:t>
+              <w:t>13</w:t>
             </w:r>
           </w:p>
         </w:tc>
@@ -1924,7 +1924,7 @@
                 <w:color w:val="000000"/>
                 <w:sz w:val="21"/>
               </w:rPr>
-              <w:t>17</w:t>
+              <w:t>15</w:t>
             </w:r>
           </w:p>
         </w:tc>
@@ -1981,7 +1981,7 @@
                 <w:color w:val="000000"/>
                 <w:sz w:val="21"/>
               </w:rPr>
-              <w:t>17</w:t>
+              <w:t>15</w:t>
             </w:r>
           </w:p>
         </w:tc>
@@ -2038,7 +2038,7 @@
                 <w:color w:val="000000"/>
                 <w:sz w:val="21"/>
               </w:rPr>
-              <w:t>18</w:t>
+              <w:t>16</w:t>
             </w:r>
           </w:p>
         </w:tc>
@@ -2095,7 +2095,7 @@
                 <w:color w:val="000000"/>
                 <w:sz w:val="21"/>
               </w:rPr>
-              <w:t>18</w:t>
+              <w:t>16</w:t>
             </w:r>
           </w:p>
         </w:tc>
@@ -2152,7 +2152,7 @@
                 <w:color w:val="000000"/>
                 <w:sz w:val="21"/>
               </w:rPr>
-              <w:t>21</w:t>
+              <w:t>18</w:t>
             </w:r>
           </w:p>
         </w:tc>
@@ -2209,7 +2209,7 @@
                 <w:color w:val="000000"/>
                 <w:sz w:val="21"/>
               </w:rPr>
-              <w:t>21</w:t>
+              <w:t>18</w:t>
             </w:r>
           </w:p>
         </w:tc>
@@ -2266,7 +2266,7 @@
                 <w:color w:val="000000"/>
                 <w:sz w:val="21"/>
               </w:rPr>
-              <w:t>21</w:t>
+              <w:t>19</w:t>
             </w:r>
           </w:p>
         </w:tc>
@@ -2323,7 +2323,7 @@
                 <w:color w:val="000000"/>
                 <w:sz w:val="21"/>
               </w:rPr>
-              <w:t>22</w:t>
+              <w:t>19</w:t>
             </w:r>
           </w:p>
         </w:tc>
@@ -2380,7 +2380,7 @@
                 <w:color w:val="000000"/>
                 <w:sz w:val="21"/>
               </w:rPr>
-              <w:t>24</w:t>
+              <w:t>20</w:t>
             </w:r>
           </w:p>
         </w:tc>
@@ -2437,7 +2437,7 @@
                 <w:color w:val="000000"/>
                 <w:sz w:val="21"/>
               </w:rPr>
-              <w:t>24</w:t>
+              <w:t>20</w:t>
             </w:r>
           </w:p>
         </w:tc>
@@ -2494,7 +2494,7 @@
                 <w:color w:val="000000"/>
                 <w:sz w:val="21"/>
               </w:rPr>
-              <w:t>24</w:t>
+              <w:t>21</w:t>
             </w:r>
           </w:p>
         </w:tc>
@@ -2551,7 +2551,7 @@
                 <w:color w:val="000000"/>
                 <w:sz w:val="21"/>
               </w:rPr>
-              <w:t>25</w:t>
+              <w:t>21</w:t>
             </w:r>
           </w:p>
         </w:tc>
@@ -2608,7 +2608,7 @@
                 <w:color w:val="000000"/>
                 <w:sz w:val="21"/>
               </w:rPr>
-              <w:t>26</w:t>
+              <w:t>22</w:t>
             </w:r>
           </w:p>
         </w:tc>
@@ -2665,7 +2665,7 @@
                 <w:color w:val="000000"/>
                 <w:sz w:val="21"/>
               </w:rPr>
-              <w:t>28</w:t>
+              <w:t>23</w:t>
             </w:r>
           </w:p>
         </w:tc>
@@ -2722,7 +2722,7 @@
                 <w:color w:val="000000"/>
                 <w:sz w:val="21"/>
               </w:rPr>
-              <w:t>28</w:t>
+              <w:t>23</w:t>
             </w:r>
           </w:p>
         </w:tc>
@@ -2779,7 +2779,7 @@
                 <w:color w:val="000000"/>
                 <w:sz w:val="21"/>
               </w:rPr>
-              <w:t>28</w:t>
+              <w:t>24</w:t>
             </w:r>
           </w:p>
         </w:tc>
@@ -2836,7 +2836,7 @@
                 <w:color w:val="000000"/>
                 <w:sz w:val="21"/>
               </w:rPr>
-              <w:t>29</w:t>
+              <w:t>24</w:t>
             </w:r>
           </w:p>
         </w:tc>
@@ -2893,7 +2893,7 @@
                 <w:color w:val="000000"/>
                 <w:sz w:val="21"/>
               </w:rPr>
-              <w:t>30</w:t>
+              <w:t>25</w:t>
             </w:r>
           </w:p>
         </w:tc>
@@ -2950,7 +2950,7 @@
                 <w:color w:val="000000"/>
                 <w:sz w:val="21"/>
               </w:rPr>
-              <w:t>31</w:t>
+              <w:t>26</w:t>
             </w:r>
           </w:p>
         </w:tc>
@@ -3007,7 +3007,7 @@
                 <w:color w:val="000000"/>
                 <w:sz w:val="21"/>
               </w:rPr>
-              <w:t>31</w:t>
+              <w:t>26</w:t>
             </w:r>
           </w:p>
         </w:tc>
@@ -3064,7 +3064,7 @@
                 <w:color w:val="000000"/>
                 <w:sz w:val="21"/>
               </w:rPr>
-              <w:t>31</w:t>
+              <w:t>26</w:t>
             </w:r>
           </w:p>
         </w:tc>
@@ -3121,7 +3121,7 @@
                 <w:color w:val="000000"/>
                 <w:sz w:val="21"/>
               </w:rPr>
-              <w:t>32</w:t>
+              <w:t>27</w:t>
             </w:r>
           </w:p>
         </w:tc>
@@ -3178,7 +3178,7 @@
                 <w:color w:val="000000"/>
                 <w:sz w:val="21"/>
               </w:rPr>
-              <w:t>32</w:t>
+              <w:t>27</w:t>
             </w:r>
           </w:p>
         </w:tc>
@@ -3235,7 +3235,7 @@
                 <w:color w:val="000000"/>
                 <w:sz w:val="21"/>
               </w:rPr>
-              <w:t>33</w:t>
+              <w:t>27</w:t>
             </w:r>
           </w:p>
         </w:tc>
@@ -3292,7 +3292,7 @@
                 <w:color w:val="000000"/>
                 <w:sz w:val="21"/>
               </w:rPr>
-              <w:t>34</w:t>
+              <w:t>28</w:t>
             </w:r>
           </w:p>
         </w:tc>
@@ -3349,7 +3349,7 @@
                 <w:color w:val="000000"/>
                 <w:sz w:val="21"/>
               </w:rPr>
-              <w:t>34</w:t>
+              <w:t>28</w:t>
             </w:r>
           </w:p>
         </w:tc>
@@ -3406,7 +3406,7 @@
                 <w:color w:val="000000"/>
                 <w:sz w:val="21"/>
               </w:rPr>
-              <w:t>34</w:t>
+              <w:t>29</w:t>
             </w:r>
           </w:p>
         </w:tc>
@@ -3449,7 +3449,7 @@
       </w:tblGrid>
       <w:tr>
         <w:trPr>
-          <w:tblHeader/>
+          <w:cantSplit/>
         </w:trPr>
         <w:tc>
           <w:tcPr>
@@ -5480,7 +5480,7 @@
       </w:tblGrid>
       <w:tr>
         <w:trPr>
-          <w:tblHeader/>
+          <w:cantSplit/>
         </w:trPr>
         <w:tc>
           <w:tcPr>
@@ -5642,7 +5642,7 @@
                 <w:color w:val="000000"/>
                 <w:sz w:val="21"/>
               </w:rPr>
-              <w:t>11</w:t>
+              <w:t>10</w:t>
             </w:r>
           </w:p>
         </w:tc>
@@ -5725,7 +5725,7 @@
                 <w:color w:val="000000"/>
                 <w:sz w:val="21"/>
               </w:rPr>
-              <w:t>12</w:t>
+              <w:t>11</w:t>
             </w:r>
           </w:p>
         </w:tc>
@@ -5808,7 +5808,7 @@
                 <w:color w:val="000000"/>
                 <w:sz w:val="21"/>
               </w:rPr>
-              <w:t>13</w:t>
+              <w:t>11</w:t>
             </w:r>
           </w:p>
         </w:tc>
@@ -5891,7 +5891,7 @@
                 <w:color w:val="000000"/>
                 <w:sz w:val="21"/>
               </w:rPr>
-              <w:t>14</w:t>
+              <w:t>13</w:t>
             </w:r>
           </w:p>
         </w:tc>
@@ -5974,7 +5974,7 @@
                 <w:color w:val="000000"/>
                 <w:sz w:val="21"/>
               </w:rPr>
-              <w:t>15</w:t>
+              <w:t>14</w:t>
             </w:r>
           </w:p>
         </w:tc>
@@ -6057,7 +6057,7 @@
                 <w:color w:val="000000"/>
                 <w:sz w:val="21"/>
               </w:rPr>
-              <w:t>17</w:t>
+              <w:t>16</w:t>
             </w:r>
           </w:p>
         </w:tc>
@@ -6140,7 +6140,7 @@
                 <w:color w:val="000000"/>
                 <w:sz w:val="21"/>
               </w:rPr>
-              <w:t>18</w:t>
+              <w:t>16</w:t>
             </w:r>
           </w:p>
         </w:tc>
@@ -6223,7 +6223,7 @@
                 <w:color w:val="000000"/>
                 <w:sz w:val="21"/>
               </w:rPr>
-              <w:t>18</w:t>
+              <w:t>16</w:t>
             </w:r>
           </w:p>
         </w:tc>
@@ -6306,7 +6306,7 @@
                 <w:color w:val="000000"/>
                 <w:sz w:val="21"/>
               </w:rPr>
-              <w:t>19</w:t>
+              <w:t>17</w:t>
             </w:r>
           </w:p>
         </w:tc>
@@ -6389,7 +6389,7 @@
                 <w:color w:val="000000"/>
                 <w:sz w:val="21"/>
               </w:rPr>
-              <w:t>19</w:t>
+              <w:t>17</w:t>
             </w:r>
           </w:p>
         </w:tc>
@@ -6472,7 +6472,7 @@
                 <w:color w:val="000000"/>
                 <w:sz w:val="21"/>
               </w:rPr>
-              <w:t>21</w:t>
+              <w:t>19</w:t>
             </w:r>
           </w:p>
         </w:tc>
@@ -6555,7 +6555,7 @@
                 <w:color w:val="000000"/>
                 <w:sz w:val="21"/>
               </w:rPr>
-              <w:t>22</w:t>
+              <w:t>19</w:t>
             </w:r>
           </w:p>
         </w:tc>
@@ -6638,7 +6638,7 @@
                 <w:color w:val="000000"/>
                 <w:sz w:val="21"/>
               </w:rPr>
-              <w:t>25</w:t>
+              <w:t>22</w:t>
             </w:r>
           </w:p>
         </w:tc>
@@ -6721,7 +6721,7 @@
                 <w:color w:val="000000"/>
                 <w:sz w:val="21"/>
               </w:rPr>
-              <w:t>26</w:t>
+              <w:t>22</w:t>
             </w:r>
           </w:p>
         </w:tc>
@@ -6804,7 +6804,7 @@
                 <w:color w:val="000000"/>
                 <w:sz w:val="21"/>
               </w:rPr>
-              <w:t>28</w:t>
+              <w:t>25</w:t>
             </w:r>
           </w:p>
         </w:tc>
@@ -6887,7 +6887,7 @@
                 <w:color w:val="000000"/>
                 <w:sz w:val="21"/>
               </w:rPr>
-              <w:t>30</w:t>
+              <w:t>25</w:t>
             </w:r>
           </w:p>
         </w:tc>
@@ -6896,8 +6896,7 @@
     <w:p>
       <w:pPr>
         <w:keepNext/>
-        <w:pageBreakBefore/>
-        <w:spacing w:before="200" w:after="240"/>
+        <w:spacing w:before="400" w:after="200"/>
         <w:jc w:val="center"/>
       </w:pPr>
       <w:r>
@@ -6930,7 +6929,7 @@
       </w:tblGrid>
       <w:tr>
         <w:trPr>
-          <w:tblHeader/>
+          <w:cantSplit/>
         </w:trPr>
         <w:tc>
           <w:tcPr>
@@ -7092,7 +7091,7 @@
                 <w:color w:val="000000"/>
                 <w:sz w:val="21"/>
               </w:rPr>
-              <w:t>12</w:t>
+              <w:t>11</w:t>
             </w:r>
           </w:p>
         </w:tc>
@@ -7175,7 +7174,7 @@
                 <w:color w:val="000000"/>
                 <w:sz w:val="21"/>
               </w:rPr>
-              <w:t>16</w:t>
+              <w:t>15</w:t>
             </w:r>
           </w:p>
         </w:tc>
@@ -7258,7 +7257,7 @@
                 <w:color w:val="000000"/>
                 <w:sz w:val="21"/>
               </w:rPr>
-              <w:t>20</w:t>
+              <w:t>18</w:t>
             </w:r>
           </w:p>
         </w:tc>
@@ -7341,7 +7340,7 @@
                 <w:color w:val="000000"/>
                 <w:sz w:val="21"/>
               </w:rPr>
-              <w:t>22</w:t>
+              <w:t>20</w:t>
             </w:r>
           </w:p>
         </w:tc>
@@ -7424,7 +7423,7 @@
                 <w:color w:val="000000"/>
                 <w:sz w:val="21"/>
               </w:rPr>
-              <w:t>25</w:t>
+              <w:t>21</w:t>
             </w:r>
           </w:p>
         </w:tc>
@@ -7507,7 +7506,7 @@
                 <w:color w:val="000000"/>
                 <w:sz w:val="21"/>
               </w:rPr>
-              <w:t>27</w:t>
+              <w:t>23</w:t>
             </w:r>
           </w:p>
         </w:tc>
@@ -7669,8 +7668,7 @@
     <w:p>
       <w:pPr>
         <w:keepNext/>
-        <w:pageBreakBefore/>
-        <w:spacing w:before="200" w:after="240"/>
+        <w:spacing w:before="440" w:after="200"/>
         <w:jc w:val="center"/>
       </w:pPr>
       <w:r>
@@ -8117,8 +8115,7 @@
     <w:p>
       <w:pPr>
         <w:keepNext/>
-        <w:pageBreakBefore/>
-        <w:spacing w:before="280" w:after="120"/>
+        <w:spacing w:before="440" w:after="160"/>
         <w:jc w:val="left"/>
       </w:pPr>
       <w:r>
@@ -8279,7 +8276,7 @@
       </w:tblGrid>
       <w:tr>
         <w:trPr>
-          <w:tblHeader/>
+          <w:cantSplit/>
         </w:trPr>
         <w:tc>
           <w:tcPr>
@@ -9517,7 +9514,7 @@
       </w:tblGrid>
       <w:tr>
         <w:trPr>
-          <w:tblHeader/>
+          <w:cantSplit/>
         </w:trPr>
         <w:tc>
           <w:tcPr>
@@ -10264,7 +10261,7 @@
       </w:tblGrid>
       <w:tr>
         <w:trPr>
-          <w:tblHeader/>
+          <w:cantSplit/>
         </w:trPr>
         <w:tc>
           <w:tcPr>
@@ -10865,8 +10862,7 @@
     <w:p>
       <w:pPr>
         <w:keepNext/>
-        <w:pageBreakBefore/>
-        <w:spacing w:before="280" w:after="120"/>
+        <w:spacing w:before="440" w:after="160"/>
         <w:jc w:val="left"/>
       </w:pPr>
       <w:r>
@@ -11024,7 +11020,7 @@
       </w:tblGrid>
       <w:tr>
         <w:trPr>
-          <w:tblHeader/>
+          <w:cantSplit/>
         </w:trPr>
         <w:tc>
           <w:tcPr>
@@ -12179,7 +12175,7 @@
       </w:tblGrid>
       <w:tr>
         <w:trPr>
-          <w:tblHeader/>
+          <w:cantSplit/>
         </w:trPr>
         <w:tc>
           <w:tcPr>
@@ -16177,8 +16173,7 @@
     <w:p>
       <w:pPr>
         <w:keepNext/>
-        <w:pageBreakBefore/>
-        <w:spacing w:before="280" w:after="120"/>
+        <w:spacing w:before="440" w:after="160"/>
         <w:jc w:val="left"/>
       </w:pPr>
       <w:r>
@@ -16321,7 +16316,7 @@
       </w:tblGrid>
       <w:tr>
         <w:trPr>
-          <w:tblHeader/>
+          <w:cantSplit/>
         </w:trPr>
         <w:tc>
           <w:tcPr>
@@ -17078,7 +17073,7 @@
       </w:tblGrid>
       <w:tr>
         <w:trPr>
-          <w:tblHeader/>
+          <w:cantSplit/>
         </w:trPr>
         <w:tc>
           <w:tcPr>
@@ -17558,7 +17553,7 @@
       </w:tblGrid>
       <w:tr>
         <w:trPr>
-          <w:tblHeader/>
+          <w:cantSplit/>
         </w:trPr>
         <w:tc>
           <w:tcPr>
@@ -19373,7 +19368,7 @@
       </w:tblGrid>
       <w:tr>
         <w:trPr>
-          <w:tblHeader/>
+          <w:cantSplit/>
         </w:trPr>
         <w:tc>
           <w:tcPr>
@@ -21188,7 +21183,7 @@
       </w:tblGrid>
       <w:tr>
         <w:trPr>
-          <w:tblHeader/>
+          <w:cantSplit/>
         </w:trPr>
         <w:tc>
           <w:tcPr>
@@ -23024,8 +23019,7 @@
     <w:p>
       <w:pPr>
         <w:keepNext/>
-        <w:pageBreakBefore/>
-        <w:spacing w:before="280" w:after="120"/>
+        <w:spacing w:before="440" w:after="160"/>
         <w:jc w:val="left"/>
       </w:pPr>
       <w:r>
@@ -23281,7 +23275,7 @@
       </w:tblGrid>
       <w:tr>
         <w:trPr>
-          <w:tblHeader/>
+          <w:cantSplit/>
         </w:trPr>
         <w:tc>
           <w:tcPr>
@@ -24555,7 +24549,7 @@
       </w:tblGrid>
       <w:tr>
         <w:trPr>
-          <w:tblHeader/>
+          <w:cantSplit/>
         </w:trPr>
         <w:tc>
           <w:tcPr>
@@ -25470,8 +25464,7 @@
     <w:p>
       <w:pPr>
         <w:keepNext/>
-        <w:pageBreakBefore/>
-        <w:spacing w:before="280" w:after="120"/>
+        <w:spacing w:before="440" w:after="160"/>
         <w:jc w:val="left"/>
       </w:pPr>
       <w:r>
@@ -25819,7 +25812,7 @@
       </w:tblGrid>
       <w:tr>
         <w:trPr>
-          <w:tblHeader/>
+          <w:cantSplit/>
         </w:trPr>
         <w:tc>
           <w:tcPr>
@@ -26996,7 +26989,7 @@
       </w:tblGrid>
       <w:tr>
         <w:trPr>
-          <w:tblHeader/>
+          <w:cantSplit/>
         </w:trPr>
         <w:tc>
           <w:tcPr>
@@ -28040,8 +28033,7 @@
     <w:p>
       <w:pPr>
         <w:keepNext/>
-        <w:pageBreakBefore/>
-        <w:spacing w:before="280" w:after="120"/>
+        <w:spacing w:before="440" w:after="160"/>
         <w:jc w:val="left"/>
       </w:pPr>
       <w:r>
@@ -28398,7 +28390,7 @@
       </w:tblGrid>
       <w:tr>
         <w:trPr>
-          <w:tblHeader/>
+          <w:cantSplit/>
         </w:trPr>
         <w:tc>
           <w:tcPr>
@@ -29026,8 +29018,7 @@
     <w:p>
       <w:pPr>
         <w:keepNext/>
-        <w:pageBreakBefore/>
-        <w:spacing w:before="200" w:after="240"/>
+        <w:spacing w:before="440" w:after="200"/>
         <w:jc w:val="center"/>
       </w:pPr>
       <w:r>
@@ -29367,8 +29358,7 @@
     <w:p>
       <w:pPr>
         <w:keepNext/>
-        <w:pageBreakBefore/>
-        <w:spacing w:before="200" w:after="240"/>
+        <w:spacing w:before="440" w:after="200"/>
         <w:jc w:val="center"/>
       </w:pPr>
       <w:r>
@@ -29489,8 +29479,7 @@
     <w:p>
       <w:pPr>
         <w:keepNext/>
-        <w:pageBreakBefore/>
-        <w:spacing w:before="200" w:after="240"/>
+        <w:spacing w:before="440" w:after="200"/>
         <w:jc w:val="center"/>
       </w:pPr>
       <w:r>

</xml_diff>

<commit_message>
docs: include Fruit_Full_Pipeline.ipynb in project layout and technical documentation
</commit_message>
<xml_diff>
--- a/report/BaoCao_Project13_LeThanhDuoc_SIC2026.docx
+++ b/report/BaoCao_Project13_LeThanhDuoc_SIC2026.docx
@@ -30927,297 +30927,69 @@
         <w:spacing w:before="80" w:after="120"/>
       </w:pPr>
       <w:r>
-        <w:rPr>
-          <w:rFonts w:ascii="Consolas" w:hAnsi="Consolas"/>
-          <w:color w:val="222222"/>
-          <w:sz w:val="19"/>
-        </w:rPr>
         <w:t>Project SIC/</w:t>
-      </w:r>
-      <w:r>
-        <w:rPr>
-          <w:rFonts w:ascii="Consolas" w:hAnsi="Consolas"/>
-          <w:color w:val="222222"/>
-          <w:sz w:val="19"/>
-        </w:rPr>
         <w:br/>
         <w:t>├── app.py                         # Ứng dụng Web Dashboard bằng Streamlit</w:t>
-      </w:r>
-      <w:r>
-        <w:rPr>
-          <w:rFonts w:ascii="Consolas" w:hAnsi="Consolas"/>
-          <w:color w:val="222222"/>
-          <w:sz w:val="19"/>
-        </w:rPr>
         <w:br/>
         <w:t>├── edge_stream_inspector.py       # Module thu nhận camera đa luồng ThreadedCamera</w:t>
-      </w:r>
-      <w:r>
-        <w:rPr>
-          <w:rFonts w:ascii="Consolas" w:hAnsi="Consolas"/>
-          <w:color w:val="222222"/>
-          <w:sz w:val="19"/>
-        </w:rPr>
         <w:br/>
         <w:t>├── download_fruit_data.py         # Kịch bản tải và kiểm toán dữ liệu 27,198 ảnh</w:t>
-      </w:r>
-      <w:r>
-        <w:rPr>
-          <w:rFonts w:ascii="Consolas" w:hAnsi="Consolas"/>
-          <w:color w:val="222222"/>
-          <w:sz w:val="19"/>
-        </w:rPr>
         <w:br/>
         <w:t>├── sync_models.py                 # Kịch bản đồng bộ trọng số mô hình đã huấn luyện</w:t>
-      </w:r>
-      <w:r>
-        <w:rPr>
-          <w:rFonts w:ascii="Consolas" w:hAnsi="Consolas"/>
-          <w:color w:val="222222"/>
-          <w:sz w:val="19"/>
-        </w:rPr>
         <w:br/>
         <w:t>├── run_demo.bat                   # Kịch bản khởi chạy nhanh ứng dụng trên Windows</w:t>
-      </w:r>
-      <w:r>
-        <w:rPr>
-          <w:rFonts w:ascii="Consolas" w:hAnsi="Consolas"/>
-          <w:color w:val="222222"/>
-          <w:sz w:val="19"/>
-        </w:rPr>
         <w:br/>
         <w:t>├── requirements.txt               # Danh sách thư viện Python cần thiết</w:t>
-      </w:r>
-      <w:r>
-        <w:rPr>
-          <w:rFonts w:ascii="Consolas" w:hAnsi="Consolas"/>
-          <w:color w:val="222222"/>
-          <w:sz w:val="19"/>
-        </w:rPr>
         <w:br/>
         <w:t>├── models/                        # Thư mục lưu trữ trọng số các mô hình (.keras)</w:t>
-      </w:r>
-      <w:r>
-        <w:rPr>
-          <w:rFonts w:ascii="Consolas" w:hAnsi="Consolas"/>
-          <w:color w:val="222222"/>
-          <w:sz w:val="19"/>
-        </w:rPr>
         <w:br/>
         <w:t>│   ├── resnet50_best.keras        # Mô hình ResNet50 (Recall 100%, Accuracy 99.98%)</w:t>
-      </w:r>
-      <w:r>
-        <w:rPr>
-          <w:rFonts w:ascii="Consolas" w:hAnsi="Consolas"/>
-          <w:color w:val="222222"/>
-          <w:sz w:val="19"/>
-        </w:rPr>
         <w:br/>
         <w:t>│   ├── efficientnetb0_best.keras  # Mô hình EfficientNetB0 (dung lượng 33 MB)</w:t>
-      </w:r>
-      <w:r>
-        <w:rPr>
-          <w:rFonts w:ascii="Consolas" w:hAnsi="Consolas"/>
-          <w:color w:val="222222"/>
-          <w:sz w:val="19"/>
-        </w:rPr>
         <w:br/>
         <w:t>│   ├── vgg16_best.keras           # Mô hình VGG16 (Accuracy 99.41%)</w:t>
-      </w:r>
-      <w:r>
-        <w:rPr>
-          <w:rFonts w:ascii="Consolas" w:hAnsi="Consolas"/>
-          <w:color w:val="222222"/>
-          <w:sz w:val="19"/>
-        </w:rPr>
         <w:br/>
         <w:t>│   └── baseline_cnn.keras         # Mô hình Baseline CNN xây dựng từ đầu</w:t>
-      </w:r>
-      <w:r>
-        <w:rPr>
-          <w:rFonts w:ascii="Consolas" w:hAnsi="Consolas"/>
-          <w:color w:val="222222"/>
-          <w:sz w:val="19"/>
-        </w:rPr>
         <w:br/>
         <w:t>├── processed_data/                # Danh sách ảnh chia phân tầng 70/15/15</w:t>
-      </w:r>
-      <w:r>
-        <w:rPr>
-          <w:rFonts w:ascii="Consolas" w:hAnsi="Consolas"/>
-          <w:color w:val="222222"/>
-          <w:sz w:val="19"/>
-        </w:rPr>
         <w:br/>
         <w:t>│   ├── train.csv (19,038 ảnh)     # Tập huấn luyện</w:t>
-      </w:r>
-      <w:r>
-        <w:rPr>
-          <w:rFonts w:ascii="Consolas" w:hAnsi="Consolas"/>
-          <w:color w:val="222222"/>
-          <w:sz w:val="19"/>
-        </w:rPr>
         <w:br/>
         <w:t>│   ├── val.csv (4,080 ảnh)        # Tập kiểm định</w:t>
-      </w:r>
-      <w:r>
-        <w:rPr>
-          <w:rFonts w:ascii="Consolas" w:hAnsi="Consolas"/>
-          <w:color w:val="222222"/>
-          <w:sz w:val="19"/>
-        </w:rPr>
         <w:br/>
         <w:t>│   └── test.csv (4,080 ảnh)       # Tập kiểm thử độc lập</w:t>
-      </w:r>
-      <w:r>
-        <w:rPr>
-          <w:rFonts w:ascii="Consolas" w:hAnsi="Consolas"/>
-          <w:color w:val="222222"/>
-          <w:sz w:val="19"/>
-        </w:rPr>
         <w:br/>
         <w:t>├── notebooks/                     # Các sổ tay Jupyter Notebook thực nghiệm</w:t>
-      </w:r>
-      <w:r>
-        <w:rPr>
-          <w:rFonts w:ascii="Consolas" w:hAnsi="Consolas"/>
-          <w:color w:val="222222"/>
-          <w:sz w:val="19"/>
-        </w:rPr>
         <w:br/>
         <w:t>│   ├── 1_Fruit_EDA_Augmentation.ipynb</w:t>
-      </w:r>
-      <w:r>
-        <w:rPr>
-          <w:rFonts w:ascii="Consolas" w:hAnsi="Consolas"/>
-          <w:color w:val="222222"/>
-          <w:sz w:val="19"/>
-        </w:rPr>
         <w:br/>
         <w:t>│   ├── 2_Fruit_Baseline_CNN.ipynb</w:t>
-      </w:r>
-      <w:r>
-        <w:rPr>
-          <w:rFonts w:ascii="Consolas" w:hAnsi="Consolas"/>
-          <w:color w:val="222222"/>
-          <w:sz w:val="19"/>
-        </w:rPr>
         <w:br/>
         <w:t>│   ├── 3_Fruit_Transfer_Learning.ipynb</w:t>
-      </w:r>
-      <w:r>
-        <w:rPr>
-          <w:rFonts w:ascii="Consolas" w:hAnsi="Consolas"/>
-          <w:color w:val="222222"/>
-          <w:sz w:val="19"/>
-        </w:rPr>
         <w:br/>
         <w:t>│   ├── 4_Fruit_GradCAM_ExplainableAI.ipynb</w:t>
-      </w:r>
-      <w:r>
-        <w:rPr>
-          <w:rFonts w:ascii="Consolas" w:hAnsi="Consolas"/>
-          <w:color w:val="222222"/>
-          <w:sz w:val="19"/>
-        </w:rPr>
         <w:br/>
-        <w:t>│   └── 5_Fruit_Inference_Speed_Benchmark.ipynb</w:t>
-      </w:r>
-      <w:r>
-        <w:rPr>
-          <w:rFonts w:ascii="Consolas" w:hAnsi="Consolas"/>
-          <w:color w:val="222222"/>
-          <w:sz w:val="19"/>
-        </w:rPr>
+        <w:t>│   ├── 5_Fruit_Inference_Speed_Benchmark.ipynb</w:t>
+        <w:br/>
+        <w:t>│   └── Fruit_Full_Pipeline.ipynb  # Master Pipeline toàn diện từ A-Z</w:t>
         <w:br/>
         <w:t>└── report/                        # Báo cáo tiểu luận hoàn thiện</w:t>
-      </w:r>
-      <w:r>
-        <w:rPr>
-          <w:rFonts w:ascii="Consolas" w:hAnsi="Consolas"/>
-          <w:color w:val="222222"/>
-          <w:sz w:val="19"/>
-        </w:rPr>
         <w:br/>
         <w:t xml:space="preserve">    ├── BaoCao_Project13_LeThanhDuoc_SIC2026.docx  # Báo cáo Word chuẩn nộp thầy</w:t>
-      </w:r>
-      <w:r>
-        <w:rPr>
-          <w:rFonts w:ascii="Consolas" w:hAnsi="Consolas"/>
-          <w:color w:val="222222"/>
-          <w:sz w:val="19"/>
-        </w:rPr>
         <w:br/>
         <w:t xml:space="preserve">    ├── Bao_Cao_Tieu_Luan_Project13_LeThanhDuoc.md # Báo cáo Markdown đồng bộ GitHub</w:t>
-      </w:r>
-      <w:r>
-        <w:rPr>
-          <w:rFonts w:ascii="Consolas" w:hAnsi="Consolas"/>
-          <w:color w:val="222222"/>
-          <w:sz w:val="19"/>
-        </w:rPr>
         <w:br/>
         <w:t xml:space="preserve">    └── images/                                   # Các hình ảnh biểu đồ thực nghiệm</w:t>
-      </w:r>
-      <w:r>
-        <w:rPr>
-          <w:rFonts w:ascii="Consolas" w:hAnsi="Consolas"/>
-          <w:color w:val="222222"/>
-          <w:sz w:val="19"/>
-        </w:rPr>
         <w:br/>
         <w:t xml:space="preserve">        ├── image1.png             # Hình 1.1: Phân bố số lượng ảnh</w:t>
-      </w:r>
-      <w:r>
-        <w:rPr>
-          <w:rFonts w:ascii="Consolas" w:hAnsi="Consolas"/>
-          <w:color w:val="222222"/>
-          <w:sz w:val="19"/>
-        </w:rPr>
         <w:br/>
         <w:t xml:space="preserve">        ├── image2.png             # Hình 2.1: Tiến trình huấn luyện Baseline CNN</w:t>
-      </w:r>
-      <w:r>
-        <w:rPr>
-          <w:rFonts w:ascii="Consolas" w:hAnsi="Consolas"/>
-          <w:color w:val="222222"/>
-          <w:sz w:val="19"/>
-        </w:rPr>
         <w:br/>
-      </w:r>
-      <w:r>
-        <w:rPr>
-          <w:rFonts w:ascii="Consolas" w:hAnsi="Consolas"/>
-          <w:color w:val="222222"/>
-          <w:sz w:val="19"/>
-        </w:rPr>
-        <w:lastRenderedPageBreak/>
         <w:t xml:space="preserve">        ├── image3.png             # Hình 3.1: Tiến trình huấn luyện Transfer Learning</w:t>
-      </w:r>
-      <w:r>
-        <w:rPr>
-          <w:rFonts w:ascii="Consolas" w:hAnsi="Consolas"/>
-          <w:color w:val="222222"/>
-          <w:sz w:val="19"/>
-        </w:rPr>
         <w:br/>
         <w:t xml:space="preserve">        ├── image4.png             # Hình 4.1: Ma trận nhầm lẫn 4 mô hình</w:t>
-      </w:r>
-      <w:r>
-        <w:rPr>
-          <w:rFonts w:ascii="Consolas" w:hAnsi="Consolas"/>
-          <w:color w:val="222222"/>
-          <w:sz w:val="19"/>
-        </w:rPr>
         <w:br/>
         <w:t xml:space="preserve">        ├── image5.png             # Hình 5.1: Kết quả Grad-CAM trên quả</w:t>
-      </w:r>
-      <w:r>
-        <w:rPr>
-          <w:rFonts w:ascii="Consolas" w:hAnsi="Consolas"/>
-          <w:color w:val="222222"/>
-          <w:sz w:val="19"/>
-        </w:rPr>
         <w:br/>
         <w:t xml:space="preserve">        └── image6.png             # Hình 5.2: Khảo sát ngưỡng và đối chuẩn tốc độ</w:t>
       </w:r>

</xml_diff>